<commit_message>
doc: most of 1.5 conception
</commit_message>
<xml_diff>
--- a/doc/TPI_Rapport_NapoleoneCyril.docx
+++ b/doc/TPI_Rapport_NapoleoneCyril.docx
@@ -3414,21 +3414,7 @@
         <w:rPr>
           <w:lang w:val="fr-CH"/>
         </w:rPr>
-        <w:t xml:space="preserve"> </w:t>
-      </w:r>
-      <w:proofErr w:type="spellStart"/>
-      <w:r>
-        <w:rPr>
-          <w:lang w:val="fr-CH"/>
-        </w:rPr>
-        <w:t>Laravel</w:t>
-      </w:r>
-      <w:proofErr w:type="spellEnd"/>
-      <w:r>
-        <w:rPr>
-          <w:lang w:val="fr-CH"/>
-        </w:rPr>
-        <w:t xml:space="preserve"> 12</w:t>
+        <w:t xml:space="preserve"> Laravel 12</w:t>
       </w:r>
       <w:r>
         <w:rPr>
@@ -4655,7 +4641,21 @@
         <w:rPr>
           <w:lang w:val="fr-CH"/>
         </w:rPr>
-        <w:t>Réinitialisation avancée du mot de passe par email.</w:t>
+        <w:t xml:space="preserve">Réinitialisation avancée du mot de passe par </w:t>
+      </w:r>
+      <w:proofErr w:type="gramStart"/>
+      <w:r>
+        <w:rPr>
+          <w:lang w:val="fr-CH"/>
+        </w:rPr>
+        <w:t>email</w:t>
+      </w:r>
+      <w:proofErr w:type="gramEnd"/>
+      <w:r>
+        <w:rPr>
+          <w:lang w:val="fr-CH"/>
+        </w:rPr>
+        <w:t>.</w:t>
       </w:r>
     </w:p>
     <w:p>
@@ -5865,13 +5865,7 @@
         <w:rPr>
           <w:lang w:val="fr-CH"/>
         </w:rPr>
-        <w:t>l’analyse</w:t>
-      </w:r>
-      <w:r>
-        <w:rPr>
-          <w:lang w:val="fr-CH"/>
-        </w:rPr>
-        <w:t xml:space="preserve"> du besoin, la conception de l’application, le développement du frontend, le développement du backend, la base de données, l</w:t>
+        <w:t>l’analyse du besoin, la conception de l’application, le développement du frontend, le développement du backend, la base de données, l</w:t>
       </w:r>
       <w:r>
         <w:rPr>
@@ -6169,6 +6163,7 @@
         </w:rPr>
         <w:t xml:space="preserve">(version </w:t>
       </w:r>
+      <w:proofErr w:type="spellStart"/>
       <w:proofErr w:type="gramStart"/>
       <w:r>
         <w:rPr>
@@ -6179,6 +6174,7 @@
         </w:rPr>
         <w:t>a</w:t>
       </w:r>
+      <w:proofErr w:type="spellEnd"/>
       <w:proofErr w:type="gramEnd"/>
       <w:r>
         <w:rPr>
@@ -6199,21 +6195,7 @@
         <w:rPr>
           <w:lang w:val="fr-CH"/>
         </w:rPr>
-        <w:t xml:space="preserve">, tandis que le backend est développé avec </w:t>
-      </w:r>
-      <w:proofErr w:type="spellStart"/>
-      <w:r>
-        <w:rPr>
-          <w:lang w:val="fr-CH"/>
-        </w:rPr>
-        <w:t>Laravel</w:t>
-      </w:r>
-      <w:proofErr w:type="spellEnd"/>
-      <w:r>
-        <w:rPr>
-          <w:lang w:val="fr-CH"/>
-        </w:rPr>
-        <w:t xml:space="preserve"> 12. </w:t>
+        <w:t xml:space="preserve">, tandis que le backend est développé avec Laravel 12. </w:t>
       </w:r>
       <w:r>
         <w:rPr>
@@ -6939,27 +6921,7 @@
                 <w:szCs w:val="18"/>
                 <w:lang w:val="fr-CH"/>
               </w:rPr>
-              <w:t xml:space="preserve">Docker / </w:t>
-            </w:r>
-            <w:proofErr w:type="spellStart"/>
-            <w:r>
-              <w:rPr>
-                <w:rFonts w:asciiTheme="majorHAnsi" w:hAnsiTheme="majorHAnsi" w:cstheme="majorHAnsi"/>
-                <w:sz w:val="18"/>
-                <w:szCs w:val="18"/>
-                <w:lang w:val="fr-CH"/>
-              </w:rPr>
-              <w:t>Laravel</w:t>
-            </w:r>
-            <w:proofErr w:type="spellEnd"/>
-            <w:r>
-              <w:rPr>
-                <w:rFonts w:asciiTheme="majorHAnsi" w:hAnsiTheme="majorHAnsi" w:cstheme="majorHAnsi"/>
-                <w:sz w:val="18"/>
-                <w:szCs w:val="18"/>
-                <w:lang w:val="fr-CH"/>
-              </w:rPr>
-              <w:t xml:space="preserve"> </w:t>
+              <w:t xml:space="preserve">Docker / Laravel </w:t>
             </w:r>
             <w:proofErr w:type="spellStart"/>
             <w:r>
@@ -7546,7 +7508,6 @@
                 <w:lang w:val="fr-CH"/>
               </w:rPr>
             </w:pPr>
-            <w:proofErr w:type="spellStart"/>
             <w:r>
               <w:rPr>
                 <w:rFonts w:asciiTheme="majorHAnsi" w:hAnsiTheme="majorHAnsi" w:cstheme="majorHAnsi"/>
@@ -7554,17 +7515,7 @@
                 <w:szCs w:val="18"/>
                 <w:lang w:val="fr-CH"/>
               </w:rPr>
-              <w:t>Laravel</w:t>
-            </w:r>
-            <w:proofErr w:type="spellEnd"/>
-            <w:r>
-              <w:rPr>
-                <w:rFonts w:asciiTheme="majorHAnsi" w:hAnsiTheme="majorHAnsi" w:cstheme="majorHAnsi"/>
-                <w:sz w:val="18"/>
-                <w:szCs w:val="18"/>
-                <w:lang w:val="fr-CH"/>
-              </w:rPr>
-              <w:t xml:space="preserve"> 12</w:t>
+              <w:t>Laravel 12</w:t>
             </w:r>
           </w:p>
         </w:tc>
@@ -7954,19 +7905,8 @@
                 <w:szCs w:val="18"/>
                 <w:lang w:val="fr-CH"/>
               </w:rPr>
-              <w:t xml:space="preserve">Seeders </w:t>
+              <w:t>Seeders Laravel</w:t>
             </w:r>
-            <w:proofErr w:type="spellStart"/>
-            <w:r>
-              <w:rPr>
-                <w:rFonts w:asciiTheme="majorHAnsi" w:hAnsiTheme="majorHAnsi" w:cstheme="majorHAnsi"/>
-                <w:sz w:val="18"/>
-                <w:szCs w:val="18"/>
-                <w:lang w:val="fr-CH"/>
-              </w:rPr>
-              <w:t>Laravel</w:t>
-            </w:r>
-            <w:proofErr w:type="spellEnd"/>
           </w:p>
         </w:tc>
         <w:tc>
@@ -11854,21 +11794,8 @@
                 <w:szCs w:val="20"/>
                 <w:lang w:val="fr-CH" w:eastAsia="fr-CH"/>
               </w:rPr>
-              <w:t xml:space="preserve"> et </w:t>
+              <w:t xml:space="preserve"> et Laravel</w:t>
             </w:r>
-            <w:proofErr w:type="spellStart"/>
-            <w:r>
-              <w:rPr>
-                <w:rFonts w:asciiTheme="majorHAnsi" w:eastAsia="Times New Roman" w:hAnsiTheme="majorHAnsi" w:cstheme="majorHAnsi"/>
-                <w:b w:val="0"/>
-                <w:bCs w:val="0"/>
-                <w:sz w:val="20"/>
-                <w:szCs w:val="20"/>
-                <w:lang w:val="fr-CH" w:eastAsia="fr-CH"/>
-              </w:rPr>
-              <w:t>Laravel</w:t>
-            </w:r>
-            <w:proofErr w:type="spellEnd"/>
           </w:p>
         </w:tc>
         <w:tc>
@@ -11894,25 +11821,7 @@
                 <w:szCs w:val="20"/>
                 <w:lang w:val="fr-CH" w:eastAsia="fr-CH"/>
               </w:rPr>
-              <w:t>Le</w:t>
-            </w:r>
-            <w:r>
-              <w:rPr>
-                <w:rFonts w:asciiTheme="majorHAnsi" w:eastAsia="Times New Roman" w:hAnsiTheme="majorHAnsi" w:cstheme="majorHAnsi"/>
-                <w:sz w:val="20"/>
-                <w:szCs w:val="20"/>
-                <w:lang w:val="fr-CH" w:eastAsia="fr-CH"/>
-              </w:rPr>
-              <w:t xml:space="preserve">s services </w:t>
-            </w:r>
-            <w:r>
-              <w:rPr>
-                <w:rFonts w:asciiTheme="majorHAnsi" w:eastAsia="Times New Roman" w:hAnsiTheme="majorHAnsi" w:cstheme="majorHAnsi"/>
-                <w:sz w:val="20"/>
-                <w:szCs w:val="20"/>
-                <w:lang w:val="fr-CH" w:eastAsia="fr-CH"/>
-              </w:rPr>
-              <w:t>frontend n</w:t>
+              <w:t>Les services frontend n</w:t>
             </w:r>
             <w:r>
               <w:rPr>
@@ -11957,16 +11866,7 @@
                 <w:szCs w:val="20"/>
                 <w:lang w:val="fr-CH" w:eastAsia="fr-CH"/>
               </w:rPr>
-              <w:t xml:space="preserve">Tester régulièrement les appels API avec Bruno </w:t>
-            </w:r>
-            <w:r>
-              <w:rPr>
-                <w:rFonts w:asciiTheme="majorHAnsi" w:eastAsia="Times New Roman" w:hAnsiTheme="majorHAnsi" w:cstheme="majorHAnsi"/>
-                <w:sz w:val="20"/>
-                <w:szCs w:val="20"/>
-                <w:lang w:val="fr-CH" w:eastAsia="fr-CH"/>
-              </w:rPr>
-              <w:t>mais aussi depuis le front une fois dans la phase de dev de l’interface.</w:t>
+              <w:t>Tester régulièrement les appels API avec Bruno mais aussi depuis le front une fois dans la phase de dev de l’interface.</w:t>
             </w:r>
           </w:p>
         </w:tc>
@@ -12396,27 +12296,7 @@
                 <w:szCs w:val="20"/>
                 <w:lang w:val="fr-CH" w:eastAsia="fr-CH"/>
               </w:rPr>
-              <w:t xml:space="preserve">Avoir une bonne connaissance de la structure DB et une bonne utilisation de </w:t>
-            </w:r>
-            <w:proofErr w:type="spellStart"/>
-            <w:r>
-              <w:rPr>
-                <w:rFonts w:asciiTheme="majorHAnsi" w:eastAsia="Times New Roman" w:hAnsiTheme="majorHAnsi" w:cstheme="majorHAnsi"/>
-                <w:sz w:val="20"/>
-                <w:szCs w:val="20"/>
-                <w:lang w:val="fr-CH" w:eastAsia="fr-CH"/>
-              </w:rPr>
-              <w:t>Laravel</w:t>
-            </w:r>
-            <w:proofErr w:type="spellEnd"/>
-            <w:r>
-              <w:rPr>
-                <w:rFonts w:asciiTheme="majorHAnsi" w:eastAsia="Times New Roman" w:hAnsiTheme="majorHAnsi" w:cstheme="majorHAnsi"/>
-                <w:sz w:val="20"/>
-                <w:szCs w:val="20"/>
-                <w:lang w:val="fr-CH" w:eastAsia="fr-CH"/>
-              </w:rPr>
-              <w:t xml:space="preserve"> en lien avec ça via les migrations et les relations Eloquent</w:t>
+              <w:t>Avoir une bonne connaissance de la structure DB et une bonne utilisation de Laravel en lien avec ça via les migrations et les relations Eloquent</w:t>
             </w:r>
           </w:p>
         </w:tc>
@@ -12529,7 +12409,27 @@
                 <w:szCs w:val="20"/>
                 <w:lang w:val="fr-CH" w:eastAsia="fr-CH"/>
               </w:rPr>
-              <w:t xml:space="preserve">Prévoir du temps pour des corrections du workflow ou de la config Azure, car celle-ci peut vite poser problème sur des détails (vécu en </w:t>
+              <w:t xml:space="preserve">Prévoir du temps pour des corrections du workflow ou de la config Azure, car celle-ci peut vite poser </w:t>
+            </w:r>
+            <w:proofErr w:type="gramStart"/>
+            <w:r>
+              <w:rPr>
+                <w:rFonts w:asciiTheme="majorHAnsi" w:eastAsia="Times New Roman" w:hAnsiTheme="majorHAnsi" w:cstheme="majorHAnsi"/>
+                <w:sz w:val="20"/>
+                <w:szCs w:val="20"/>
+                <w:lang w:val="fr-CH" w:eastAsia="fr-CH"/>
+              </w:rPr>
+              <w:t>problème</w:t>
+            </w:r>
+            <w:proofErr w:type="gramEnd"/>
+            <w:r>
+              <w:rPr>
+                <w:rFonts w:asciiTheme="majorHAnsi" w:eastAsia="Times New Roman" w:hAnsiTheme="majorHAnsi" w:cstheme="majorHAnsi"/>
+                <w:sz w:val="20"/>
+                <w:szCs w:val="20"/>
+                <w:lang w:val="fr-CH" w:eastAsia="fr-CH"/>
+              </w:rPr>
+              <w:t xml:space="preserve"> sur des détails (vécu en </w:t>
             </w:r>
             <w:proofErr w:type="spellStart"/>
             <w:r>
@@ -12646,27 +12546,7 @@
                 <w:szCs w:val="20"/>
                 <w:lang w:val="fr-CH" w:eastAsia="fr-CH"/>
               </w:rPr>
-              <w:t>Erreurs dû à des différences de variables d’</w:t>
-            </w:r>
-            <w:proofErr w:type="spellStart"/>
-            <w:r>
-              <w:rPr>
-                <w:rFonts w:asciiTheme="majorHAnsi" w:eastAsia="Times New Roman" w:hAnsiTheme="majorHAnsi" w:cstheme="majorHAnsi"/>
-                <w:sz w:val="20"/>
-                <w:szCs w:val="20"/>
-                <w:lang w:val="fr-CH" w:eastAsia="fr-CH"/>
-              </w:rPr>
-              <w:t>env</w:t>
-            </w:r>
-            <w:proofErr w:type="spellEnd"/>
-            <w:r>
-              <w:rPr>
-                <w:rFonts w:asciiTheme="majorHAnsi" w:eastAsia="Times New Roman" w:hAnsiTheme="majorHAnsi" w:cstheme="majorHAnsi"/>
-                <w:sz w:val="20"/>
-                <w:szCs w:val="20"/>
-                <w:lang w:val="fr-CH" w:eastAsia="fr-CH"/>
-              </w:rPr>
-              <w:t xml:space="preserve">, </w:t>
+              <w:t xml:space="preserve">Erreurs dû à des différences de variables d’env, </w:t>
             </w:r>
             <w:proofErr w:type="spellStart"/>
             <w:r>
@@ -14068,6 +13948,1890 @@
     </w:p>
     <w:p>
       <w:pPr>
+        <w:rPr>
+          <w:lang w:val="fr-CH"/>
+        </w:rPr>
+      </w:pPr>
+      <w:r>
+        <w:rPr>
+          <w:lang w:val="fr-CH"/>
+        </w:rPr>
+        <w:t>L</w:t>
+      </w:r>
+      <w:r>
+        <w:rPr>
+          <w:lang w:val="fr-CH"/>
+        </w:rPr>
+        <w:t>a structure générale de l’application avant le développement</w:t>
+      </w:r>
+      <w:r>
+        <w:rPr>
+          <w:lang w:val="fr-CH"/>
+        </w:rPr>
+        <w:t xml:space="preserve"> est définie au mieux dans cette partie</w:t>
+      </w:r>
+      <w:r>
+        <w:rPr>
+          <w:lang w:val="fr-CH"/>
+        </w:rPr>
+        <w:t xml:space="preserve">. </w:t>
+      </w:r>
+      <w:r>
+        <w:rPr>
+          <w:lang w:val="fr-CH"/>
+        </w:rPr>
+        <w:t>Ça</w:t>
+      </w:r>
+      <w:r>
+        <w:rPr>
+          <w:lang w:val="fr-CH"/>
+        </w:rPr>
+        <w:t xml:space="preserve"> </w:t>
+      </w:r>
+      <w:r>
+        <w:rPr>
+          <w:lang w:val="fr-CH"/>
+        </w:rPr>
+        <w:t>permet d’</w:t>
+      </w:r>
+      <w:r>
+        <w:rPr>
+          <w:lang w:val="fr-CH"/>
+        </w:rPr>
+        <w:t>éviter de commencer directement le développement sans vision claire d</w:t>
+      </w:r>
+      <w:r>
+        <w:rPr>
+          <w:lang w:val="fr-CH"/>
+        </w:rPr>
+        <w:t>u projet concret</w:t>
+      </w:r>
+      <w:r>
+        <w:rPr>
+          <w:lang w:val="fr-CH"/>
+        </w:rPr>
+        <w:t>.</w:t>
+      </w:r>
+    </w:p>
+    <w:p>
+      <w:pPr>
+        <w:rPr>
+          <w:lang w:val="fr-CH"/>
+        </w:rPr>
+      </w:pPr>
+      <w:r>
+        <w:rPr>
+          <w:lang w:val="fr-CH"/>
+        </w:rPr>
+        <w:t xml:space="preserve">Le frontend </w:t>
+      </w:r>
+      <w:proofErr w:type="spellStart"/>
+      <w:r>
+        <w:rPr>
+          <w:lang w:val="fr-CH"/>
+        </w:rPr>
+        <w:t>Angular</w:t>
+      </w:r>
+      <w:proofErr w:type="spellEnd"/>
+      <w:r>
+        <w:rPr>
+          <w:lang w:val="fr-CH"/>
+        </w:rPr>
+        <w:t xml:space="preserve"> gère l’affichage, la navigation et les interactions utilisateur. Le backend Laravel </w:t>
+      </w:r>
+      <w:r>
+        <w:rPr>
+          <w:lang w:val="fr-CH"/>
+        </w:rPr>
+        <w:t>l’</w:t>
+      </w:r>
+      <w:r>
+        <w:rPr>
+          <w:lang w:val="fr-CH"/>
+        </w:rPr>
+        <w:t>API qui contient la logique métier, les règles de validation, l’authentification, les autorisations et l’accès aux données. La base de données stocke les utilisateurs, les films et les citations.</w:t>
+      </w:r>
+    </w:p>
+    <w:p>
+      <w:pPr>
+        <w:pStyle w:val="Titre3"/>
+        <w:rPr>
+          <w:lang w:val="fr-CH"/>
+        </w:rPr>
+      </w:pPr>
+      <w:r>
+        <w:rPr>
+          <w:lang w:val="fr-CH"/>
+        </w:rPr>
+        <w:t>Architecture générale</w:t>
+      </w:r>
+    </w:p>
+    <w:p>
+      <w:pPr>
+        <w:rPr>
+          <w:lang w:val="fr-CH"/>
+        </w:rPr>
+      </w:pPr>
+      <w:r>
+        <w:rPr>
+          <w:lang w:val="fr-CH"/>
+        </w:rPr>
+        <w:t>L’architecture prévue est une architecture web classique en trois parties principales : le client, l’API et la base de données.</w:t>
+      </w:r>
+    </w:p>
+    <w:p>
+      <w:pPr>
+        <w:rPr>
+          <w:lang w:val="fr-CH"/>
+        </w:rPr>
+      </w:pPr>
+      <w:r>
+        <w:rPr>
+          <w:lang w:val="fr-CH"/>
+        </w:rPr>
+        <w:t xml:space="preserve">L’utilisateur accède à l’application depuis un navigateur. Le navigateur charge l’application </w:t>
+      </w:r>
+      <w:proofErr w:type="spellStart"/>
+      <w:r>
+        <w:rPr>
+          <w:lang w:val="fr-CH"/>
+        </w:rPr>
+        <w:t>Angular</w:t>
+      </w:r>
+      <w:proofErr w:type="spellEnd"/>
+      <w:r>
+        <w:rPr>
+          <w:lang w:val="fr-CH"/>
+        </w:rPr>
+        <w:t>, qui communique ensuite avec l’API Laravel. Le backend traite les requêtes et interagit avec la base de données.</w:t>
+      </w:r>
+    </w:p>
+    <w:p>
+      <w:pPr>
+        <w:rPr>
+          <w:lang w:val="fr-CH"/>
+        </w:rPr>
+      </w:pPr>
+      <w:r>
+        <w:rPr>
+          <w:lang w:val="fr-CH"/>
+        </w:rPr>
+        <w:t xml:space="preserve">En développement local, le frontend est lancé avec </w:t>
+      </w:r>
+      <w:proofErr w:type="spellStart"/>
+      <w:r>
+        <w:rPr>
+          <w:lang w:val="fr-CH"/>
+        </w:rPr>
+        <w:t>Angular</w:t>
+      </w:r>
+      <w:proofErr w:type="spellEnd"/>
+      <w:r>
+        <w:rPr>
+          <w:lang w:val="fr-CH"/>
+        </w:rPr>
+        <w:t xml:space="preserve">, le backend est lancé avec Laravel Sail et la base locale </w:t>
+      </w:r>
+      <w:r>
+        <w:rPr>
+          <w:lang w:val="fr-CH"/>
+        </w:rPr>
+        <w:t>via</w:t>
+      </w:r>
+      <w:r>
+        <w:rPr>
+          <w:lang w:val="fr-CH"/>
+        </w:rPr>
+        <w:t xml:space="preserve"> SQLite. En </w:t>
+      </w:r>
+      <w:r>
+        <w:rPr>
+          <w:lang w:val="fr-CH"/>
+        </w:rPr>
+        <w:t>prod</w:t>
+      </w:r>
+      <w:r>
+        <w:rPr>
+          <w:lang w:val="fr-CH"/>
+        </w:rPr>
+        <w:t xml:space="preserve">, le frontend est prévu sur Azure </w:t>
+      </w:r>
+      <w:proofErr w:type="spellStart"/>
+      <w:r>
+        <w:rPr>
+          <w:lang w:val="fr-CH"/>
+        </w:rPr>
+        <w:t>Static</w:t>
+      </w:r>
+      <w:proofErr w:type="spellEnd"/>
+      <w:r>
+        <w:rPr>
+          <w:lang w:val="fr-CH"/>
+        </w:rPr>
+        <w:t xml:space="preserve"> Web Apps, le backend sur Azure Web App et la base de données sur Azure </w:t>
+      </w:r>
+      <w:proofErr w:type="spellStart"/>
+      <w:r>
+        <w:rPr>
+          <w:lang w:val="fr-CH"/>
+        </w:rPr>
+        <w:t>Database</w:t>
+      </w:r>
+      <w:proofErr w:type="spellEnd"/>
+      <w:r>
+        <w:rPr>
+          <w:lang w:val="fr-CH"/>
+        </w:rPr>
+        <w:t xml:space="preserve"> for MySQL Flexible Server</w:t>
+      </w:r>
+      <w:r>
+        <w:rPr>
+          <w:lang w:val="fr-CH"/>
+        </w:rPr>
+        <w:t xml:space="preserve"> comme dit plus tôt</w:t>
+      </w:r>
+      <w:r>
+        <w:rPr>
+          <w:lang w:val="fr-CH"/>
+        </w:rPr>
+        <w:t>.</w:t>
+      </w:r>
+    </w:p>
+    <w:p>
+      <w:pPr>
+        <w:rPr>
+          <w:lang w:val="fr-CH"/>
+        </w:rPr>
+      </w:pPr>
+      <w:r>
+        <w:rPr>
+          <w:lang w:val="fr-CH"/>
+        </w:rPr>
+        <w:t xml:space="preserve">Le dépôt GitHub est organisé en monorepo, </w:t>
+      </w:r>
+      <w:r>
+        <w:rPr>
+          <w:lang w:val="fr-CH"/>
+        </w:rPr>
+        <w:t xml:space="preserve">donc </w:t>
+      </w:r>
+      <w:r>
+        <w:rPr>
+          <w:lang w:val="fr-CH"/>
+        </w:rPr>
+        <w:t xml:space="preserve">il contient à la fois le frontend et le backend. </w:t>
+      </w:r>
+      <w:r>
+        <w:rPr>
+          <w:lang w:val="fr-CH"/>
+        </w:rPr>
+        <w:t>Ça permet de tout avoir centralisé et de juste avoir à faire des adaptations au niveau des workflows etc</w:t>
+      </w:r>
+      <w:r>
+        <w:rPr>
+          <w:lang w:val="fr-CH"/>
+        </w:rPr>
+        <w:t>.</w:t>
+      </w:r>
+    </w:p>
+    <w:p>
+      <w:pPr>
+        <w:keepNext/>
+        <w:jc w:val="center"/>
+      </w:pPr>
+      <w:r>
+        <w:rPr>
+          <w:noProof/>
+          <w:lang w:val="fr-CH"/>
+        </w:rPr>
+        <w:lastRenderedPageBreak/>
+        <w:drawing>
+          <wp:inline distT="0" distB="0" distL="0" distR="0" wp14:anchorId="780623CC" wp14:editId="568247BF">
+            <wp:extent cx="4880345" cy="837343"/>
+            <wp:effectExtent l="0" t="0" r="0" b="1270"/>
+            <wp:docPr id="282170733" name="Image 2"/>
+            <wp:cNvGraphicFramePr>
+              <a:graphicFrameLocks xmlns:a="http://schemas.openxmlformats.org/drawingml/2006/main" noChangeAspect="1"/>
+            </wp:cNvGraphicFramePr>
+            <a:graphic xmlns:a="http://schemas.openxmlformats.org/drawingml/2006/main">
+              <a:graphicData uri="http://schemas.openxmlformats.org/drawingml/2006/picture">
+                <pic:pic xmlns:pic="http://schemas.openxmlformats.org/drawingml/2006/picture">
+                  <pic:nvPicPr>
+                    <pic:cNvPr id="0" name="Picture 2"/>
+                    <pic:cNvPicPr>
+                      <a:picLocks noChangeAspect="1" noChangeArrowheads="1"/>
+                    </pic:cNvPicPr>
+                  </pic:nvPicPr>
+                  <pic:blipFill rotWithShape="1">
+                    <a:blip r:embed="rId9">
+                      <a:extLst>
+                        <a:ext uri="{28A0092B-C50C-407E-A947-70E740481C1C}">
+                          <a14:useLocalDpi xmlns:a14="http://schemas.microsoft.com/office/drawing/2010/main" val="0"/>
+                        </a:ext>
+                      </a:extLst>
+                    </a:blip>
+                    <a:srcRect b="16651"/>
+                    <a:stretch>
+                      <a:fillRect/>
+                    </a:stretch>
+                  </pic:blipFill>
+                  <pic:spPr bwMode="auto">
+                    <a:xfrm>
+                      <a:off x="0" y="0"/>
+                      <a:ext cx="4902096" cy="841075"/>
+                    </a:xfrm>
+                    <a:prstGeom prst="rect">
+                      <a:avLst/>
+                    </a:prstGeom>
+                    <a:noFill/>
+                    <a:ln>
+                      <a:noFill/>
+                    </a:ln>
+                    <a:extLst>
+                      <a:ext uri="{53640926-AAD7-44D8-BBD7-CCE9431645EC}">
+                        <a14:shadowObscured xmlns:a14="http://schemas.microsoft.com/office/drawing/2010/main"/>
+                      </a:ext>
+                    </a:extLst>
+                  </pic:spPr>
+                </pic:pic>
+              </a:graphicData>
+            </a:graphic>
+          </wp:inline>
+        </w:drawing>
+      </w:r>
+    </w:p>
+    <w:p>
+      <w:pPr>
+        <w:pStyle w:val="Lgende"/>
+        <w:jc w:val="center"/>
+        <w:rPr>
+          <w:b w:val="0"/>
+          <w:bCs w:val="0"/>
+          <w:lang w:val="fr-CH"/>
+        </w:rPr>
+      </w:pPr>
+      <w:r>
+        <w:rPr>
+          <w:b w:val="0"/>
+          <w:bCs w:val="0"/>
+          <w:lang w:val="fr-CH"/>
+        </w:rPr>
+        <w:t>Schéma de la structure générale de fonctionnement</w:t>
+      </w:r>
+      <w:r>
+        <w:rPr>
+          <w:b w:val="0"/>
+          <w:bCs w:val="0"/>
+          <w:lang w:val="fr-CH"/>
+        </w:rPr>
+        <w:t xml:space="preserve"> de l’application</w:t>
+      </w:r>
+    </w:p>
+    <w:p>
+      <w:pPr>
+        <w:keepNext/>
+        <w:jc w:val="center"/>
+      </w:pPr>
+      <w:r>
+        <w:rPr>
+          <w:noProof/>
+          <w:lang w:val="fr-CH"/>
+        </w:rPr>
+        <w:drawing>
+          <wp:inline distT="0" distB="0" distL="0" distR="0" wp14:anchorId="69624320" wp14:editId="1B10A8B3">
+            <wp:extent cx="5103628" cy="6796144"/>
+            <wp:effectExtent l="0" t="0" r="1905" b="5080"/>
+            <wp:docPr id="1332822928" name="Image 5"/>
+            <wp:cNvGraphicFramePr>
+              <a:graphicFrameLocks xmlns:a="http://schemas.openxmlformats.org/drawingml/2006/main" noChangeAspect="1"/>
+            </wp:cNvGraphicFramePr>
+            <a:graphic xmlns:a="http://schemas.openxmlformats.org/drawingml/2006/main">
+              <a:graphicData uri="http://schemas.openxmlformats.org/drawingml/2006/picture">
+                <pic:pic xmlns:pic="http://schemas.openxmlformats.org/drawingml/2006/picture">
+                  <pic:nvPicPr>
+                    <pic:cNvPr id="0" name="Picture 5"/>
+                    <pic:cNvPicPr>
+                      <a:picLocks noChangeAspect="1" noChangeArrowheads="1"/>
+                    </pic:cNvPicPr>
+                  </pic:nvPicPr>
+                  <pic:blipFill>
+                    <a:blip r:embed="rId10">
+                      <a:extLst>
+                        <a:ext uri="{28A0092B-C50C-407E-A947-70E740481C1C}">
+                          <a14:useLocalDpi xmlns:a14="http://schemas.microsoft.com/office/drawing/2010/main" val="0"/>
+                        </a:ext>
+                      </a:extLst>
+                    </a:blip>
+                    <a:srcRect/>
+                    <a:stretch>
+                      <a:fillRect/>
+                    </a:stretch>
+                  </pic:blipFill>
+                  <pic:spPr bwMode="auto">
+                    <a:xfrm>
+                      <a:off x="0" y="0"/>
+                      <a:ext cx="5108029" cy="6802004"/>
+                    </a:xfrm>
+                    <a:prstGeom prst="rect">
+                      <a:avLst/>
+                    </a:prstGeom>
+                    <a:noFill/>
+                    <a:ln>
+                      <a:noFill/>
+                    </a:ln>
+                  </pic:spPr>
+                </pic:pic>
+              </a:graphicData>
+            </a:graphic>
+          </wp:inline>
+        </w:drawing>
+      </w:r>
+    </w:p>
+    <w:p>
+      <w:pPr>
+        <w:pStyle w:val="Lgende"/>
+        <w:jc w:val="center"/>
+        <w:rPr>
+          <w:b w:val="0"/>
+          <w:bCs w:val="0"/>
+          <w:lang w:val="fr-CH"/>
+        </w:rPr>
+      </w:pPr>
+      <w:r>
+        <w:rPr>
+          <w:b w:val="0"/>
+          <w:bCs w:val="0"/>
+          <w:lang w:val="fr-CH"/>
+        </w:rPr>
+        <w:t>Schema de fonctionnement interne d</w:t>
+      </w:r>
+      <w:r>
+        <w:rPr>
+          <w:b w:val="0"/>
+          <w:bCs w:val="0"/>
+          <w:lang w:val="fr-CH"/>
+        </w:rPr>
+        <w:t>u backend Laravel lors d’une requête</w:t>
+      </w:r>
+    </w:p>
+    <w:p>
+      <w:pPr>
+        <w:pStyle w:val="Titre3"/>
+        <w:rPr>
+          <w:lang w:val="fr-CH"/>
+        </w:rPr>
+      </w:pPr>
+      <w:r>
+        <w:rPr>
+          <w:lang w:val="fr-CH"/>
+        </w:rPr>
+        <w:lastRenderedPageBreak/>
+        <w:t>Conception de la base de données</w:t>
+      </w:r>
+    </w:p>
+    <w:p>
+      <w:pPr>
+        <w:rPr>
+          <w:lang w:val="fr-CH"/>
+        </w:rPr>
+      </w:pPr>
+      <w:r>
+        <w:rPr>
+          <w:lang w:val="fr-CH"/>
+        </w:rPr>
+        <w:t>La base de données est conçue autour de trois entités principales : les utilisateurs, les films et les citations</w:t>
+      </w:r>
+      <w:r>
+        <w:rPr>
+          <w:lang w:val="fr-CH"/>
+        </w:rPr>
+        <w:t>. Qui sont le strict minimum pour répondre au cahier des charges.</w:t>
+      </w:r>
+    </w:p>
+    <w:p>
+      <w:pPr>
+        <w:rPr>
+          <w:lang w:val="fr-CH"/>
+        </w:rPr>
+      </w:pPr>
+      <w:r>
+        <w:rPr>
+          <w:lang w:val="fr-CH"/>
+        </w:rPr>
+        <w:t xml:space="preserve">Les schémas de base de données ont été réalisés avant le développement afin de poser une structure claire. Le MCD et le MLD ont été réalisés avec Looping. Le MPD a été réalisé avec le concepteur de phpMyAdmin à partir de la base importée. </w:t>
+      </w:r>
+      <w:r>
+        <w:rPr>
+          <w:lang w:val="fr-CH"/>
+        </w:rPr>
+        <w:t xml:space="preserve">Le script SQL est également fait, bien </w:t>
+      </w:r>
+      <w:proofErr w:type="gramStart"/>
+      <w:r>
+        <w:rPr>
+          <w:lang w:val="fr-CH"/>
+        </w:rPr>
+        <w:t>que il</w:t>
+      </w:r>
+      <w:proofErr w:type="gramEnd"/>
+      <w:r>
+        <w:rPr>
+          <w:lang w:val="fr-CH"/>
+        </w:rPr>
+        <w:t xml:space="preserve"> ne sera pas utilisé car ce seront des migrations Laravel qui seront exécutées.</w:t>
+      </w:r>
+    </w:p>
+    <w:p>
+      <w:pPr>
+        <w:rPr>
+          <w:lang w:val="fr-CH"/>
+        </w:rPr>
+      </w:pPr>
+      <w:r>
+        <w:rPr>
+          <w:lang w:val="fr-CH"/>
+        </w:rPr>
+        <w:t xml:space="preserve">La table « users » </w:t>
+      </w:r>
+      <w:r>
+        <w:rPr>
+          <w:lang w:val="fr-CH"/>
+        </w:rPr>
+        <w:t>s</w:t>
+      </w:r>
+      <w:r>
+        <w:rPr>
+          <w:lang w:val="fr-CH"/>
+        </w:rPr>
+        <w:t>tocke les utilisateurs de l’application, leurs informations de connexion et leur rôle.</w:t>
+      </w:r>
+    </w:p>
+    <w:p>
+      <w:pPr>
+        <w:rPr>
+          <w:lang w:val="fr-CH"/>
+        </w:rPr>
+      </w:pPr>
+      <w:r>
+        <w:rPr>
+          <w:lang w:val="fr-CH"/>
+        </w:rPr>
+        <w:t>La table « movies » s</w:t>
+      </w:r>
+      <w:r>
+        <w:rPr>
+          <w:lang w:val="fr-CH"/>
+        </w:rPr>
+        <w:t>tocke les films ajoutés dans l’application. Chaque film contient notamment un titre en français, un titre en anglais, une date de sortie</w:t>
+      </w:r>
+      <w:r>
+        <w:rPr>
+          <w:lang w:val="fr-CH"/>
+        </w:rPr>
+        <w:t>, un lien d’</w:t>
+      </w:r>
+      <w:r>
+        <w:rPr>
+          <w:lang w:val="fr-CH"/>
+        </w:rPr>
+        <w:t>image</w:t>
+      </w:r>
+      <w:r>
+        <w:rPr>
+          <w:lang w:val="fr-CH"/>
+        </w:rPr>
+        <w:t xml:space="preserve"> et l’utilisateur qui l’a créé</w:t>
+      </w:r>
+      <w:r>
+        <w:rPr>
+          <w:lang w:val="fr-CH"/>
+        </w:rPr>
+        <w:t>.</w:t>
+      </w:r>
+    </w:p>
+    <w:p>
+      <w:pPr>
+        <w:rPr>
+          <w:lang w:val="fr-CH"/>
+        </w:rPr>
+      </w:pPr>
+      <w:r>
+        <w:rPr>
+          <w:lang w:val="fr-CH"/>
+        </w:rPr>
+        <w:t>La table « quotes » s</w:t>
+      </w:r>
+      <w:r>
+        <w:rPr>
+          <w:lang w:val="fr-CH"/>
+        </w:rPr>
+        <w:t>tocke les citations liées aux films. Chaque citation contient le texte, le personnage, l’acteur, le film associé et l’utilisateur qui l’a créée.</w:t>
+      </w:r>
+    </w:p>
+    <w:p>
+      <w:pPr>
+        <w:rPr>
+          <w:lang w:val="fr-CH"/>
+        </w:rPr>
+      </w:pPr>
+      <w:r>
+        <w:rPr>
+          <w:lang w:val="fr-CH"/>
+        </w:rPr>
+        <w:br/>
+      </w:r>
+      <w:r>
+        <w:rPr>
+          <w:lang w:val="fr-CH"/>
+        </w:rPr>
+        <w:t>Les relations sont les suivantes :</w:t>
+      </w:r>
+    </w:p>
+    <w:p>
+      <w:pPr>
+        <w:pStyle w:val="Paragraphedeliste"/>
+        <w:numPr>
+          <w:ilvl w:val="0"/>
+          <w:numId w:val="26"/>
+        </w:numPr>
+        <w:rPr>
+          <w:lang w:val="fr-CH"/>
+        </w:rPr>
+      </w:pPr>
+      <w:r>
+        <w:rPr>
+          <w:lang w:val="fr-CH"/>
+        </w:rPr>
+        <w:t>Un utilisateur peut créer plusieurs films</w:t>
+      </w:r>
+    </w:p>
+    <w:p>
+      <w:pPr>
+        <w:pStyle w:val="Paragraphedeliste"/>
+        <w:numPr>
+          <w:ilvl w:val="0"/>
+          <w:numId w:val="26"/>
+        </w:numPr>
+        <w:rPr>
+          <w:lang w:val="fr-CH"/>
+        </w:rPr>
+      </w:pPr>
+      <w:r>
+        <w:rPr>
+          <w:lang w:val="fr-CH"/>
+        </w:rPr>
+        <w:t>Un utilisateur peut créer plusieurs citations</w:t>
+      </w:r>
+    </w:p>
+    <w:p>
+      <w:pPr>
+        <w:pStyle w:val="Paragraphedeliste"/>
+        <w:numPr>
+          <w:ilvl w:val="0"/>
+          <w:numId w:val="26"/>
+        </w:numPr>
+        <w:rPr>
+          <w:lang w:val="fr-CH"/>
+        </w:rPr>
+      </w:pPr>
+      <w:r>
+        <w:rPr>
+          <w:lang w:val="fr-CH"/>
+        </w:rPr>
+        <w:t>Un film possède plusieurs citations</w:t>
+      </w:r>
+    </w:p>
+    <w:p>
+      <w:pPr>
+        <w:pStyle w:val="Paragraphedeliste"/>
+        <w:numPr>
+          <w:ilvl w:val="0"/>
+          <w:numId w:val="26"/>
+        </w:numPr>
+        <w:rPr>
+          <w:lang w:val="fr-CH"/>
+        </w:rPr>
+      </w:pPr>
+      <w:r>
+        <w:rPr>
+          <w:lang w:val="fr-CH"/>
+        </w:rPr>
+        <w:t>Une citation appartient à un film</w:t>
+      </w:r>
+    </w:p>
+    <w:p>
+      <w:pPr>
+        <w:pStyle w:val="Paragraphedeliste"/>
+        <w:numPr>
+          <w:ilvl w:val="0"/>
+          <w:numId w:val="26"/>
+        </w:numPr>
+        <w:rPr>
+          <w:lang w:val="fr-CH"/>
+        </w:rPr>
+      </w:pPr>
+      <w:r>
+        <w:rPr>
+          <w:lang w:val="fr-CH"/>
+        </w:rPr>
+        <w:t>Une citation appartient à un utilisateur</w:t>
+      </w:r>
+    </w:p>
+    <w:p>
+      <w:pPr>
+        <w:pStyle w:val="Paragraphedeliste"/>
+        <w:numPr>
+          <w:ilvl w:val="0"/>
+          <w:numId w:val="26"/>
+        </w:numPr>
+        <w:rPr>
+          <w:lang w:val="fr-CH"/>
+        </w:rPr>
+      </w:pPr>
+      <w:r>
+        <w:rPr>
+          <w:lang w:val="fr-CH"/>
+        </w:rPr>
+        <w:t>Un film appartient à un utilisateur</w:t>
+      </w:r>
+    </w:p>
+    <w:p>
+      <w:pPr>
+        <w:rPr>
+          <w:lang w:val="fr-CH"/>
+        </w:rPr>
+      </w:pPr>
+      <w:r>
+        <w:rPr>
+          <w:lang w:val="fr-CH"/>
+        </w:rPr>
+        <w:t xml:space="preserve">Pour l’image d’un film, la solution prévue au départ est de stocker une URL internet dans la </w:t>
+      </w:r>
+      <w:r>
+        <w:rPr>
+          <w:lang w:val="fr-CH"/>
+        </w:rPr>
+        <w:t>DB</w:t>
+      </w:r>
+      <w:r>
+        <w:rPr>
+          <w:lang w:val="fr-CH"/>
+        </w:rPr>
+        <w:t>. Cette solution est plus simple à mettre en place et correspond mieux au temps disponible. Un système d’importation ou de stockage de fichiers pourra être ajouté si le temps le permet.</w:t>
+      </w:r>
+    </w:p>
+    <w:p>
+      <w:pPr>
+        <w:keepNext/>
+        <w:jc w:val="center"/>
+      </w:pPr>
+      <w:r>
+        <w:rPr>
+          <w:noProof/>
+          <w:lang w:val="fr-CH"/>
+        </w:rPr>
+        <w:drawing>
+          <wp:inline distT="0" distB="0" distL="0" distR="0" wp14:anchorId="02A87D2E" wp14:editId="337FCAB1">
+            <wp:extent cx="3742661" cy="2321781"/>
+            <wp:effectExtent l="0" t="0" r="0" b="2540"/>
+            <wp:docPr id="913636024" name="Image 6"/>
+            <wp:cNvGraphicFramePr>
+              <a:graphicFrameLocks xmlns:a="http://schemas.openxmlformats.org/drawingml/2006/main" noChangeAspect="1"/>
+            </wp:cNvGraphicFramePr>
+            <a:graphic xmlns:a="http://schemas.openxmlformats.org/drawingml/2006/main">
+              <a:graphicData uri="http://schemas.openxmlformats.org/drawingml/2006/picture">
+                <pic:pic xmlns:pic="http://schemas.openxmlformats.org/drawingml/2006/picture">
+                  <pic:nvPicPr>
+                    <pic:cNvPr id="0" name="Picture 6"/>
+                    <pic:cNvPicPr>
+                      <a:picLocks noChangeAspect="1" noChangeArrowheads="1"/>
+                    </pic:cNvPicPr>
+                  </pic:nvPicPr>
+                  <pic:blipFill>
+                    <a:blip r:embed="rId11">
+                      <a:extLst>
+                        <a:ext uri="{28A0092B-C50C-407E-A947-70E740481C1C}">
+                          <a14:useLocalDpi xmlns:a14="http://schemas.microsoft.com/office/drawing/2010/main" val="0"/>
+                        </a:ext>
+                      </a:extLst>
+                    </a:blip>
+                    <a:srcRect/>
+                    <a:stretch>
+                      <a:fillRect/>
+                    </a:stretch>
+                  </pic:blipFill>
+                  <pic:spPr bwMode="auto">
+                    <a:xfrm>
+                      <a:off x="0" y="0"/>
+                      <a:ext cx="3745252" cy="2323389"/>
+                    </a:xfrm>
+                    <a:prstGeom prst="rect">
+                      <a:avLst/>
+                    </a:prstGeom>
+                    <a:noFill/>
+                    <a:ln>
+                      <a:noFill/>
+                    </a:ln>
+                  </pic:spPr>
+                </pic:pic>
+              </a:graphicData>
+            </a:graphic>
+          </wp:inline>
+        </w:drawing>
+      </w:r>
+    </w:p>
+    <w:p>
+      <w:pPr>
+        <w:pStyle w:val="Lgende"/>
+        <w:jc w:val="center"/>
+        <w:rPr>
+          <w:lang w:val="fr-CH"/>
+        </w:rPr>
+      </w:pPr>
+      <w:r>
+        <w:t>MCD</w:t>
+      </w:r>
+    </w:p>
+    <w:p>
+      <w:pPr>
+        <w:keepNext/>
+        <w:jc w:val="center"/>
+      </w:pPr>
+      <w:r>
+        <w:rPr>
+          <w:noProof/>
+          <w:lang w:val="fr-CH"/>
+        </w:rPr>
+        <w:lastRenderedPageBreak/>
+        <w:drawing>
+          <wp:inline distT="0" distB="0" distL="0" distR="0" wp14:anchorId="12077522" wp14:editId="2C2D2ABB">
+            <wp:extent cx="3785191" cy="2388463"/>
+            <wp:effectExtent l="0" t="0" r="6350" b="0"/>
+            <wp:docPr id="190460873" name="Image 7"/>
+            <wp:cNvGraphicFramePr>
+              <a:graphicFrameLocks xmlns:a="http://schemas.openxmlformats.org/drawingml/2006/main" noChangeAspect="1"/>
+            </wp:cNvGraphicFramePr>
+            <a:graphic xmlns:a="http://schemas.openxmlformats.org/drawingml/2006/main">
+              <a:graphicData uri="http://schemas.openxmlformats.org/drawingml/2006/picture">
+                <pic:pic xmlns:pic="http://schemas.openxmlformats.org/drawingml/2006/picture">
+                  <pic:nvPicPr>
+                    <pic:cNvPr id="0" name="Picture 7"/>
+                    <pic:cNvPicPr>
+                      <a:picLocks noChangeAspect="1" noChangeArrowheads="1"/>
+                    </pic:cNvPicPr>
+                  </pic:nvPicPr>
+                  <pic:blipFill>
+                    <a:blip r:embed="rId12">
+                      <a:extLst>
+                        <a:ext uri="{28A0092B-C50C-407E-A947-70E740481C1C}">
+                          <a14:useLocalDpi xmlns:a14="http://schemas.microsoft.com/office/drawing/2010/main" val="0"/>
+                        </a:ext>
+                      </a:extLst>
+                    </a:blip>
+                    <a:srcRect/>
+                    <a:stretch>
+                      <a:fillRect/>
+                    </a:stretch>
+                  </pic:blipFill>
+                  <pic:spPr bwMode="auto">
+                    <a:xfrm>
+                      <a:off x="0" y="0"/>
+                      <a:ext cx="3793727" cy="2393849"/>
+                    </a:xfrm>
+                    <a:prstGeom prst="rect">
+                      <a:avLst/>
+                    </a:prstGeom>
+                    <a:noFill/>
+                    <a:ln>
+                      <a:noFill/>
+                    </a:ln>
+                  </pic:spPr>
+                </pic:pic>
+              </a:graphicData>
+            </a:graphic>
+          </wp:inline>
+        </w:drawing>
+      </w:r>
+    </w:p>
+    <w:p>
+      <w:pPr>
+        <w:pStyle w:val="Lgende"/>
+        <w:jc w:val="center"/>
+        <w:rPr>
+          <w:lang w:val="fr-CH"/>
+        </w:rPr>
+      </w:pPr>
+      <w:r>
+        <w:t>MLD</w:t>
+      </w:r>
+    </w:p>
+    <w:p>
+      <w:pPr>
+        <w:keepNext/>
+        <w:jc w:val="center"/>
+      </w:pPr>
+      <w:r>
+        <w:rPr>
+          <w:noProof/>
+          <w:lang w:val="fr-CH"/>
+        </w:rPr>
+        <w:drawing>
+          <wp:inline distT="0" distB="0" distL="0" distR="0" wp14:anchorId="69A421FA" wp14:editId="7F2F6BC4">
+            <wp:extent cx="3838354" cy="2356448"/>
+            <wp:effectExtent l="0" t="0" r="0" b="6350"/>
+            <wp:docPr id="397395217" name="Image 8"/>
+            <wp:cNvGraphicFramePr>
+              <a:graphicFrameLocks xmlns:a="http://schemas.openxmlformats.org/drawingml/2006/main" noChangeAspect="1"/>
+            </wp:cNvGraphicFramePr>
+            <a:graphic xmlns:a="http://schemas.openxmlformats.org/drawingml/2006/main">
+              <a:graphicData uri="http://schemas.openxmlformats.org/drawingml/2006/picture">
+                <pic:pic xmlns:pic="http://schemas.openxmlformats.org/drawingml/2006/picture">
+                  <pic:nvPicPr>
+                    <pic:cNvPr id="0" name="Picture 8"/>
+                    <pic:cNvPicPr>
+                      <a:picLocks noChangeAspect="1" noChangeArrowheads="1"/>
+                    </pic:cNvPicPr>
+                  </pic:nvPicPr>
+                  <pic:blipFill>
+                    <a:blip r:embed="rId13">
+                      <a:extLst>
+                        <a:ext uri="{28A0092B-C50C-407E-A947-70E740481C1C}">
+                          <a14:useLocalDpi xmlns:a14="http://schemas.microsoft.com/office/drawing/2010/main" val="0"/>
+                        </a:ext>
+                      </a:extLst>
+                    </a:blip>
+                    <a:srcRect/>
+                    <a:stretch>
+                      <a:fillRect/>
+                    </a:stretch>
+                  </pic:blipFill>
+                  <pic:spPr bwMode="auto">
+                    <a:xfrm>
+                      <a:off x="0" y="0"/>
+                      <a:ext cx="3842393" cy="2358928"/>
+                    </a:xfrm>
+                    <a:prstGeom prst="rect">
+                      <a:avLst/>
+                    </a:prstGeom>
+                    <a:noFill/>
+                    <a:ln>
+                      <a:noFill/>
+                    </a:ln>
+                  </pic:spPr>
+                </pic:pic>
+              </a:graphicData>
+            </a:graphic>
+          </wp:inline>
+        </w:drawing>
+      </w:r>
+    </w:p>
+    <w:p>
+      <w:pPr>
+        <w:pStyle w:val="Lgende"/>
+        <w:jc w:val="center"/>
+        <w:rPr>
+          <w:lang w:val="fr-CH"/>
+        </w:rPr>
+      </w:pPr>
+      <w:r>
+        <w:t>MPD</w:t>
+      </w:r>
+    </w:p>
+    <w:p>
+      <w:pPr>
+        <w:pStyle w:val="Titre3"/>
+        <w:rPr>
+          <w:lang w:val="fr-CH"/>
+        </w:rPr>
+      </w:pPr>
+      <w:r>
+        <w:rPr>
+          <w:lang w:val="fr-CH"/>
+        </w:rPr>
+        <w:t>Conception de l’API</w:t>
+      </w:r>
+    </w:p>
+    <w:p>
+      <w:pPr>
+        <w:rPr>
+          <w:color w:val="EE0000"/>
+          <w:lang w:val="fr-CH"/>
+        </w:rPr>
+      </w:pPr>
+      <w:r>
+        <w:rPr>
+          <w:color w:val="EE0000"/>
+          <w:lang w:val="fr-CH"/>
+        </w:rPr>
+        <w:t xml:space="preserve">*à remplir* (avec les listes de routes </w:t>
+      </w:r>
+      <w:proofErr w:type="spellStart"/>
+      <w:r>
+        <w:rPr>
+          <w:color w:val="EE0000"/>
+          <w:lang w:val="fr-CH"/>
+        </w:rPr>
+        <w:t>etc</w:t>
+      </w:r>
+      <w:proofErr w:type="spellEnd"/>
+      <w:r>
+        <w:rPr>
+          <w:color w:val="EE0000"/>
+          <w:lang w:val="fr-CH"/>
+        </w:rPr>
+        <w:t xml:space="preserve"> une fois sûr)</w:t>
+      </w:r>
+    </w:p>
+    <w:p>
+      <w:pPr>
+        <w:pStyle w:val="Titre3"/>
+        <w:rPr>
+          <w:lang w:val="fr-CH"/>
+        </w:rPr>
+      </w:pPr>
+      <w:r>
+        <w:rPr>
+          <w:lang w:val="fr-CH"/>
+        </w:rPr>
+        <w:t>Conception de l’interface utilisateur</w:t>
+      </w:r>
+    </w:p>
+    <w:p>
+      <w:pPr>
+        <w:rPr>
+          <w:lang w:val="fr-CH"/>
+        </w:rPr>
+      </w:pPr>
+      <w:r>
+        <w:rPr>
+          <w:lang w:val="fr-CH"/>
+        </w:rPr>
+        <w:t xml:space="preserve">Maquettes d’interface réalisées avec FIGMA, elles représentent et prévoient le futur affichage de l’application. Elles sont haute-fidélités en termes de structure </w:t>
+      </w:r>
+      <w:proofErr w:type="spellStart"/>
+      <w:r>
+        <w:rPr>
+          <w:lang w:val="fr-CH"/>
+        </w:rPr>
+        <w:t>etc</w:t>
+      </w:r>
+      <w:proofErr w:type="spellEnd"/>
+      <w:r>
+        <w:rPr>
+          <w:lang w:val="fr-CH"/>
+        </w:rPr>
+        <w:t xml:space="preserve">, mais sont moyenne/basses en termes de tailles exactes, contenu et détails comme </w:t>
+      </w:r>
+      <w:proofErr w:type="spellStart"/>
+      <w:r>
+        <w:rPr>
+          <w:lang w:val="fr-CH"/>
+        </w:rPr>
+        <w:t>icons</w:t>
+      </w:r>
+      <w:proofErr w:type="spellEnd"/>
+      <w:r>
+        <w:rPr>
+          <w:lang w:val="fr-CH"/>
+        </w:rPr>
+        <w:t xml:space="preserve"> etc...</w:t>
+      </w:r>
+    </w:p>
+    <w:p>
+      <w:pPr>
+        <w:rPr>
+          <w:lang w:val="fr-CH"/>
+        </w:rPr>
+      </w:pPr>
+      <w:r>
+        <w:rPr>
+          <w:lang w:val="fr-CH"/>
+        </w:rPr>
+        <w:t xml:space="preserve">Le lien FIGMA : </w:t>
+      </w:r>
+      <w:hyperlink r:id="rId14" w:history="1">
+        <w:r>
+          <w:rPr>
+            <w:rStyle w:val="Lienhypertexte"/>
+            <w:lang w:val="fr-CH"/>
+          </w:rPr>
+          <w:t>https://www.figma.com/design/bMsktNS29r9i1xJe26PwEE/GestionCitations?node-id=0-1&amp;t=Q1gtZoWngqbnM5CO-1</w:t>
+        </w:r>
+      </w:hyperlink>
+      <w:r>
+        <w:rPr>
+          <w:lang w:val="fr-CH"/>
+        </w:rPr>
+        <w:t xml:space="preserve"> Les liens prototype sont faits pour que la navigation soit </w:t>
+      </w:r>
+      <w:proofErr w:type="gramStart"/>
+      <w:r>
+        <w:rPr>
+          <w:lang w:val="fr-CH"/>
+        </w:rPr>
+        <w:t>fonctionnel</w:t>
+      </w:r>
+      <w:proofErr w:type="gramEnd"/>
+      <w:r>
+        <w:rPr>
+          <w:lang w:val="fr-CH"/>
+        </w:rPr>
+        <w:t xml:space="preserve"> lors du lancement du FIGMA via le bouton play en haut à droite.</w:t>
+      </w:r>
+    </w:p>
+    <w:p>
+      <w:pPr>
+        <w:rPr>
+          <w:lang w:val="fr-CH"/>
+        </w:rPr>
+      </w:pPr>
+      <w:r>
+        <w:rPr>
+          <w:lang w:val="fr-CH"/>
+        </w:rPr>
+        <w:t>L’interface est organisée avec une sidebar fixe à gauche</w:t>
+      </w:r>
+      <w:r>
+        <w:rPr>
+          <w:lang w:val="fr-CH"/>
+        </w:rPr>
+        <w:t xml:space="preserve"> qui permet de naviguer entre les pages principales de manière simple et directe.</w:t>
+      </w:r>
+    </w:p>
+    <w:p>
+      <w:pPr>
+        <w:rPr>
+          <w:lang w:val="fr-CH"/>
+        </w:rPr>
+      </w:pPr>
+      <w:r>
+        <w:rPr>
+          <w:lang w:val="fr-CH"/>
+        </w:rPr>
+        <w:lastRenderedPageBreak/>
+        <w:t xml:space="preserve">Les contenus sont principalement affichés sous forme de cartes. La page d’administration </w:t>
+      </w:r>
+      <w:r>
+        <w:rPr>
+          <w:lang w:val="fr-CH"/>
+        </w:rPr>
+        <w:t xml:space="preserve">elle </w:t>
+      </w:r>
+      <w:r>
+        <w:rPr>
+          <w:lang w:val="fr-CH"/>
+        </w:rPr>
+        <w:t xml:space="preserve">utilise des tableaux, </w:t>
+      </w:r>
+      <w:r>
+        <w:rPr>
+          <w:lang w:val="fr-CH"/>
+        </w:rPr>
+        <w:t>parce que</w:t>
+      </w:r>
+      <w:r>
+        <w:rPr>
+          <w:lang w:val="fr-CH"/>
+        </w:rPr>
+        <w:t xml:space="preserve"> ce format est plus adapté pour gérer </w:t>
+      </w:r>
+      <w:r>
+        <w:rPr>
+          <w:lang w:val="fr-CH"/>
+        </w:rPr>
+        <w:t xml:space="preserve">plus de contenu </w:t>
+      </w:r>
+      <w:r>
+        <w:rPr>
+          <w:lang w:val="fr-CH"/>
+        </w:rPr>
+        <w:t>de manière structurée.</w:t>
+      </w:r>
+    </w:p>
+    <w:p>
+      <w:pPr>
+        <w:rPr>
+          <w:lang w:val="fr-CH"/>
+        </w:rPr>
+      </w:pPr>
+      <w:r>
+        <w:rPr>
+          <w:noProof/>
+          <w:lang w:val="fr-CH"/>
+        </w:rPr>
+        <w:drawing>
+          <wp:inline distT="0" distB="0" distL="0" distR="0" wp14:anchorId="0CF90696" wp14:editId="3148D6E6">
+            <wp:extent cx="5975350" cy="3881120"/>
+            <wp:effectExtent l="0" t="0" r="6350" b="5080"/>
+            <wp:docPr id="72532459" name="Image 9"/>
+            <wp:cNvGraphicFramePr>
+              <a:graphicFrameLocks xmlns:a="http://schemas.openxmlformats.org/drawingml/2006/main" noChangeAspect="1"/>
+            </wp:cNvGraphicFramePr>
+            <a:graphic xmlns:a="http://schemas.openxmlformats.org/drawingml/2006/main">
+              <a:graphicData uri="http://schemas.openxmlformats.org/drawingml/2006/picture">
+                <pic:pic xmlns:pic="http://schemas.openxmlformats.org/drawingml/2006/picture">
+                  <pic:nvPicPr>
+                    <pic:cNvPr id="0" name="Picture 9"/>
+                    <pic:cNvPicPr>
+                      <a:picLocks noChangeAspect="1" noChangeArrowheads="1"/>
+                    </pic:cNvPicPr>
+                  </pic:nvPicPr>
+                  <pic:blipFill>
+                    <a:blip r:embed="rId15">
+                      <a:extLst>
+                        <a:ext uri="{28A0092B-C50C-407E-A947-70E740481C1C}">
+                          <a14:useLocalDpi xmlns:a14="http://schemas.microsoft.com/office/drawing/2010/main" val="0"/>
+                        </a:ext>
+                      </a:extLst>
+                    </a:blip>
+                    <a:srcRect/>
+                    <a:stretch>
+                      <a:fillRect/>
+                    </a:stretch>
+                  </pic:blipFill>
+                  <pic:spPr bwMode="auto">
+                    <a:xfrm>
+                      <a:off x="0" y="0"/>
+                      <a:ext cx="5975350" cy="3881120"/>
+                    </a:xfrm>
+                    <a:prstGeom prst="rect">
+                      <a:avLst/>
+                    </a:prstGeom>
+                    <a:noFill/>
+                    <a:ln>
+                      <a:noFill/>
+                    </a:ln>
+                  </pic:spPr>
+                </pic:pic>
+              </a:graphicData>
+            </a:graphic>
+          </wp:inline>
+        </w:drawing>
+      </w:r>
+    </w:p>
+    <w:p>
+      <w:pPr>
+        <w:rPr>
+          <w:lang w:val="fr-CH"/>
+        </w:rPr>
+      </w:pPr>
+      <w:r>
+        <w:rPr>
+          <w:noProof/>
+          <w:lang w:val="fr-CH"/>
+        </w:rPr>
+        <w:drawing>
+          <wp:inline distT="0" distB="0" distL="0" distR="0" wp14:anchorId="4AAE373D" wp14:editId="377712A2">
+            <wp:extent cx="5975350" cy="3881120"/>
+            <wp:effectExtent l="0" t="0" r="6350" b="5080"/>
+            <wp:docPr id="1569502151" name="Image 10"/>
+            <wp:cNvGraphicFramePr>
+              <a:graphicFrameLocks xmlns:a="http://schemas.openxmlformats.org/drawingml/2006/main" noChangeAspect="1"/>
+            </wp:cNvGraphicFramePr>
+            <a:graphic xmlns:a="http://schemas.openxmlformats.org/drawingml/2006/main">
+              <a:graphicData uri="http://schemas.openxmlformats.org/drawingml/2006/picture">
+                <pic:pic xmlns:pic="http://schemas.openxmlformats.org/drawingml/2006/picture">
+                  <pic:nvPicPr>
+                    <pic:cNvPr id="0" name="Picture 10"/>
+                    <pic:cNvPicPr>
+                      <a:picLocks noChangeAspect="1" noChangeArrowheads="1"/>
+                    </pic:cNvPicPr>
+                  </pic:nvPicPr>
+                  <pic:blipFill>
+                    <a:blip r:embed="rId16">
+                      <a:extLst>
+                        <a:ext uri="{28A0092B-C50C-407E-A947-70E740481C1C}">
+                          <a14:useLocalDpi xmlns:a14="http://schemas.microsoft.com/office/drawing/2010/main" val="0"/>
+                        </a:ext>
+                      </a:extLst>
+                    </a:blip>
+                    <a:srcRect/>
+                    <a:stretch>
+                      <a:fillRect/>
+                    </a:stretch>
+                  </pic:blipFill>
+                  <pic:spPr bwMode="auto">
+                    <a:xfrm>
+                      <a:off x="0" y="0"/>
+                      <a:ext cx="5975350" cy="3881120"/>
+                    </a:xfrm>
+                    <a:prstGeom prst="rect">
+                      <a:avLst/>
+                    </a:prstGeom>
+                    <a:noFill/>
+                    <a:ln>
+                      <a:noFill/>
+                    </a:ln>
+                  </pic:spPr>
+                </pic:pic>
+              </a:graphicData>
+            </a:graphic>
+          </wp:inline>
+        </w:drawing>
+      </w:r>
+    </w:p>
+    <w:p>
+      <w:pPr>
+        <w:rPr>
+          <w:lang w:val="fr-CH"/>
+        </w:rPr>
+      </w:pPr>
+    </w:p>
+    <w:p>
+      <w:pPr>
+        <w:rPr>
+          <w:lang w:val="fr-CH"/>
+        </w:rPr>
+      </w:pPr>
+      <w:r>
+        <w:rPr>
+          <w:noProof/>
+          <w:lang w:val="fr-CH"/>
+        </w:rPr>
+        <w:drawing>
+          <wp:inline distT="0" distB="0" distL="0" distR="0" wp14:anchorId="76A459ED" wp14:editId="44349085">
+            <wp:extent cx="5975350" cy="3881120"/>
+            <wp:effectExtent l="0" t="0" r="6350" b="5080"/>
+            <wp:docPr id="1781225564" name="Image 11"/>
+            <wp:cNvGraphicFramePr>
+              <a:graphicFrameLocks xmlns:a="http://schemas.openxmlformats.org/drawingml/2006/main" noChangeAspect="1"/>
+            </wp:cNvGraphicFramePr>
+            <a:graphic xmlns:a="http://schemas.openxmlformats.org/drawingml/2006/main">
+              <a:graphicData uri="http://schemas.openxmlformats.org/drawingml/2006/picture">
+                <pic:pic xmlns:pic="http://schemas.openxmlformats.org/drawingml/2006/picture">
+                  <pic:nvPicPr>
+                    <pic:cNvPr id="0" name="Picture 11"/>
+                    <pic:cNvPicPr>
+                      <a:picLocks noChangeAspect="1" noChangeArrowheads="1"/>
+                    </pic:cNvPicPr>
+                  </pic:nvPicPr>
+                  <pic:blipFill>
+                    <a:blip r:embed="rId17">
+                      <a:extLst>
+                        <a:ext uri="{28A0092B-C50C-407E-A947-70E740481C1C}">
+                          <a14:useLocalDpi xmlns:a14="http://schemas.microsoft.com/office/drawing/2010/main" val="0"/>
+                        </a:ext>
+                      </a:extLst>
+                    </a:blip>
+                    <a:srcRect/>
+                    <a:stretch>
+                      <a:fillRect/>
+                    </a:stretch>
+                  </pic:blipFill>
+                  <pic:spPr bwMode="auto">
+                    <a:xfrm>
+                      <a:off x="0" y="0"/>
+                      <a:ext cx="5975350" cy="3881120"/>
+                    </a:xfrm>
+                    <a:prstGeom prst="rect">
+                      <a:avLst/>
+                    </a:prstGeom>
+                    <a:noFill/>
+                    <a:ln>
+                      <a:noFill/>
+                    </a:ln>
+                  </pic:spPr>
+                </pic:pic>
+              </a:graphicData>
+            </a:graphic>
+          </wp:inline>
+        </w:drawing>
+      </w:r>
+    </w:p>
+    <w:p>
+      <w:pPr>
+        <w:rPr>
+          <w:lang w:val="fr-CH"/>
+        </w:rPr>
+      </w:pPr>
+      <w:r>
+        <w:rPr>
+          <w:noProof/>
+          <w:lang w:val="fr-CH"/>
+        </w:rPr>
+        <w:drawing>
+          <wp:inline distT="0" distB="0" distL="0" distR="0" wp14:anchorId="766028CF" wp14:editId="044241B7">
+            <wp:extent cx="5975350" cy="3881120"/>
+            <wp:effectExtent l="0" t="0" r="6350" b="5080"/>
+            <wp:docPr id="1108423956" name="Image 12"/>
+            <wp:cNvGraphicFramePr>
+              <a:graphicFrameLocks xmlns:a="http://schemas.openxmlformats.org/drawingml/2006/main" noChangeAspect="1"/>
+            </wp:cNvGraphicFramePr>
+            <a:graphic xmlns:a="http://schemas.openxmlformats.org/drawingml/2006/main">
+              <a:graphicData uri="http://schemas.openxmlformats.org/drawingml/2006/picture">
+                <pic:pic xmlns:pic="http://schemas.openxmlformats.org/drawingml/2006/picture">
+                  <pic:nvPicPr>
+                    <pic:cNvPr id="0" name="Picture 12"/>
+                    <pic:cNvPicPr>
+                      <a:picLocks noChangeAspect="1" noChangeArrowheads="1"/>
+                    </pic:cNvPicPr>
+                  </pic:nvPicPr>
+                  <pic:blipFill>
+                    <a:blip r:embed="rId18">
+                      <a:extLst>
+                        <a:ext uri="{28A0092B-C50C-407E-A947-70E740481C1C}">
+                          <a14:useLocalDpi xmlns:a14="http://schemas.microsoft.com/office/drawing/2010/main" val="0"/>
+                        </a:ext>
+                      </a:extLst>
+                    </a:blip>
+                    <a:srcRect/>
+                    <a:stretch>
+                      <a:fillRect/>
+                    </a:stretch>
+                  </pic:blipFill>
+                  <pic:spPr bwMode="auto">
+                    <a:xfrm>
+                      <a:off x="0" y="0"/>
+                      <a:ext cx="5975350" cy="3881120"/>
+                    </a:xfrm>
+                    <a:prstGeom prst="rect">
+                      <a:avLst/>
+                    </a:prstGeom>
+                    <a:noFill/>
+                    <a:ln>
+                      <a:noFill/>
+                    </a:ln>
+                  </pic:spPr>
+                </pic:pic>
+              </a:graphicData>
+            </a:graphic>
+          </wp:inline>
+        </w:drawing>
+      </w:r>
+    </w:p>
+    <w:p>
+      <w:pPr>
+        <w:rPr>
+          <w:lang w:val="fr-CH"/>
+        </w:rPr>
+      </w:pPr>
+      <w:r>
+        <w:rPr>
+          <w:noProof/>
+          <w:lang w:val="fr-CH"/>
+        </w:rPr>
+        <w:lastRenderedPageBreak/>
+        <w:drawing>
+          <wp:inline distT="0" distB="0" distL="0" distR="0" wp14:anchorId="5BE3BB12" wp14:editId="3DB90104">
+            <wp:extent cx="5975350" cy="3881120"/>
+            <wp:effectExtent l="0" t="0" r="6350" b="5080"/>
+            <wp:docPr id="1703553625" name="Image 13"/>
+            <wp:cNvGraphicFramePr>
+              <a:graphicFrameLocks xmlns:a="http://schemas.openxmlformats.org/drawingml/2006/main" noChangeAspect="1"/>
+            </wp:cNvGraphicFramePr>
+            <a:graphic xmlns:a="http://schemas.openxmlformats.org/drawingml/2006/main">
+              <a:graphicData uri="http://schemas.openxmlformats.org/drawingml/2006/picture">
+                <pic:pic xmlns:pic="http://schemas.openxmlformats.org/drawingml/2006/picture">
+                  <pic:nvPicPr>
+                    <pic:cNvPr id="0" name="Picture 13"/>
+                    <pic:cNvPicPr>
+                      <a:picLocks noChangeAspect="1" noChangeArrowheads="1"/>
+                    </pic:cNvPicPr>
+                  </pic:nvPicPr>
+                  <pic:blipFill>
+                    <a:blip r:embed="rId19">
+                      <a:extLst>
+                        <a:ext uri="{28A0092B-C50C-407E-A947-70E740481C1C}">
+                          <a14:useLocalDpi xmlns:a14="http://schemas.microsoft.com/office/drawing/2010/main" val="0"/>
+                        </a:ext>
+                      </a:extLst>
+                    </a:blip>
+                    <a:srcRect/>
+                    <a:stretch>
+                      <a:fillRect/>
+                    </a:stretch>
+                  </pic:blipFill>
+                  <pic:spPr bwMode="auto">
+                    <a:xfrm>
+                      <a:off x="0" y="0"/>
+                      <a:ext cx="5975350" cy="3881120"/>
+                    </a:xfrm>
+                    <a:prstGeom prst="rect">
+                      <a:avLst/>
+                    </a:prstGeom>
+                    <a:noFill/>
+                    <a:ln>
+                      <a:noFill/>
+                    </a:ln>
+                  </pic:spPr>
+                </pic:pic>
+              </a:graphicData>
+            </a:graphic>
+          </wp:inline>
+        </w:drawing>
+      </w:r>
+    </w:p>
+    <w:p>
+      <w:pPr>
+        <w:rPr>
+          <w:lang w:val="fr-CH"/>
+        </w:rPr>
+      </w:pPr>
+      <w:r>
+        <w:rPr>
+          <w:noProof/>
+          <w:lang w:val="fr-CH"/>
+        </w:rPr>
+        <w:drawing>
+          <wp:inline distT="0" distB="0" distL="0" distR="0" wp14:anchorId="0D14CFA8" wp14:editId="27B8AC4C">
+            <wp:extent cx="5975350" cy="3881120"/>
+            <wp:effectExtent l="0" t="0" r="6350" b="5080"/>
+            <wp:docPr id="295518992" name="Image 14"/>
+            <wp:cNvGraphicFramePr>
+              <a:graphicFrameLocks xmlns:a="http://schemas.openxmlformats.org/drawingml/2006/main" noChangeAspect="1"/>
+            </wp:cNvGraphicFramePr>
+            <a:graphic xmlns:a="http://schemas.openxmlformats.org/drawingml/2006/main">
+              <a:graphicData uri="http://schemas.openxmlformats.org/drawingml/2006/picture">
+                <pic:pic xmlns:pic="http://schemas.openxmlformats.org/drawingml/2006/picture">
+                  <pic:nvPicPr>
+                    <pic:cNvPr id="0" name="Picture 14"/>
+                    <pic:cNvPicPr>
+                      <a:picLocks noChangeAspect="1" noChangeArrowheads="1"/>
+                    </pic:cNvPicPr>
+                  </pic:nvPicPr>
+                  <pic:blipFill>
+                    <a:blip r:embed="rId20">
+                      <a:extLst>
+                        <a:ext uri="{28A0092B-C50C-407E-A947-70E740481C1C}">
+                          <a14:useLocalDpi xmlns:a14="http://schemas.microsoft.com/office/drawing/2010/main" val="0"/>
+                        </a:ext>
+                      </a:extLst>
+                    </a:blip>
+                    <a:srcRect/>
+                    <a:stretch>
+                      <a:fillRect/>
+                    </a:stretch>
+                  </pic:blipFill>
+                  <pic:spPr bwMode="auto">
+                    <a:xfrm>
+                      <a:off x="0" y="0"/>
+                      <a:ext cx="5975350" cy="3881120"/>
+                    </a:xfrm>
+                    <a:prstGeom prst="rect">
+                      <a:avLst/>
+                    </a:prstGeom>
+                    <a:noFill/>
+                    <a:ln>
+                      <a:noFill/>
+                    </a:ln>
+                  </pic:spPr>
+                </pic:pic>
+              </a:graphicData>
+            </a:graphic>
+          </wp:inline>
+        </w:drawing>
+      </w:r>
+    </w:p>
+    <w:p>
+      <w:pPr>
+        <w:rPr>
+          <w:lang w:val="fr-CH"/>
+        </w:rPr>
+      </w:pPr>
+      <w:r>
+        <w:rPr>
+          <w:noProof/>
+          <w:lang w:val="fr-CH"/>
+        </w:rPr>
+        <w:lastRenderedPageBreak/>
+        <w:drawing>
+          <wp:inline distT="0" distB="0" distL="0" distR="0" wp14:anchorId="09C7389B" wp14:editId="5F18C0D7">
+            <wp:extent cx="5975350" cy="3881120"/>
+            <wp:effectExtent l="0" t="0" r="6350" b="5080"/>
+            <wp:docPr id="1370764955" name="Image 15"/>
+            <wp:cNvGraphicFramePr>
+              <a:graphicFrameLocks xmlns:a="http://schemas.openxmlformats.org/drawingml/2006/main" noChangeAspect="1"/>
+            </wp:cNvGraphicFramePr>
+            <a:graphic xmlns:a="http://schemas.openxmlformats.org/drawingml/2006/main">
+              <a:graphicData uri="http://schemas.openxmlformats.org/drawingml/2006/picture">
+                <pic:pic xmlns:pic="http://schemas.openxmlformats.org/drawingml/2006/picture">
+                  <pic:nvPicPr>
+                    <pic:cNvPr id="0" name="Picture 15"/>
+                    <pic:cNvPicPr>
+                      <a:picLocks noChangeAspect="1" noChangeArrowheads="1"/>
+                    </pic:cNvPicPr>
+                  </pic:nvPicPr>
+                  <pic:blipFill>
+                    <a:blip r:embed="rId21">
+                      <a:extLst>
+                        <a:ext uri="{28A0092B-C50C-407E-A947-70E740481C1C}">
+                          <a14:useLocalDpi xmlns:a14="http://schemas.microsoft.com/office/drawing/2010/main" val="0"/>
+                        </a:ext>
+                      </a:extLst>
+                    </a:blip>
+                    <a:srcRect/>
+                    <a:stretch>
+                      <a:fillRect/>
+                    </a:stretch>
+                  </pic:blipFill>
+                  <pic:spPr bwMode="auto">
+                    <a:xfrm>
+                      <a:off x="0" y="0"/>
+                      <a:ext cx="5975350" cy="3881120"/>
+                    </a:xfrm>
+                    <a:prstGeom prst="rect">
+                      <a:avLst/>
+                    </a:prstGeom>
+                    <a:noFill/>
+                    <a:ln>
+                      <a:noFill/>
+                    </a:ln>
+                  </pic:spPr>
+                </pic:pic>
+              </a:graphicData>
+            </a:graphic>
+          </wp:inline>
+        </w:drawing>
+      </w:r>
+    </w:p>
+    <w:p>
+      <w:pPr>
+        <w:rPr>
+          <w:lang w:val="fr-CH"/>
+        </w:rPr>
+      </w:pPr>
+      <w:r>
+        <w:rPr>
+          <w:noProof/>
+          <w:lang w:val="fr-CH"/>
+        </w:rPr>
+        <w:drawing>
+          <wp:inline distT="0" distB="0" distL="0" distR="0" wp14:anchorId="6EC4BDB6" wp14:editId="385B11C3">
+            <wp:extent cx="5975350" cy="3881120"/>
+            <wp:effectExtent l="0" t="0" r="6350" b="5080"/>
+            <wp:docPr id="625238267" name="Image 17"/>
+            <wp:cNvGraphicFramePr>
+              <a:graphicFrameLocks xmlns:a="http://schemas.openxmlformats.org/drawingml/2006/main" noChangeAspect="1"/>
+            </wp:cNvGraphicFramePr>
+            <a:graphic xmlns:a="http://schemas.openxmlformats.org/drawingml/2006/main">
+              <a:graphicData uri="http://schemas.openxmlformats.org/drawingml/2006/picture">
+                <pic:pic xmlns:pic="http://schemas.openxmlformats.org/drawingml/2006/picture">
+                  <pic:nvPicPr>
+                    <pic:cNvPr id="0" name="Picture 17"/>
+                    <pic:cNvPicPr>
+                      <a:picLocks noChangeAspect="1" noChangeArrowheads="1"/>
+                    </pic:cNvPicPr>
+                  </pic:nvPicPr>
+                  <pic:blipFill>
+                    <a:blip r:embed="rId22">
+                      <a:extLst>
+                        <a:ext uri="{28A0092B-C50C-407E-A947-70E740481C1C}">
+                          <a14:useLocalDpi xmlns:a14="http://schemas.microsoft.com/office/drawing/2010/main" val="0"/>
+                        </a:ext>
+                      </a:extLst>
+                    </a:blip>
+                    <a:srcRect/>
+                    <a:stretch>
+                      <a:fillRect/>
+                    </a:stretch>
+                  </pic:blipFill>
+                  <pic:spPr bwMode="auto">
+                    <a:xfrm>
+                      <a:off x="0" y="0"/>
+                      <a:ext cx="5975350" cy="3881120"/>
+                    </a:xfrm>
+                    <a:prstGeom prst="rect">
+                      <a:avLst/>
+                    </a:prstGeom>
+                    <a:noFill/>
+                    <a:ln>
+                      <a:noFill/>
+                    </a:ln>
+                  </pic:spPr>
+                </pic:pic>
+              </a:graphicData>
+            </a:graphic>
+          </wp:inline>
+        </w:drawing>
+      </w:r>
+    </w:p>
+    <w:p>
+      <w:pPr>
+        <w:rPr>
+          <w:lang w:val="fr-CH"/>
+        </w:rPr>
+      </w:pPr>
+      <w:r>
+        <w:rPr>
+          <w:noProof/>
+          <w:lang w:val="fr-CH"/>
+        </w:rPr>
+        <w:lastRenderedPageBreak/>
+        <w:drawing>
+          <wp:inline distT="0" distB="0" distL="0" distR="0" wp14:anchorId="79B58BF6" wp14:editId="5DA0A93D">
+            <wp:extent cx="5975350" cy="3881120"/>
+            <wp:effectExtent l="0" t="0" r="6350" b="5080"/>
+            <wp:docPr id="225181397" name="Image 18"/>
+            <wp:cNvGraphicFramePr>
+              <a:graphicFrameLocks xmlns:a="http://schemas.openxmlformats.org/drawingml/2006/main" noChangeAspect="1"/>
+            </wp:cNvGraphicFramePr>
+            <a:graphic xmlns:a="http://schemas.openxmlformats.org/drawingml/2006/main">
+              <a:graphicData uri="http://schemas.openxmlformats.org/drawingml/2006/picture">
+                <pic:pic xmlns:pic="http://schemas.openxmlformats.org/drawingml/2006/picture">
+                  <pic:nvPicPr>
+                    <pic:cNvPr id="0" name="Picture 18"/>
+                    <pic:cNvPicPr>
+                      <a:picLocks noChangeAspect="1" noChangeArrowheads="1"/>
+                    </pic:cNvPicPr>
+                  </pic:nvPicPr>
+                  <pic:blipFill>
+                    <a:blip r:embed="rId23">
+                      <a:extLst>
+                        <a:ext uri="{28A0092B-C50C-407E-A947-70E740481C1C}">
+                          <a14:useLocalDpi xmlns:a14="http://schemas.microsoft.com/office/drawing/2010/main" val="0"/>
+                        </a:ext>
+                      </a:extLst>
+                    </a:blip>
+                    <a:srcRect/>
+                    <a:stretch>
+                      <a:fillRect/>
+                    </a:stretch>
+                  </pic:blipFill>
+                  <pic:spPr bwMode="auto">
+                    <a:xfrm>
+                      <a:off x="0" y="0"/>
+                      <a:ext cx="5975350" cy="3881120"/>
+                    </a:xfrm>
+                    <a:prstGeom prst="rect">
+                      <a:avLst/>
+                    </a:prstGeom>
+                    <a:noFill/>
+                    <a:ln>
+                      <a:noFill/>
+                    </a:ln>
+                  </pic:spPr>
+                </pic:pic>
+              </a:graphicData>
+            </a:graphic>
+          </wp:inline>
+        </w:drawing>
+      </w:r>
+    </w:p>
+    <w:p>
+      <w:pPr>
+        <w:rPr>
+          <w:lang w:val="fr-CH"/>
+        </w:rPr>
+      </w:pPr>
+      <w:r>
+        <w:rPr>
+          <w:noProof/>
+          <w:lang w:val="fr-CH"/>
+        </w:rPr>
+        <w:drawing>
+          <wp:inline distT="0" distB="0" distL="0" distR="0" wp14:anchorId="05F648BE" wp14:editId="488EE15B">
+            <wp:extent cx="5975350" cy="3881120"/>
+            <wp:effectExtent l="0" t="0" r="6350" b="5080"/>
+            <wp:docPr id="1026109734" name="Image 19"/>
+            <wp:cNvGraphicFramePr>
+              <a:graphicFrameLocks xmlns:a="http://schemas.openxmlformats.org/drawingml/2006/main" noChangeAspect="1"/>
+            </wp:cNvGraphicFramePr>
+            <a:graphic xmlns:a="http://schemas.openxmlformats.org/drawingml/2006/main">
+              <a:graphicData uri="http://schemas.openxmlformats.org/drawingml/2006/picture">
+                <pic:pic xmlns:pic="http://schemas.openxmlformats.org/drawingml/2006/picture">
+                  <pic:nvPicPr>
+                    <pic:cNvPr id="0" name="Picture 19"/>
+                    <pic:cNvPicPr>
+                      <a:picLocks noChangeAspect="1" noChangeArrowheads="1"/>
+                    </pic:cNvPicPr>
+                  </pic:nvPicPr>
+                  <pic:blipFill>
+                    <a:blip r:embed="rId24">
+                      <a:extLst>
+                        <a:ext uri="{28A0092B-C50C-407E-A947-70E740481C1C}">
+                          <a14:useLocalDpi xmlns:a14="http://schemas.microsoft.com/office/drawing/2010/main" val="0"/>
+                        </a:ext>
+                      </a:extLst>
+                    </a:blip>
+                    <a:srcRect/>
+                    <a:stretch>
+                      <a:fillRect/>
+                    </a:stretch>
+                  </pic:blipFill>
+                  <pic:spPr bwMode="auto">
+                    <a:xfrm>
+                      <a:off x="0" y="0"/>
+                      <a:ext cx="5975350" cy="3881120"/>
+                    </a:xfrm>
+                    <a:prstGeom prst="rect">
+                      <a:avLst/>
+                    </a:prstGeom>
+                    <a:noFill/>
+                    <a:ln>
+                      <a:noFill/>
+                    </a:ln>
+                  </pic:spPr>
+                </pic:pic>
+              </a:graphicData>
+            </a:graphic>
+          </wp:inline>
+        </w:drawing>
+      </w:r>
+    </w:p>
+    <w:p>
+      <w:pPr>
+        <w:rPr>
+          <w:lang w:val="fr-CH"/>
+        </w:rPr>
+      </w:pPr>
+      <w:r>
+        <w:rPr>
+          <w:noProof/>
+          <w:lang w:val="fr-CH"/>
+        </w:rPr>
+        <w:lastRenderedPageBreak/>
+        <w:drawing>
+          <wp:inline distT="0" distB="0" distL="0" distR="0" wp14:anchorId="30C8D115" wp14:editId="779988FD">
+            <wp:extent cx="5975350" cy="3881120"/>
+            <wp:effectExtent l="0" t="0" r="6350" b="5080"/>
+            <wp:docPr id="2025492390" name="Image 20"/>
+            <wp:cNvGraphicFramePr>
+              <a:graphicFrameLocks xmlns:a="http://schemas.openxmlformats.org/drawingml/2006/main" noChangeAspect="1"/>
+            </wp:cNvGraphicFramePr>
+            <a:graphic xmlns:a="http://schemas.openxmlformats.org/drawingml/2006/main">
+              <a:graphicData uri="http://schemas.openxmlformats.org/drawingml/2006/picture">
+                <pic:pic xmlns:pic="http://schemas.openxmlformats.org/drawingml/2006/picture">
+                  <pic:nvPicPr>
+                    <pic:cNvPr id="0" name="Picture 20"/>
+                    <pic:cNvPicPr>
+                      <a:picLocks noChangeAspect="1" noChangeArrowheads="1"/>
+                    </pic:cNvPicPr>
+                  </pic:nvPicPr>
+                  <pic:blipFill>
+                    <a:blip r:embed="rId25">
+                      <a:extLst>
+                        <a:ext uri="{28A0092B-C50C-407E-A947-70E740481C1C}">
+                          <a14:useLocalDpi xmlns:a14="http://schemas.microsoft.com/office/drawing/2010/main" val="0"/>
+                        </a:ext>
+                      </a:extLst>
+                    </a:blip>
+                    <a:srcRect/>
+                    <a:stretch>
+                      <a:fillRect/>
+                    </a:stretch>
+                  </pic:blipFill>
+                  <pic:spPr bwMode="auto">
+                    <a:xfrm>
+                      <a:off x="0" y="0"/>
+                      <a:ext cx="5975350" cy="3881120"/>
+                    </a:xfrm>
+                    <a:prstGeom prst="rect">
+                      <a:avLst/>
+                    </a:prstGeom>
+                    <a:noFill/>
+                    <a:ln>
+                      <a:noFill/>
+                    </a:ln>
+                  </pic:spPr>
+                </pic:pic>
+              </a:graphicData>
+            </a:graphic>
+          </wp:inline>
+        </w:drawing>
+      </w:r>
+    </w:p>
+    <w:p>
+      <w:pPr>
         <w:pStyle w:val="Guidage"/>
         <w:rPr>
           <w:lang w:val="fr-CH"/>
@@ -14075,6 +15839,1146 @@
       </w:pPr>
       <w:r>
         <w:rPr>
+          <w:noProof/>
+          <w:lang w:val="fr-CH"/>
+        </w:rPr>
+        <w:drawing>
+          <wp:inline distT="0" distB="0" distL="0" distR="0" wp14:anchorId="11FD416D" wp14:editId="71C39CF7">
+            <wp:extent cx="5975350" cy="3881120"/>
+            <wp:effectExtent l="0" t="0" r="6350" b="5080"/>
+            <wp:docPr id="1243421028" name="Image 21"/>
+            <wp:cNvGraphicFramePr>
+              <a:graphicFrameLocks xmlns:a="http://schemas.openxmlformats.org/drawingml/2006/main" noChangeAspect="1"/>
+            </wp:cNvGraphicFramePr>
+            <a:graphic xmlns:a="http://schemas.openxmlformats.org/drawingml/2006/main">
+              <a:graphicData uri="http://schemas.openxmlformats.org/drawingml/2006/picture">
+                <pic:pic xmlns:pic="http://schemas.openxmlformats.org/drawingml/2006/picture">
+                  <pic:nvPicPr>
+                    <pic:cNvPr id="0" name="Picture 21"/>
+                    <pic:cNvPicPr>
+                      <a:picLocks noChangeAspect="1" noChangeArrowheads="1"/>
+                    </pic:cNvPicPr>
+                  </pic:nvPicPr>
+                  <pic:blipFill>
+                    <a:blip r:embed="rId26">
+                      <a:extLst>
+                        <a:ext uri="{28A0092B-C50C-407E-A947-70E740481C1C}">
+                          <a14:useLocalDpi xmlns:a14="http://schemas.microsoft.com/office/drawing/2010/main" val="0"/>
+                        </a:ext>
+                      </a:extLst>
+                    </a:blip>
+                    <a:srcRect/>
+                    <a:stretch>
+                      <a:fillRect/>
+                    </a:stretch>
+                  </pic:blipFill>
+                  <pic:spPr bwMode="auto">
+                    <a:xfrm>
+                      <a:off x="0" y="0"/>
+                      <a:ext cx="5975350" cy="3881120"/>
+                    </a:xfrm>
+                    <a:prstGeom prst="rect">
+                      <a:avLst/>
+                    </a:prstGeom>
+                    <a:noFill/>
+                    <a:ln>
+                      <a:noFill/>
+                    </a:ln>
+                  </pic:spPr>
+                </pic:pic>
+              </a:graphicData>
+            </a:graphic>
+          </wp:inline>
+        </w:drawing>
+      </w:r>
+    </w:p>
+    <w:p>
+      <w:pPr>
+        <w:pStyle w:val="Guidage"/>
+        <w:rPr>
+          <w:lang w:val="fr-CH"/>
+        </w:rPr>
+      </w:pPr>
+      <w:r>
+        <w:rPr>
+          <w:noProof/>
+          <w:lang w:val="fr-CH"/>
+        </w:rPr>
+        <w:lastRenderedPageBreak/>
+        <w:drawing>
+          <wp:inline distT="0" distB="0" distL="0" distR="0" wp14:anchorId="24021C07" wp14:editId="6DF43A8E">
+            <wp:extent cx="5975350" cy="3881120"/>
+            <wp:effectExtent l="0" t="0" r="6350" b="5080"/>
+            <wp:docPr id="1340019628" name="Image 22"/>
+            <wp:cNvGraphicFramePr>
+              <a:graphicFrameLocks xmlns:a="http://schemas.openxmlformats.org/drawingml/2006/main" noChangeAspect="1"/>
+            </wp:cNvGraphicFramePr>
+            <a:graphic xmlns:a="http://schemas.openxmlformats.org/drawingml/2006/main">
+              <a:graphicData uri="http://schemas.openxmlformats.org/drawingml/2006/picture">
+                <pic:pic xmlns:pic="http://schemas.openxmlformats.org/drawingml/2006/picture">
+                  <pic:nvPicPr>
+                    <pic:cNvPr id="0" name="Picture 22"/>
+                    <pic:cNvPicPr>
+                      <a:picLocks noChangeAspect="1" noChangeArrowheads="1"/>
+                    </pic:cNvPicPr>
+                  </pic:nvPicPr>
+                  <pic:blipFill>
+                    <a:blip r:embed="rId27">
+                      <a:extLst>
+                        <a:ext uri="{28A0092B-C50C-407E-A947-70E740481C1C}">
+                          <a14:useLocalDpi xmlns:a14="http://schemas.microsoft.com/office/drawing/2010/main" val="0"/>
+                        </a:ext>
+                      </a:extLst>
+                    </a:blip>
+                    <a:srcRect/>
+                    <a:stretch>
+                      <a:fillRect/>
+                    </a:stretch>
+                  </pic:blipFill>
+                  <pic:spPr bwMode="auto">
+                    <a:xfrm>
+                      <a:off x="0" y="0"/>
+                      <a:ext cx="5975350" cy="3881120"/>
+                    </a:xfrm>
+                    <a:prstGeom prst="rect">
+                      <a:avLst/>
+                    </a:prstGeom>
+                    <a:noFill/>
+                    <a:ln>
+                      <a:noFill/>
+                    </a:ln>
+                  </pic:spPr>
+                </pic:pic>
+              </a:graphicData>
+            </a:graphic>
+          </wp:inline>
+        </w:drawing>
+      </w:r>
+    </w:p>
+    <w:p>
+      <w:pPr>
+        <w:pStyle w:val="Titre3"/>
+        <w:rPr>
+          <w:lang w:val="fr-CH"/>
+        </w:rPr>
+      </w:pPr>
+      <w:r>
+        <w:rPr>
+          <w:lang w:val="fr-CH"/>
+        </w:rPr>
+        <w:t>Charte graphique</w:t>
+      </w:r>
+    </w:p>
+    <w:p>
+      <w:pPr>
+        <w:jc w:val="center"/>
+        <w:rPr>
+          <w:lang w:val="fr-CH"/>
+        </w:rPr>
+      </w:pPr>
+      <w:r>
+        <w:rPr>
+          <w:noProof/>
+          <w:lang w:val="fr-CH"/>
+        </w:rPr>
+        <w:drawing>
+          <wp:inline distT="0" distB="0" distL="0" distR="0" wp14:anchorId="331D065B" wp14:editId="6EAC57C3">
+            <wp:extent cx="5740400" cy="1621035"/>
+            <wp:effectExtent l="152400" t="152400" r="355600" b="360680"/>
+            <wp:docPr id="544803314" name="Image 23"/>
+            <wp:cNvGraphicFramePr>
+              <a:graphicFrameLocks xmlns:a="http://schemas.openxmlformats.org/drawingml/2006/main" noChangeAspect="1"/>
+            </wp:cNvGraphicFramePr>
+            <a:graphic xmlns:a="http://schemas.openxmlformats.org/drawingml/2006/main">
+              <a:graphicData uri="http://schemas.openxmlformats.org/drawingml/2006/picture">
+                <pic:pic xmlns:pic="http://schemas.openxmlformats.org/drawingml/2006/picture">
+                  <pic:nvPicPr>
+                    <pic:cNvPr id="0" name="Picture 23"/>
+                    <pic:cNvPicPr>
+                      <a:picLocks noChangeAspect="1" noChangeArrowheads="1"/>
+                    </pic:cNvPicPr>
+                  </pic:nvPicPr>
+                  <pic:blipFill rotWithShape="1">
+                    <a:blip r:embed="rId28">
+                      <a:extLst>
+                        <a:ext uri="{28A0092B-C50C-407E-A947-70E740481C1C}">
+                          <a14:useLocalDpi xmlns:a14="http://schemas.microsoft.com/office/drawing/2010/main" val="0"/>
+                        </a:ext>
+                      </a:extLst>
+                    </a:blip>
+                    <a:srcRect r="245"/>
+                    <a:stretch>
+                      <a:fillRect/>
+                    </a:stretch>
+                  </pic:blipFill>
+                  <pic:spPr bwMode="auto">
+                    <a:xfrm>
+                      <a:off x="0" y="0"/>
+                      <a:ext cx="5757424" cy="1625843"/>
+                    </a:xfrm>
+                    <a:prstGeom prst="rect">
+                      <a:avLst/>
+                    </a:prstGeom>
+                    <a:ln>
+                      <a:noFill/>
+                    </a:ln>
+                    <a:effectLst>
+                      <a:outerShdw blurRad="292100" dist="139700" dir="2700000" algn="tl" rotWithShape="0">
+                        <a:srgbClr val="333333">
+                          <a:alpha val="65000"/>
+                        </a:srgbClr>
+                      </a:outerShdw>
+                    </a:effectLst>
+                    <a:extLst>
+                      <a:ext uri="{53640926-AAD7-44D8-BBD7-CCE9431645EC}">
+                        <a14:shadowObscured xmlns:a14="http://schemas.microsoft.com/office/drawing/2010/main"/>
+                      </a:ext>
+                    </a:extLst>
+                  </pic:spPr>
+                </pic:pic>
+              </a:graphicData>
+            </a:graphic>
+          </wp:inline>
+        </w:drawing>
+      </w:r>
+    </w:p>
+    <w:p>
+      <w:pPr>
+        <w:rPr>
+          <w:lang w:val="fr-CH"/>
+        </w:rPr>
+      </w:pPr>
+      <w:r>
+        <w:rPr>
+          <w:lang w:val="fr-CH"/>
+        </w:rPr>
+        <w:t>Au niveau des couleurs l</w:t>
+      </w:r>
+      <w:r>
+        <w:rPr>
+          <w:lang w:val="fr-CH"/>
+        </w:rPr>
+        <w:t>’application utilise une palette simple et sobre : fond gris clair, cartes blanches et couleur principale bleue. Le bleu sert pour les actions importantes</w:t>
+      </w:r>
+      <w:r>
+        <w:rPr>
+          <w:lang w:val="fr-CH"/>
+        </w:rPr>
+        <w:t xml:space="preserve"> (ou secondaires en contours)</w:t>
+      </w:r>
+      <w:r>
+        <w:rPr>
+          <w:lang w:val="fr-CH"/>
+        </w:rPr>
+        <w:t>, les liens et les éléments actifs</w:t>
+      </w:r>
+      <w:r>
+        <w:rPr>
+          <w:lang w:val="fr-CH"/>
+        </w:rPr>
+        <w:t xml:space="preserve"> et en bleu clair pour les actifs/hovers etc</w:t>
+      </w:r>
+      <w:r>
+        <w:rPr>
+          <w:lang w:val="fr-CH"/>
+        </w:rPr>
+        <w:t>. Le texte est en noir ou gris foncé, et le rouge est réservé aux actions dangereuses comme la suppression.</w:t>
+      </w:r>
+    </w:p>
+    <w:p>
+      <w:pPr>
+        <w:rPr>
+          <w:lang w:val="fr-CH"/>
+        </w:rPr>
+      </w:pPr>
+      <w:r>
+        <w:rPr>
+          <w:lang w:val="fr-CH"/>
+        </w:rPr>
+        <w:t>La typographie est lisible et simple. Les titres sont plus grands et plus visibles. Les textes principaux sont en noir ou gris foncé, les informations secondaires sont en gris.</w:t>
+      </w:r>
+    </w:p>
+    <w:p>
+      <w:pPr>
+        <w:rPr>
+          <w:lang w:val="fr-CH"/>
+        </w:rPr>
+      </w:pPr>
+      <w:r>
+        <w:rPr>
+          <w:lang w:val="fr-CH"/>
+        </w:rPr>
+        <w:lastRenderedPageBreak/>
+        <w:t>Les boutons principaux sont bleus avec du texte. Les boutons secondaires sont gris clair</w:t>
+      </w:r>
+      <w:r>
+        <w:rPr>
+          <w:lang w:val="fr-CH"/>
+        </w:rPr>
+        <w:t xml:space="preserve"> ou blancs à contours bleus</w:t>
+      </w:r>
+      <w:r>
+        <w:rPr>
+          <w:lang w:val="fr-CH"/>
+        </w:rPr>
+        <w:t>. Les boutons de suppression sont rouges pour montrer clairement qu’il s’agit d’une action importante.</w:t>
+      </w:r>
+    </w:p>
+    <w:p>
+      <w:pPr>
+        <w:rPr>
+          <w:lang w:val="fr-CH"/>
+        </w:rPr>
+      </w:pPr>
+      <w:r>
+        <w:rPr>
+          <w:lang w:val="fr-CH"/>
+        </w:rPr>
+        <w:t xml:space="preserve">Les cartes ont un fond blanc, des coins arrondis et une légère ombre. Elles servent à présenter clairement les </w:t>
+      </w:r>
+      <w:r>
+        <w:rPr>
+          <w:lang w:val="fr-CH"/>
+        </w:rPr>
+        <w:t>contenus comme les films</w:t>
+      </w:r>
+      <w:r>
+        <w:rPr>
+          <w:lang w:val="fr-CH"/>
+        </w:rPr>
+        <w:t>, les citations, les formulaires et</w:t>
+      </w:r>
+      <w:r>
+        <w:rPr>
+          <w:lang w:val="fr-CH"/>
+        </w:rPr>
+        <w:t>c</w:t>
+      </w:r>
+      <w:r>
+        <w:rPr>
+          <w:lang w:val="fr-CH"/>
+        </w:rPr>
+        <w:t>.</w:t>
+      </w:r>
+    </w:p>
+    <w:p>
+      <w:pPr>
+        <w:rPr>
+          <w:lang w:val="fr-CH"/>
+        </w:rPr>
+      </w:pPr>
+      <w:r>
+        <w:rPr>
+          <w:lang w:val="fr-CH"/>
+        </w:rPr>
+        <w:t xml:space="preserve">Il y’a également </w:t>
+      </w:r>
+      <w:r>
+        <w:rPr>
+          <w:lang w:val="fr-CH"/>
+        </w:rPr>
+        <w:t>une utilisation fréquente</w:t>
+      </w:r>
+      <w:r>
+        <w:rPr>
+          <w:lang w:val="fr-CH"/>
+        </w:rPr>
+        <w:t xml:space="preserve"> d’icônes pour améliorer la navigation, le style et la clarté de l’application.</w:t>
+      </w:r>
+    </w:p>
+    <w:p>
+      <w:pPr>
+        <w:pStyle w:val="Titre3"/>
+        <w:rPr>
+          <w:lang w:val="fr-CH"/>
+        </w:rPr>
+      </w:pPr>
+      <w:r>
+        <w:rPr>
+          <w:lang w:val="fr-CH"/>
+        </w:rPr>
+        <w:t>Authentification et autorisations</w:t>
+      </w:r>
+    </w:p>
+    <w:p>
+      <w:pPr>
+        <w:rPr>
+          <w:lang w:val="fr-CH"/>
+        </w:rPr>
+      </w:pPr>
+      <w:r>
+        <w:rPr>
+          <w:lang w:val="fr-CH"/>
+        </w:rPr>
+        <w:t>L’application prévoit deux rôles principaux</w:t>
+      </w:r>
+      <w:r>
+        <w:rPr>
+          <w:lang w:val="fr-CH"/>
+        </w:rPr>
+        <w:t>,</w:t>
+      </w:r>
+      <w:r>
+        <w:rPr>
+          <w:lang w:val="fr-CH"/>
+        </w:rPr>
+        <w:t xml:space="preserve"> user et admin. Un visiteur non connecté n’a pas de rôle en base de données. Il peut </w:t>
+      </w:r>
+      <w:r>
+        <w:rPr>
+          <w:lang w:val="fr-CH"/>
+        </w:rPr>
+        <w:t>juste</w:t>
+      </w:r>
+      <w:r>
+        <w:rPr>
+          <w:lang w:val="fr-CH"/>
+        </w:rPr>
+        <w:t xml:space="preserve"> accéder aux fonctionnalités publiques</w:t>
+      </w:r>
+      <w:r>
+        <w:rPr>
+          <w:lang w:val="fr-CH"/>
+        </w:rPr>
+        <w:t xml:space="preserve"> comme </w:t>
+      </w:r>
+      <w:r>
+        <w:rPr>
+          <w:lang w:val="fr-CH"/>
+        </w:rPr>
+        <w:t>la consultation des films, des citations et de leurs détails.</w:t>
+      </w:r>
+    </w:p>
+    <w:p>
+      <w:pPr>
+        <w:rPr>
+          <w:lang w:val="fr-CH"/>
+        </w:rPr>
+      </w:pPr>
+      <w:r>
+        <w:rPr>
+          <w:lang w:val="fr-CH"/>
+        </w:rPr>
+        <w:t xml:space="preserve">Le rôle de l’utilisateur est stocké dans la table users dans un champ </w:t>
+      </w:r>
+      <w:r>
+        <w:rPr>
+          <w:lang w:val="fr-CH"/>
+        </w:rPr>
+        <w:t>« </w:t>
+      </w:r>
+      <w:proofErr w:type="spellStart"/>
+      <w:r>
+        <w:rPr>
+          <w:lang w:val="fr-CH"/>
+        </w:rPr>
+        <w:t>role</w:t>
+      </w:r>
+      <w:proofErr w:type="spellEnd"/>
+      <w:r>
+        <w:rPr>
+          <w:lang w:val="fr-CH"/>
+        </w:rPr>
+        <w:t> »</w:t>
+      </w:r>
+      <w:r>
+        <w:rPr>
+          <w:lang w:val="fr-CH"/>
+        </w:rPr>
+        <w:t>. Cette solution est simple et suffisante pour le projet, car il n’y a pas besoin d’un système complexe avec plusieurs tables de rôles et permissi</w:t>
+      </w:r>
+      <w:r>
+        <w:rPr>
+          <w:lang w:val="fr-CH"/>
+        </w:rPr>
+        <w:t>o</w:t>
+      </w:r>
+      <w:r>
+        <w:rPr>
+          <w:lang w:val="fr-CH"/>
+        </w:rPr>
+        <w:t>ns</w:t>
+      </w:r>
+      <w:r>
+        <w:rPr>
+          <w:lang w:val="fr-CH"/>
+        </w:rPr>
+        <w:t xml:space="preserve"> dans ce contexte</w:t>
+      </w:r>
+      <w:r>
+        <w:rPr>
+          <w:lang w:val="fr-CH"/>
+        </w:rPr>
+        <w:t>.</w:t>
+      </w:r>
+    </w:p>
+    <w:p>
+      <w:pPr>
+        <w:rPr>
+          <w:lang w:val="fr-CH"/>
+        </w:rPr>
+      </w:pPr>
+      <w:r>
+        <w:rPr>
+          <w:lang w:val="fr-CH"/>
+        </w:rPr>
+        <w:t xml:space="preserve">Pour l’authentification API, </w:t>
+      </w:r>
+      <w:r>
+        <w:rPr>
+          <w:lang w:val="fr-CH"/>
+        </w:rPr>
+        <w:t>Laravel Sanctum est utilisé car elle permet de protéger les routes API sans devoir mettre en place une solution plus lourd comme un système JWT complet ou quoi. Ça rend la gestion de l’authentification simple d’autant plus que c’est un package officiel et maintenu par l’équipe de Laravel.</w:t>
+      </w:r>
+    </w:p>
+    <w:p>
+      <w:pPr>
+        <w:rPr>
+          <w:lang w:val="fr-CH"/>
+        </w:rPr>
+      </w:pPr>
+      <w:r>
+        <w:rPr>
+          <w:lang w:val="fr-CH"/>
+        </w:rPr>
+        <w:t xml:space="preserve">Les droits d’accès seront principalement contrôlés </w:t>
+      </w:r>
+      <w:r>
+        <w:rPr>
+          <w:lang w:val="fr-CH"/>
+        </w:rPr>
+        <w:t>niveau</w:t>
+      </w:r>
+      <w:r>
+        <w:rPr>
+          <w:lang w:val="fr-CH"/>
+        </w:rPr>
+        <w:t xml:space="preserve"> backend avec des middlewares Laravel. Des vérifications supplémentaires pourront être ajoutées dans les contrôleurs si une règle spécifique doit être appliquée, par exemple pour empêcher un utilisateur de modifier un contenu qui ne lui appartient pas.</w:t>
+      </w:r>
+    </w:p>
+    <w:p>
+      <w:pPr>
+        <w:rPr>
+          <w:lang w:val="fr-CH"/>
+        </w:rPr>
+      </w:pPr>
+      <w:r>
+        <w:rPr>
+          <w:lang w:val="fr-CH"/>
+        </w:rPr>
+        <w:t xml:space="preserve">Côté frontend, certaines actions seront affichées ou masquées selon l’état de connexion et le rôle de l’utilisateur. Par exemple, les boutons de modification ou de suppression ne doivent pas être affichés à un utilisateur qui n’a pas le droit d’effectuer ces actions. </w:t>
+      </w:r>
+      <w:r>
+        <w:rPr>
+          <w:lang w:val="fr-CH"/>
+        </w:rPr>
+        <w:t>Mais</w:t>
+      </w:r>
+      <w:r>
+        <w:rPr>
+          <w:lang w:val="fr-CH"/>
+        </w:rPr>
+        <w:t xml:space="preserve"> </w:t>
+      </w:r>
+      <w:r>
+        <w:rPr>
+          <w:lang w:val="fr-CH"/>
+        </w:rPr>
+        <w:t>les</w:t>
+      </w:r>
+      <w:r>
+        <w:rPr>
+          <w:lang w:val="fr-CH"/>
+        </w:rPr>
+        <w:t xml:space="preserve"> contrôles visuels ne remplacent pas les vérifications backend. Les règles importantes </w:t>
+      </w:r>
+      <w:r>
+        <w:rPr>
+          <w:lang w:val="fr-CH"/>
+        </w:rPr>
+        <w:t>sont toujours</w:t>
+      </w:r>
+      <w:r>
+        <w:rPr>
+          <w:lang w:val="fr-CH"/>
+        </w:rPr>
+        <w:t xml:space="preserve"> contrôlées par l’API.</w:t>
+      </w:r>
+    </w:p>
+    <w:p>
+      <w:pPr>
+        <w:pStyle w:val="Titre3"/>
+        <w:rPr>
+          <w:lang w:val="fr-CH"/>
+        </w:rPr>
+      </w:pPr>
+      <w:r>
+        <w:rPr>
+          <w:lang w:val="fr-CH"/>
+        </w:rPr>
+        <w:t>Sécurité</w:t>
+      </w:r>
+    </w:p>
+    <w:p>
+      <w:pPr>
+        <w:rPr>
+          <w:lang w:val="fr-CH"/>
+        </w:rPr>
+      </w:pPr>
+      <w:r>
+        <w:rPr>
+          <w:lang w:val="fr-CH"/>
+        </w:rPr>
+        <w:t xml:space="preserve">La sécurité est prise en compte dès </w:t>
+      </w:r>
+      <w:r>
+        <w:rPr>
+          <w:lang w:val="fr-CH"/>
+        </w:rPr>
+        <w:t>la conception</w:t>
+      </w:r>
+      <w:r>
+        <w:rPr>
+          <w:lang w:val="fr-CH"/>
+        </w:rPr>
+        <w:t xml:space="preserve">, </w:t>
+      </w:r>
+      <w:r>
+        <w:rPr>
+          <w:lang w:val="fr-CH"/>
+        </w:rPr>
+        <w:t>parce que</w:t>
+      </w:r>
+      <w:r>
+        <w:rPr>
+          <w:lang w:val="fr-CH"/>
+        </w:rPr>
+        <w:t xml:space="preserve"> l’application contient des utilisateurs authentifiés, des rôles et des actions de création, modification et suppression</w:t>
+      </w:r>
+      <w:r>
+        <w:rPr>
+          <w:lang w:val="fr-CH"/>
+        </w:rPr>
+        <w:t xml:space="preserve"> ce qui implique forcément de la sécurité que ça soit au niveau de l’application en elle-même ou au niveau des données et l’accès à ceux-ci</w:t>
+      </w:r>
+      <w:r>
+        <w:rPr>
+          <w:lang w:val="fr-CH"/>
+        </w:rPr>
+        <w:t>.</w:t>
+      </w:r>
+    </w:p>
+    <w:p>
+      <w:pPr>
+        <w:rPr>
+          <w:lang w:val="fr-CH"/>
+        </w:rPr>
+      </w:pPr>
+      <w:r>
+        <w:rPr>
+          <w:lang w:val="fr-CH"/>
+        </w:rPr>
+        <w:t xml:space="preserve">Les mots de passe seront </w:t>
+      </w:r>
+      <w:proofErr w:type="spellStart"/>
+      <w:r>
+        <w:rPr>
+          <w:lang w:val="fr-CH"/>
+        </w:rPr>
+        <w:t>hashés</w:t>
+      </w:r>
+      <w:proofErr w:type="spellEnd"/>
+      <w:r>
+        <w:rPr>
+          <w:lang w:val="fr-CH"/>
+        </w:rPr>
+        <w:t xml:space="preserve"> par Laravel avant d’être stockés en base de données. La validation des données sera gérée avec des Form </w:t>
+      </w:r>
+      <w:proofErr w:type="spellStart"/>
+      <w:r>
+        <w:rPr>
+          <w:lang w:val="fr-CH"/>
+        </w:rPr>
+        <w:t>Requests</w:t>
+      </w:r>
+      <w:proofErr w:type="spellEnd"/>
+      <w:r>
+        <w:rPr>
+          <w:lang w:val="fr-CH"/>
+        </w:rPr>
+        <w:t xml:space="preserve">, </w:t>
+      </w:r>
+      <w:r>
+        <w:rPr>
+          <w:lang w:val="fr-CH"/>
+        </w:rPr>
+        <w:t>afin d’avoir des règles de validations propres, robustes et centralisées pour</w:t>
+      </w:r>
+      <w:r>
+        <w:rPr>
+          <w:lang w:val="fr-CH"/>
+        </w:rPr>
+        <w:t xml:space="preserve"> limiter les données invalides</w:t>
+      </w:r>
+      <w:r>
+        <w:rPr>
+          <w:lang w:val="fr-CH"/>
+        </w:rPr>
+        <w:t xml:space="preserve"> et potentiellement dangereuses</w:t>
+      </w:r>
+      <w:r>
+        <w:rPr>
+          <w:lang w:val="fr-CH"/>
+        </w:rPr>
+        <w:t>.</w:t>
+      </w:r>
+    </w:p>
+    <w:p>
+      <w:pPr>
+        <w:rPr>
+          <w:lang w:val="fr-CH"/>
+        </w:rPr>
+      </w:pPr>
+    </w:p>
+    <w:p>
+      <w:pPr>
+        <w:rPr>
+          <w:lang w:val="fr-CH"/>
+        </w:rPr>
+      </w:pPr>
+      <w:r>
+        <w:rPr>
+          <w:lang w:val="fr-CH"/>
+        </w:rPr>
+        <w:lastRenderedPageBreak/>
+        <w:t xml:space="preserve">Les routes API </w:t>
+      </w:r>
+      <w:r>
+        <w:rPr>
+          <w:lang w:val="fr-CH"/>
+        </w:rPr>
+        <w:t>« sensibles »</w:t>
+      </w:r>
+      <w:r>
+        <w:rPr>
+          <w:lang w:val="fr-CH"/>
+        </w:rPr>
+        <w:t xml:space="preserve"> seront protégées. Les utilisateurs non connectés ne doivent pas pouvoir accéder aux actions réservées aux utilisateurs authentifiés. Les administrateurs doivent </w:t>
+      </w:r>
+      <w:r>
+        <w:rPr>
+          <w:lang w:val="fr-CH"/>
+        </w:rPr>
+        <w:t>aussi</w:t>
+      </w:r>
+      <w:r>
+        <w:rPr>
+          <w:lang w:val="fr-CH"/>
+        </w:rPr>
+        <w:t xml:space="preserve"> avoir des droits supplémentaires par rapport aux utilisateurs </w:t>
+      </w:r>
+      <w:r>
+        <w:rPr>
+          <w:lang w:val="fr-CH"/>
+        </w:rPr>
+        <w:t>simples</w:t>
+      </w:r>
+      <w:r>
+        <w:rPr>
+          <w:lang w:val="fr-CH"/>
+        </w:rPr>
+        <w:t>.</w:t>
+      </w:r>
+    </w:p>
+    <w:p>
+      <w:pPr>
+        <w:rPr>
+          <w:lang w:val="fr-CH"/>
+        </w:rPr>
+      </w:pPr>
+      <w:r>
+        <w:rPr>
+          <w:lang w:val="fr-CH"/>
+        </w:rPr>
+        <w:t xml:space="preserve">Les variables sensibles, comme les informations de connexion à la base de données ou </w:t>
+      </w:r>
+      <w:r>
+        <w:rPr>
+          <w:lang w:val="fr-CH"/>
+        </w:rPr>
+        <w:t xml:space="preserve">autres </w:t>
+      </w:r>
+      <w:r>
+        <w:rPr>
+          <w:lang w:val="fr-CH"/>
+        </w:rPr>
+        <w:t>clés</w:t>
+      </w:r>
+      <w:r>
+        <w:rPr>
+          <w:lang w:val="fr-CH"/>
+        </w:rPr>
+        <w:t xml:space="preserve">, seront stockées dans </w:t>
+      </w:r>
+      <w:r>
+        <w:rPr>
+          <w:lang w:val="fr-CH"/>
+        </w:rPr>
+        <w:t>un</w:t>
+      </w:r>
+      <w:r>
+        <w:rPr>
+          <w:lang w:val="fr-CH"/>
+        </w:rPr>
+        <w:t xml:space="preserve"> </w:t>
+      </w:r>
+      <w:r>
+        <w:rPr>
+          <w:lang w:val="fr-CH"/>
+        </w:rPr>
+        <w:t>fichier</w:t>
+      </w:r>
+      <w:r>
+        <w:rPr>
+          <w:lang w:val="fr-CH"/>
+        </w:rPr>
+        <w:t xml:space="preserve"> </w:t>
+      </w:r>
+      <w:r>
+        <w:rPr>
+          <w:lang w:val="fr-CH"/>
+        </w:rPr>
+        <w:t>.</w:t>
+      </w:r>
+      <w:r>
+        <w:rPr>
+          <w:lang w:val="fr-CH"/>
+        </w:rPr>
+        <w:t>env</w:t>
+      </w:r>
+      <w:r>
+        <w:rPr>
+          <w:lang w:val="fr-CH"/>
+        </w:rPr>
+        <w:t xml:space="preserve"> en local et dans les variables d’environnement Azure en production. </w:t>
+      </w:r>
+      <w:r>
+        <w:rPr>
+          <w:lang w:val="fr-CH"/>
+        </w:rPr>
+        <w:t>Ce sont des données qui ne seront jamais exposés dans le code ou repo GitHub.</w:t>
+      </w:r>
+    </w:p>
+    <w:p>
+      <w:pPr>
+        <w:pStyle w:val="Titre3"/>
+        <w:rPr>
+          <w:lang w:val="fr-CH"/>
+        </w:rPr>
+      </w:pPr>
+      <w:r>
+        <w:rPr>
+          <w:lang w:val="fr-CH"/>
+        </w:rPr>
+        <w:t>Choix techniques et alternatives évaluées</w:t>
+      </w:r>
+    </w:p>
+    <w:p>
+      <w:pPr>
+        <w:rPr>
+          <w:lang w:val="fr-CH"/>
+        </w:rPr>
+      </w:pPr>
+      <w:r>
+        <w:rPr>
+          <w:lang w:val="fr-CH"/>
+        </w:rPr>
+        <w:t xml:space="preserve">Le choix </w:t>
+      </w:r>
+      <w:r>
+        <w:rPr>
+          <w:lang w:val="fr-CH"/>
+        </w:rPr>
+        <w:t>des technos front et back</w:t>
+      </w:r>
+      <w:r>
+        <w:rPr>
+          <w:lang w:val="fr-CH"/>
+        </w:rPr>
+        <w:t xml:space="preserve"> </w:t>
+      </w:r>
+      <w:r>
+        <w:rPr>
+          <w:lang w:val="fr-CH"/>
+        </w:rPr>
+        <w:t>sont</w:t>
+      </w:r>
+      <w:r>
+        <w:rPr>
+          <w:lang w:val="fr-CH"/>
+        </w:rPr>
+        <w:t xml:space="preserve"> lié</w:t>
+      </w:r>
+      <w:r>
+        <w:rPr>
+          <w:lang w:val="fr-CH"/>
+        </w:rPr>
+        <w:t>s</w:t>
+      </w:r>
+      <w:r>
+        <w:rPr>
+          <w:lang w:val="fr-CH"/>
+        </w:rPr>
+        <w:t xml:space="preserve"> à l’expérience acquise pendant le stage chez </w:t>
+      </w:r>
+      <w:proofErr w:type="spellStart"/>
+      <w:r>
+        <w:rPr>
+          <w:lang w:val="fr-CH"/>
+        </w:rPr>
+        <w:t>Infomaniak</w:t>
+      </w:r>
+      <w:proofErr w:type="spellEnd"/>
+      <w:r>
+        <w:rPr>
+          <w:lang w:val="fr-CH"/>
+        </w:rPr>
+        <w:t xml:space="preserve">. </w:t>
+      </w:r>
+      <w:r>
+        <w:rPr>
+          <w:lang w:val="fr-CH"/>
+        </w:rPr>
+        <w:t>Le fait que ces</w:t>
+      </w:r>
+      <w:r>
+        <w:rPr>
+          <w:lang w:val="fr-CH"/>
+        </w:rPr>
+        <w:t xml:space="preserve"> technologie</w:t>
+      </w:r>
+      <w:r>
+        <w:rPr>
+          <w:lang w:val="fr-CH"/>
+        </w:rPr>
+        <w:t>s</w:t>
+      </w:r>
+      <w:r>
+        <w:rPr>
+          <w:lang w:val="fr-CH"/>
+        </w:rPr>
+        <w:t xml:space="preserve"> </w:t>
+      </w:r>
+      <w:r>
+        <w:rPr>
+          <w:lang w:val="fr-CH"/>
+        </w:rPr>
+        <w:t>aient</w:t>
+      </w:r>
+      <w:r>
+        <w:rPr>
+          <w:lang w:val="fr-CH"/>
+        </w:rPr>
+        <w:t xml:space="preserve"> déjà été utilisée</w:t>
+      </w:r>
+      <w:r>
+        <w:rPr>
+          <w:lang w:val="fr-CH"/>
+        </w:rPr>
+        <w:t>s</w:t>
+      </w:r>
+      <w:r>
+        <w:rPr>
+          <w:lang w:val="fr-CH"/>
+        </w:rPr>
+        <w:t xml:space="preserve"> dans un contexte professionnel, permet de travailler avec </w:t>
+      </w:r>
+      <w:r>
+        <w:rPr>
+          <w:lang w:val="fr-CH"/>
+        </w:rPr>
+        <w:t>des</w:t>
+      </w:r>
+      <w:r>
+        <w:rPr>
+          <w:lang w:val="fr-CH"/>
+        </w:rPr>
+        <w:t xml:space="preserve"> </w:t>
+      </w:r>
+      <w:proofErr w:type="spellStart"/>
+      <w:r>
+        <w:rPr>
+          <w:lang w:val="fr-CH"/>
+        </w:rPr>
+        <w:t>framework</w:t>
+      </w:r>
+      <w:r>
+        <w:rPr>
+          <w:lang w:val="fr-CH"/>
+        </w:rPr>
+        <w:t>s</w:t>
+      </w:r>
+      <w:proofErr w:type="spellEnd"/>
+      <w:r>
+        <w:rPr>
+          <w:lang w:val="fr-CH"/>
+        </w:rPr>
+        <w:t xml:space="preserve"> connu</w:t>
+      </w:r>
+      <w:r>
+        <w:rPr>
+          <w:lang w:val="fr-CH"/>
+        </w:rPr>
+        <w:t>s</w:t>
+      </w:r>
+      <w:r>
+        <w:rPr>
+          <w:lang w:val="fr-CH"/>
+        </w:rPr>
+        <w:t xml:space="preserve"> et adapté</w:t>
+      </w:r>
+      <w:r>
+        <w:rPr>
+          <w:lang w:val="fr-CH"/>
+        </w:rPr>
+        <w:t>s</w:t>
+      </w:r>
+      <w:r>
+        <w:rPr>
+          <w:lang w:val="fr-CH"/>
+        </w:rPr>
+        <w:t xml:space="preserve"> à la création d’une application web</w:t>
+      </w:r>
+      <w:r>
+        <w:rPr>
+          <w:lang w:val="fr-CH"/>
+        </w:rPr>
+        <w:t xml:space="preserve"> propre et structurée</w:t>
+      </w:r>
+      <w:r>
+        <w:rPr>
+          <w:lang w:val="fr-CH"/>
+        </w:rPr>
+        <w:t>. Ce choix a été discuté avec le chef de projet et intégré au cahier des charges.</w:t>
+      </w:r>
+    </w:p>
+    <w:p>
+      <w:pPr>
+        <w:rPr>
+          <w:lang w:val="fr-CH"/>
+        </w:rPr>
+      </w:pPr>
+      <w:r>
+        <w:rPr>
+          <w:lang w:val="fr-CH"/>
+        </w:rPr>
+        <w:t xml:space="preserve">Pour l’hébergement, Azure a été préféré à l’hébergement </w:t>
+      </w:r>
+      <w:r>
+        <w:rPr>
+          <w:lang w:val="fr-CH"/>
+        </w:rPr>
+        <w:t>ETML (via un serveur classique à la main)</w:t>
+      </w:r>
+      <w:r>
+        <w:rPr>
+          <w:lang w:val="fr-CH"/>
+        </w:rPr>
+        <w:t xml:space="preserve">. Azure a déjà été vu en cours et correspond bien au besoin du projet, car il permet d’héberger séparément le frontend, le backend et la base de données. </w:t>
+      </w:r>
+    </w:p>
+    <w:p>
+      <w:pPr>
+        <w:rPr>
+          <w:color w:val="EE0000"/>
+          <w:lang w:val="fr-CH"/>
+        </w:rPr>
+      </w:pPr>
+      <w:r>
+        <w:rPr>
+          <w:color w:val="EE0000"/>
+          <w:lang w:val="fr-CH"/>
+        </w:rPr>
+        <w:t xml:space="preserve">*à embellir si d’autres alternatives </w:t>
+      </w:r>
+      <w:proofErr w:type="spellStart"/>
+      <w:r>
+        <w:rPr>
+          <w:color w:val="EE0000"/>
+          <w:lang w:val="fr-CH"/>
+        </w:rPr>
+        <w:t>etudies</w:t>
+      </w:r>
+      <w:proofErr w:type="spellEnd"/>
+      <w:r>
+        <w:rPr>
+          <w:color w:val="EE0000"/>
+          <w:lang w:val="fr-CH"/>
+        </w:rPr>
+        <w:t xml:space="preserve"> par la suite et même pour + détailler les choix techniques*</w:t>
+      </w:r>
+    </w:p>
+    <w:p>
+      <w:pPr>
+        <w:pStyle w:val="Titre3"/>
+        <w:rPr>
+          <w:lang w:val="fr-CH"/>
+        </w:rPr>
+      </w:pPr>
+      <w:r>
+        <w:rPr>
+          <w:lang w:val="fr-CH"/>
+        </w:rPr>
+        <w:t>UML et schémas fonctionnels</w:t>
+      </w:r>
+    </w:p>
+    <w:p>
+      <w:pPr>
+        <w:rPr>
+          <w:color w:val="EE0000"/>
+          <w:lang w:val="fr-CH"/>
+        </w:rPr>
+      </w:pPr>
+      <w:r>
+        <w:rPr>
+          <w:color w:val="EE0000"/>
+          <w:lang w:val="fr-CH"/>
+        </w:rPr>
+        <w:t>*à remplir quand fait*</w:t>
+      </w:r>
+      <w:r>
+        <w:rPr>
+          <w:color w:val="EE0000"/>
+          <w:lang w:val="fr-CH"/>
+        </w:rPr>
+        <w:t xml:space="preserve"> (flux de connexion, ajout d’un film/citation, suppression, recherche)</w:t>
+      </w:r>
+    </w:p>
+    <w:p>
+      <w:pPr>
+        <w:pStyle w:val="Titre2"/>
+        <w:rPr>
+          <w:lang w:val="fr-CH"/>
+        </w:rPr>
+      </w:pPr>
+      <w:bookmarkStart w:id="6" w:name="_Toc223006823"/>
+      <w:r>
+        <w:rPr>
+          <w:lang w:val="fr-CH"/>
+        </w:rPr>
+        <w:t>Planification et suivi</w:t>
+      </w:r>
+      <w:bookmarkEnd w:id="6"/>
+    </w:p>
+    <w:p>
+      <w:pPr>
+        <w:pStyle w:val="Guidage"/>
+        <w:rPr>
+          <w:lang w:val="fr-CH"/>
+        </w:rPr>
+      </w:pPr>
+      <w:r>
+        <w:rPr>
           <w:lang w:val="fr-CH"/>
         </w:rPr>
         <w:t xml:space="preserve">Example de contenu attendu </w:t>
@@ -14091,7 +16995,13 @@
         <w:pStyle w:val="GuidageList"/>
       </w:pPr>
       <w:r>
-        <w:t>Architecture (schéma de haut niveau)</w:t>
+        <w:t xml:space="preserve">Planification initiale (jalons, </w:t>
+      </w:r>
+      <w:r>
+        <w:t>Gantt, tâches, date de début / fin, Milestone</w:t>
+      </w:r>
+      <w:r>
+        <w:t>)</w:t>
       </w:r>
     </w:p>
     <w:p>
@@ -14099,45 +17009,13 @@
         <w:pStyle w:val="GuidageList"/>
       </w:pPr>
       <w:r>
-        <w:t>Conception détaillée (</w:t>
-      </w:r>
-      <w:r>
-        <w:t>MCD</w:t>
-      </w:r>
-      <w:r>
-        <w:t xml:space="preserve">, </w:t>
-      </w:r>
-      <w:r>
-        <w:t>UML</w:t>
-      </w:r>
-      <w:r>
-        <w:t xml:space="preserve">, </w:t>
-      </w:r>
-      <w:r>
-        <w:t xml:space="preserve">schéma </w:t>
-      </w:r>
-      <w:r>
-        <w:t>fonctionnel</w:t>
-      </w:r>
-      <w:r>
-        <w:t>,</w:t>
-      </w:r>
-      <w:r>
-        <w:t xml:space="preserve"> API, maquettes UI</w:t>
-      </w:r>
-      <w:r>
-        <w:t>,</w:t>
-      </w:r>
-      <w:r>
-        <w:t xml:space="preserve"> </w:t>
-      </w:r>
-      <w:proofErr w:type="spellStart"/>
-      <w:r>
-        <w:t>etc</w:t>
-      </w:r>
-      <w:proofErr w:type="spellEnd"/>
-      <w:r>
-        <w:t>)</w:t>
+        <w:t>Planification révisée et écarts (</w:t>
+      </w:r>
+      <w:r>
+        <w:t xml:space="preserve">explications </w:t>
+      </w:r>
+      <w:r>
+        <w:t>causes + actions)</w:t>
       </w:r>
     </w:p>
     <w:p>
@@ -14145,7 +17023,7 @@
         <w:pStyle w:val="GuidageList"/>
       </w:pPr>
       <w:r>
-        <w:t>Choix techniques et alternatives évaluées</w:t>
+        <w:t>Suivi : indicateurs, décisions, changements importants</w:t>
       </w:r>
     </w:p>
     <w:p>
@@ -14153,301 +17031,182 @@
         <w:pStyle w:val="GuidageList"/>
       </w:pPr>
       <w:r>
-        <w:t>Sécurité : authentification, autorisations, gestion des secrets</w:t>
-      </w:r>
-      <w:r>
-        <w:t xml:space="preserve">, firewall, </w:t>
-      </w:r>
-      <w:r>
-        <w:t>protocole</w:t>
-      </w:r>
-      <w:r>
-        <w:t xml:space="preserve"> </w:t>
-      </w:r>
-    </w:p>
-    <w:p>
-      <w:pPr>
-        <w:rPr>
-          <w:lang w:val="fr-CH"/>
-        </w:rPr>
-      </w:pPr>
-      <w:r>
+        <w:t>Pour des questions de place, le journal de travail sera mentionné en Annexe</w:t>
+      </w:r>
+    </w:p>
+    <w:p>
+      <w:pPr>
         <w:rPr>
           <w:i/>
           <w:color w:val="787878"/>
           <w:lang w:val="fr-CH"/>
         </w:rPr>
-        <w:t>À rédiger</w:t>
-      </w:r>
+      </w:pPr>
       <w:r>
         <w:rPr>
           <w:i/>
           <w:color w:val="787878"/>
           <w:lang w:val="fr-CH"/>
         </w:rPr>
-        <w:t xml:space="preserve"> …</w:t>
-      </w:r>
-    </w:p>
-    <w:p>
-      <w:pPr>
-        <w:rPr>
-          <w:lang w:val="fr-CH"/>
-        </w:rPr>
-      </w:pPr>
-    </w:p>
-    <w:p>
-      <w:pPr>
-        <w:pStyle w:val="Titre2"/>
-        <w:rPr>
-          <w:lang w:val="fr-CH"/>
-        </w:rPr>
-      </w:pPr>
-      <w:bookmarkStart w:id="6" w:name="_Toc223006823"/>
-      <w:r>
-        <w:rPr>
-          <w:lang w:val="fr-CH"/>
-        </w:rPr>
-        <w:t>Planification et suivi</w:t>
-      </w:r>
-      <w:bookmarkEnd w:id="6"/>
-    </w:p>
-    <w:p>
-      <w:pPr>
-        <w:pStyle w:val="Guidage"/>
-        <w:rPr>
-          <w:lang w:val="fr-CH"/>
-        </w:rPr>
-      </w:pPr>
-      <w:r>
-        <w:rPr>
-          <w:lang w:val="fr-CH"/>
-        </w:rPr>
-        <w:t xml:space="preserve">Example de contenu attendu </w:t>
-      </w:r>
-      <w:r>
-        <w:rPr>
-          <w:lang w:val="fr-CH"/>
-        </w:rPr>
-        <w:t>:</w:t>
-      </w:r>
-    </w:p>
-    <w:p>
-      <w:pPr>
-        <w:pStyle w:val="GuidageList"/>
-      </w:pPr>
-      <w:r>
-        <w:t xml:space="preserve">Planification initiale (jalons, </w:t>
-      </w:r>
-      <w:r>
-        <w:t>Gantt, tâches, date de début / fin, Milestone</w:t>
-      </w:r>
-      <w:r>
-        <w:t>)</w:t>
-      </w:r>
-    </w:p>
-    <w:p>
-      <w:pPr>
-        <w:pStyle w:val="GuidageList"/>
-      </w:pPr>
-      <w:r>
-        <w:t>Planification révisée et écarts (</w:t>
-      </w:r>
-      <w:r>
-        <w:t xml:space="preserve">explications </w:t>
-      </w:r>
-      <w:r>
-        <w:t>causes + actions)</w:t>
-      </w:r>
-    </w:p>
-    <w:p>
-      <w:pPr>
-        <w:pStyle w:val="GuidageList"/>
-      </w:pPr>
-      <w:r>
-        <w:t>Suivi : indicateurs, décisions, changements importants</w:t>
-      </w:r>
-    </w:p>
-    <w:p>
-      <w:pPr>
-        <w:pStyle w:val="GuidageList"/>
-      </w:pPr>
-      <w:r>
-        <w:t>Pour des questions de place, le journal de travail sera mentionné en Annexe</w:t>
-      </w:r>
-    </w:p>
-    <w:p>
-      <w:pPr>
+        <w:t>À rédiger</w:t>
+      </w:r>
+      <w:r>
         <w:rPr>
           <w:i/>
           <w:color w:val="787878"/>
           <w:lang w:val="fr-CH"/>
         </w:rPr>
-      </w:pPr>
+        <w:t xml:space="preserve"> …</w:t>
+      </w:r>
+    </w:p>
+    <w:p>
+      <w:pPr>
+        <w:rPr>
+          <w:lang w:val="fr-CH"/>
+        </w:rPr>
+      </w:pPr>
+      <w:r>
+        <w:rPr>
+          <w:iCs/>
+          <w:lang w:val="fr-CH"/>
+        </w:rPr>
+        <w:t>L</w:t>
+      </w:r>
+      <w:r>
+        <w:rPr>
+          <w:iCs/>
+          <w:lang w:val="fr-CH"/>
+        </w:rPr>
+        <w:t>e</w:t>
+      </w:r>
       <w:r>
         <w:rPr>
           <w:i/>
-          <w:color w:val="787878"/>
-          <w:lang w:val="fr-CH"/>
-        </w:rPr>
-        <w:t>À rédiger</w:t>
+          <w:lang w:val="fr-CH"/>
+        </w:rPr>
+        <w:t xml:space="preserve"> </w:t>
       </w:r>
       <w:r>
         <w:rPr>
           <w:i/>
-          <w:color w:val="787878"/>
-          <w:lang w:val="fr-CH"/>
-        </w:rPr>
-        <w:t xml:space="preserve"> …</w:t>
-      </w:r>
-    </w:p>
-    <w:p>
-      <w:pPr>
-        <w:rPr>
-          <w:lang w:val="fr-CH"/>
-        </w:rPr>
-      </w:pPr>
+          <w:lang w:val="fr-CH"/>
+        </w:rPr>
+        <w:t>« </w:t>
+      </w:r>
+      <w:r>
+        <w:rPr>
+          <w:i/>
+          <w:lang w:val="fr-CH"/>
+        </w:rPr>
+        <w:fldChar w:fldCharType="begin"/>
+      </w:r>
+      <w:r>
+        <w:rPr>
+          <w:i/>
+          <w:lang w:val="fr-CH"/>
+        </w:rPr>
+        <w:instrText xml:space="preserve"> REF _Ref223004013 \h </w:instrText>
+      </w:r>
+      <w:r>
+        <w:rPr>
+          <w:i/>
+          <w:lang w:val="fr-CH"/>
+        </w:rPr>
+      </w:r>
+      <w:r>
+        <w:rPr>
+          <w:i/>
+          <w:lang w:val="fr-CH"/>
+        </w:rPr>
+        <w:fldChar w:fldCharType="separate"/>
+      </w:r>
+      <w:r>
+        <w:rPr>
+          <w:lang w:val="fr-CH"/>
+        </w:rPr>
+        <w:t>Journal de travail</w:t>
+      </w:r>
+      <w:r>
+        <w:rPr>
+          <w:i/>
+          <w:lang w:val="fr-CH"/>
+        </w:rPr>
+        <w:fldChar w:fldCharType="end"/>
+      </w:r>
+      <w:r>
+        <w:rPr>
+          <w:i/>
+          <w:lang w:val="fr-CH"/>
+        </w:rPr>
+        <w:t> </w:t>
+      </w:r>
       <w:r>
         <w:rPr>
           <w:iCs/>
           <w:lang w:val="fr-CH"/>
         </w:rPr>
-        <w:t>L</w:t>
+        <w:t xml:space="preserve">» </w:t>
       </w:r>
       <w:r>
         <w:rPr>
           <w:iCs/>
           <w:lang w:val="fr-CH"/>
         </w:rPr>
-        <w:t>e</w:t>
-      </w:r>
-      <w:r>
-        <w:rPr>
-          <w:i/>
-          <w:lang w:val="fr-CH"/>
-        </w:rPr>
-        <w:t xml:space="preserve"> </w:t>
-      </w:r>
-      <w:r>
-        <w:rPr>
-          <w:i/>
-          <w:lang w:val="fr-CH"/>
-        </w:rPr>
-        <w:t>« </w:t>
-      </w:r>
-      <w:r>
-        <w:rPr>
-          <w:i/>
+        <w:t xml:space="preserve">est partagé </w:t>
+      </w:r>
+      <w:r>
+        <w:rPr>
+          <w:iCs/>
+          <w:lang w:val="fr-CH"/>
+        </w:rPr>
+        <w:t xml:space="preserve">dans </w:t>
+      </w:r>
+      <w:r>
+        <w:rPr>
+          <w:iCs/>
           <w:lang w:val="fr-CH"/>
         </w:rPr>
         <w:fldChar w:fldCharType="begin"/>
       </w:r>
       <w:r>
         <w:rPr>
-          <w:i/>
-          <w:lang w:val="fr-CH"/>
-        </w:rPr>
-        <w:instrText xml:space="preserve"> REF _Ref223004013 \h </w:instrText>
-      </w:r>
-      <w:r>
-        <w:rPr>
-          <w:i/>
-          <w:lang w:val="fr-CH"/>
-        </w:rPr>
-      </w:r>
-      <w:r>
-        <w:rPr>
-          <w:i/>
+          <w:iCs/>
+          <w:lang w:val="fr-CH"/>
+        </w:rPr>
+        <w:instrText xml:space="preserve"> REF _Ref223004069 \h  \* MERGEFORMAT </w:instrText>
+      </w:r>
+      <w:r>
+        <w:rPr>
+          <w:iCs/>
+          <w:lang w:val="fr-CH"/>
+        </w:rPr>
+      </w:r>
+      <w:r>
+        <w:rPr>
+          <w:iCs/>
           <w:lang w:val="fr-CH"/>
         </w:rPr>
         <w:fldChar w:fldCharType="separate"/>
       </w:r>
       <w:r>
         <w:rPr>
-          <w:lang w:val="fr-CH"/>
-        </w:rPr>
-        <w:t>Journal de travail</w:t>
-      </w:r>
-      <w:r>
-        <w:rPr>
-          <w:i/>
+          <w:iCs/>
+          <w:lang w:val="fr-CH"/>
+        </w:rPr>
+        <w:t>Annexes</w:t>
+      </w:r>
+      <w:r>
+        <w:rPr>
+          <w:iCs/>
           <w:lang w:val="fr-CH"/>
         </w:rPr>
         <w:fldChar w:fldCharType="end"/>
       </w:r>
       <w:r>
         <w:rPr>
-          <w:i/>
-          <w:lang w:val="fr-CH"/>
-        </w:rPr>
-        <w:t> </w:t>
-      </w:r>
-      <w:r>
-        <w:rPr>
           <w:iCs/>
           <w:lang w:val="fr-CH"/>
         </w:rPr>
-        <w:t xml:space="preserve">» </w:t>
-      </w:r>
-      <w:r>
-        <w:rPr>
-          <w:iCs/>
-          <w:lang w:val="fr-CH"/>
-        </w:rPr>
-        <w:t xml:space="preserve">est partagé </w:t>
-      </w:r>
-      <w:r>
-        <w:rPr>
-          <w:iCs/>
-          <w:lang w:val="fr-CH"/>
-        </w:rPr>
-        <w:t xml:space="preserve">dans </w:t>
-      </w:r>
-      <w:r>
-        <w:rPr>
-          <w:iCs/>
-          <w:lang w:val="fr-CH"/>
-        </w:rPr>
-        <w:fldChar w:fldCharType="begin"/>
-      </w:r>
-      <w:r>
-        <w:rPr>
-          <w:iCs/>
-          <w:lang w:val="fr-CH"/>
-        </w:rPr>
-        <w:instrText xml:space="preserve"> REF _Ref223004069 \h  \* MERGEFORMAT </w:instrText>
-      </w:r>
-      <w:r>
-        <w:rPr>
-          <w:iCs/>
-          <w:lang w:val="fr-CH"/>
-        </w:rPr>
-      </w:r>
-      <w:r>
-        <w:rPr>
-          <w:iCs/>
-          <w:lang w:val="fr-CH"/>
-        </w:rPr>
-        <w:fldChar w:fldCharType="separate"/>
-      </w:r>
-      <w:r>
-        <w:rPr>
-          <w:iCs/>
-          <w:lang w:val="fr-CH"/>
-        </w:rPr>
-        <w:t>Annexes</w:t>
-      </w:r>
-      <w:r>
-        <w:rPr>
-          <w:iCs/>
-          <w:lang w:val="fr-CH"/>
-        </w:rPr>
-        <w:fldChar w:fldCharType="end"/>
-      </w:r>
-      <w:r>
-        <w:rPr>
-          <w:iCs/>
-          <w:lang w:val="fr-CH"/>
-        </w:rPr>
         <w:t>.</w:t>
       </w:r>
     </w:p>
@@ -14470,7 +17229,6 @@
         <w:rPr>
           <w:lang w:val="fr-CH"/>
         </w:rPr>
-        <w:lastRenderedPageBreak/>
         <w:t>Réalisation</w:t>
       </w:r>
       <w:bookmarkEnd w:id="7"/>
@@ -14637,6 +17395,7 @@
           <w:iCs w:val="0"/>
           <w:lang w:val="fr-CH"/>
         </w:rPr>
+        <w:lastRenderedPageBreak/>
         <w:t>Installation et déploiement</w:t>
       </w:r>
     </w:p>
@@ -17457,9 +20216,9 @@
       </w:pPr>
     </w:p>
     <w:sectPr>
-      <w:headerReference w:type="default" r:id="rId9"/>
-      <w:footerReference w:type="even" r:id="rId10"/>
-      <w:footerReference w:type="default" r:id="rId11"/>
+      <w:headerReference w:type="default" r:id="rId29"/>
+      <w:footerReference w:type="even" r:id="rId30"/>
+      <w:footerReference w:type="default" r:id="rId31"/>
       <w:pgSz w:w="12240" w:h="15840"/>
       <w:pgMar w:top="1386" w:right="1417" w:bottom="618" w:left="1417" w:header="720" w:footer="188" w:gutter="0"/>
       <w:cols w:space="720"/>
@@ -17857,7 +20616,7 @@
               <w:noProof/>
               <w:lang w:val="fr-CH"/>
             </w:rPr>
-            <w:t>07/05/2026</w:t>
+            <w:t>11/05/2026</w:t>
           </w:r>
           <w:r>
             <w:rPr>
@@ -17964,6 +20723,7 @@
               <w:lang w:val="fr-CH"/>
             </w:rPr>
           </w:pPr>
+          <w:proofErr w:type="spellStart"/>
           <w:r>
             <w:rPr>
               <w:b/>
@@ -17972,6 +20732,7 @@
             </w:rPr>
             <w:t>GestionCitations</w:t>
           </w:r>
+          <w:proofErr w:type="spellEnd"/>
         </w:p>
       </w:tc>
       <w:tc>
@@ -19737,6 +22498,119 @@
     </w:lvl>
   </w:abstractNum>
   <w:abstractNum w:abstractNumId="20" w15:restartNumberingAfterBreak="0">
+    <w:nsid w:val="55E56BD7"/>
+    <w:multiLevelType w:val="hybridMultilevel"/>
+    <w:tmpl w:val="B218F6C2"/>
+    <w:lvl w:ilvl="0" w:tplc="100C0001">
+      <w:start w:val="1"/>
+      <w:numFmt w:val="bullet"/>
+      <w:lvlText w:val=""/>
+      <w:lvlJc w:val="left"/>
+      <w:pPr>
+        <w:ind w:left="720" w:hanging="360"/>
+      </w:pPr>
+      <w:rPr>
+        <w:rFonts w:ascii="Symbol" w:hAnsi="Symbol" w:hint="default"/>
+      </w:rPr>
+    </w:lvl>
+    <w:lvl w:ilvl="1" w:tplc="100C0003" w:tentative="1">
+      <w:start w:val="1"/>
+      <w:numFmt w:val="bullet"/>
+      <w:lvlText w:val="o"/>
+      <w:lvlJc w:val="left"/>
+      <w:pPr>
+        <w:ind w:left="1440" w:hanging="360"/>
+      </w:pPr>
+      <w:rPr>
+        <w:rFonts w:ascii="Courier New" w:hAnsi="Courier New" w:cs="Courier New" w:hint="default"/>
+      </w:rPr>
+    </w:lvl>
+    <w:lvl w:ilvl="2" w:tplc="100C0005" w:tentative="1">
+      <w:start w:val="1"/>
+      <w:numFmt w:val="bullet"/>
+      <w:lvlText w:val=""/>
+      <w:lvlJc w:val="left"/>
+      <w:pPr>
+        <w:ind w:left="2160" w:hanging="360"/>
+      </w:pPr>
+      <w:rPr>
+        <w:rFonts w:ascii="Wingdings" w:hAnsi="Wingdings" w:hint="default"/>
+      </w:rPr>
+    </w:lvl>
+    <w:lvl w:ilvl="3" w:tplc="100C0001" w:tentative="1">
+      <w:start w:val="1"/>
+      <w:numFmt w:val="bullet"/>
+      <w:lvlText w:val=""/>
+      <w:lvlJc w:val="left"/>
+      <w:pPr>
+        <w:ind w:left="2880" w:hanging="360"/>
+      </w:pPr>
+      <w:rPr>
+        <w:rFonts w:ascii="Symbol" w:hAnsi="Symbol" w:hint="default"/>
+      </w:rPr>
+    </w:lvl>
+    <w:lvl w:ilvl="4" w:tplc="100C0003" w:tentative="1">
+      <w:start w:val="1"/>
+      <w:numFmt w:val="bullet"/>
+      <w:lvlText w:val="o"/>
+      <w:lvlJc w:val="left"/>
+      <w:pPr>
+        <w:ind w:left="3600" w:hanging="360"/>
+      </w:pPr>
+      <w:rPr>
+        <w:rFonts w:ascii="Courier New" w:hAnsi="Courier New" w:cs="Courier New" w:hint="default"/>
+      </w:rPr>
+    </w:lvl>
+    <w:lvl w:ilvl="5" w:tplc="100C0005" w:tentative="1">
+      <w:start w:val="1"/>
+      <w:numFmt w:val="bullet"/>
+      <w:lvlText w:val=""/>
+      <w:lvlJc w:val="left"/>
+      <w:pPr>
+        <w:ind w:left="4320" w:hanging="360"/>
+      </w:pPr>
+      <w:rPr>
+        <w:rFonts w:ascii="Wingdings" w:hAnsi="Wingdings" w:hint="default"/>
+      </w:rPr>
+    </w:lvl>
+    <w:lvl w:ilvl="6" w:tplc="100C0001" w:tentative="1">
+      <w:start w:val="1"/>
+      <w:numFmt w:val="bullet"/>
+      <w:lvlText w:val=""/>
+      <w:lvlJc w:val="left"/>
+      <w:pPr>
+        <w:ind w:left="5040" w:hanging="360"/>
+      </w:pPr>
+      <w:rPr>
+        <w:rFonts w:ascii="Symbol" w:hAnsi="Symbol" w:hint="default"/>
+      </w:rPr>
+    </w:lvl>
+    <w:lvl w:ilvl="7" w:tplc="100C0003" w:tentative="1">
+      <w:start w:val="1"/>
+      <w:numFmt w:val="bullet"/>
+      <w:lvlText w:val="o"/>
+      <w:lvlJc w:val="left"/>
+      <w:pPr>
+        <w:ind w:left="5760" w:hanging="360"/>
+      </w:pPr>
+      <w:rPr>
+        <w:rFonts w:ascii="Courier New" w:hAnsi="Courier New" w:cs="Courier New" w:hint="default"/>
+      </w:rPr>
+    </w:lvl>
+    <w:lvl w:ilvl="8" w:tplc="100C0005" w:tentative="1">
+      <w:start w:val="1"/>
+      <w:numFmt w:val="bullet"/>
+      <w:lvlText w:val=""/>
+      <w:lvlJc w:val="left"/>
+      <w:pPr>
+        <w:ind w:left="6480" w:hanging="360"/>
+      </w:pPr>
+      <w:rPr>
+        <w:rFonts w:ascii="Wingdings" w:hAnsi="Wingdings" w:hint="default"/>
+      </w:rPr>
+    </w:lvl>
+  </w:abstractNum>
+  <w:abstractNum w:abstractNumId="21" w15:restartNumberingAfterBreak="0">
     <w:nsid w:val="58CA7755"/>
     <w:multiLevelType w:val="multilevel"/>
     <w:tmpl w:val="7B5E39E0"/>
@@ -19885,7 +22759,7 @@
       </w:rPr>
     </w:lvl>
   </w:abstractNum>
-  <w:abstractNum w:abstractNumId="21" w15:restartNumberingAfterBreak="0">
+  <w:abstractNum w:abstractNumId="22" w15:restartNumberingAfterBreak="0">
     <w:nsid w:val="5B82507D"/>
     <w:multiLevelType w:val="multilevel"/>
     <w:tmpl w:val="271E196E"/>
@@ -20034,7 +22908,7 @@
       </w:rPr>
     </w:lvl>
   </w:abstractNum>
-  <w:abstractNum w:abstractNumId="22" w15:restartNumberingAfterBreak="0">
+  <w:abstractNum w:abstractNumId="23" w15:restartNumberingAfterBreak="0">
     <w:nsid w:val="5BEC32C4"/>
     <w:multiLevelType w:val="multilevel"/>
     <w:tmpl w:val="E05CE756"/>
@@ -20129,7 +23003,7 @@
       </w:pPr>
     </w:lvl>
   </w:abstractNum>
-  <w:abstractNum w:abstractNumId="23" w15:restartNumberingAfterBreak="0">
+  <w:abstractNum w:abstractNumId="24" w15:restartNumberingAfterBreak="0">
     <w:nsid w:val="5BFE797D"/>
     <w:multiLevelType w:val="multilevel"/>
     <w:tmpl w:val="DFFC82E4"/>
@@ -20278,7 +23152,7 @@
       </w:rPr>
     </w:lvl>
   </w:abstractNum>
-  <w:abstractNum w:abstractNumId="24" w15:restartNumberingAfterBreak="0">
+  <w:abstractNum w:abstractNumId="25" w15:restartNumberingAfterBreak="0">
     <w:nsid w:val="69F940C0"/>
     <w:multiLevelType w:val="hybridMultilevel"/>
     <w:tmpl w:val="E91A3006"/>
@@ -20395,16 +23269,16 @@
     <w:abstractNumId w:val="0"/>
   </w:num>
   <w:num w:numId="10" w16cid:durableId="124858710">
-    <w:abstractNumId w:val="22"/>
+    <w:abstractNumId w:val="23"/>
   </w:num>
   <w:num w:numId="11" w16cid:durableId="136925223">
-    <w:abstractNumId w:val="21"/>
+    <w:abstractNumId w:val="22"/>
   </w:num>
   <w:num w:numId="12" w16cid:durableId="2135438915">
     <w:abstractNumId w:val="15"/>
   </w:num>
   <w:num w:numId="13" w16cid:durableId="11342515">
-    <w:abstractNumId w:val="23"/>
+    <w:abstractNumId w:val="24"/>
   </w:num>
   <w:num w:numId="14" w16cid:durableId="248973769">
     <w:abstractNumId w:val="11"/>
@@ -20416,7 +23290,7 @@
     <w:abstractNumId w:val="14"/>
   </w:num>
   <w:num w:numId="17" w16cid:durableId="1404722623">
-    <w:abstractNumId w:val="20"/>
+    <w:abstractNumId w:val="21"/>
   </w:num>
   <w:num w:numId="18" w16cid:durableId="505825146">
     <w:abstractNumId w:val="17"/>
@@ -20437,10 +23311,13 @@
     <w:abstractNumId w:val="19"/>
   </w:num>
   <w:num w:numId="24" w16cid:durableId="1378624883">
-    <w:abstractNumId w:val="24"/>
+    <w:abstractNumId w:val="25"/>
   </w:num>
   <w:num w:numId="25" w16cid:durableId="126246467">
     <w:abstractNumId w:val="16"/>
+  </w:num>
+  <w:num w:numId="26" w16cid:durableId="1748452501">
+    <w:abstractNumId w:val="20"/>
   </w:num>
 </w:numbering>
 </file>

</xml_diff>

<commit_message>
doc: jdt and report update
</commit_message>
<xml_diff>
--- a/doc/TPI_Rapport_NapoleoneCyril.docx
+++ b/doc/TPI_Rapport_NapoleoneCyril.docx
@@ -3414,7 +3414,21 @@
         <w:rPr>
           <w:lang w:val="fr-CH"/>
         </w:rPr>
-        <w:t xml:space="preserve"> Laravel 12</w:t>
+        <w:t xml:space="preserve"> </w:t>
+      </w:r>
+      <w:proofErr w:type="spellStart"/>
+      <w:r>
+        <w:rPr>
+          <w:lang w:val="fr-CH"/>
+        </w:rPr>
+        <w:t>Laravel</w:t>
+      </w:r>
+      <w:proofErr w:type="spellEnd"/>
+      <w:r>
+        <w:rPr>
+          <w:lang w:val="fr-CH"/>
+        </w:rPr>
+        <w:t xml:space="preserve"> 12</w:t>
       </w:r>
       <w:r>
         <w:rPr>
@@ -6921,7 +6935,27 @@
                 <w:szCs w:val="18"/>
                 <w:lang w:val="fr-CH"/>
               </w:rPr>
-              <w:t xml:space="preserve">Docker / Laravel </w:t>
+              <w:t xml:space="preserve">Docker / </w:t>
+            </w:r>
+            <w:proofErr w:type="spellStart"/>
+            <w:r>
+              <w:rPr>
+                <w:rFonts w:asciiTheme="majorHAnsi" w:hAnsiTheme="majorHAnsi" w:cstheme="majorHAnsi"/>
+                <w:sz w:val="18"/>
+                <w:szCs w:val="18"/>
+                <w:lang w:val="fr-CH"/>
+              </w:rPr>
+              <w:t>Laravel</w:t>
+            </w:r>
+            <w:proofErr w:type="spellEnd"/>
+            <w:r>
+              <w:rPr>
+                <w:rFonts w:asciiTheme="majorHAnsi" w:hAnsiTheme="majorHAnsi" w:cstheme="majorHAnsi"/>
+                <w:sz w:val="18"/>
+                <w:szCs w:val="18"/>
+                <w:lang w:val="fr-CH"/>
+              </w:rPr>
+              <w:t xml:space="preserve"> </w:t>
             </w:r>
             <w:proofErr w:type="spellStart"/>
             <w:r>
@@ -11794,8 +11828,21 @@
                 <w:szCs w:val="20"/>
                 <w:lang w:val="fr-CH" w:eastAsia="fr-CH"/>
               </w:rPr>
-              <w:t xml:space="preserve"> et Laravel</w:t>
+              <w:t xml:space="preserve"> et </w:t>
             </w:r>
+            <w:proofErr w:type="spellStart"/>
+            <w:r>
+              <w:rPr>
+                <w:rFonts w:asciiTheme="majorHAnsi" w:eastAsia="Times New Roman" w:hAnsiTheme="majorHAnsi" w:cstheme="majorHAnsi"/>
+                <w:b w:val="0"/>
+                <w:bCs w:val="0"/>
+                <w:sz w:val="20"/>
+                <w:szCs w:val="20"/>
+                <w:lang w:val="fr-CH" w:eastAsia="fr-CH"/>
+              </w:rPr>
+              <w:t>Laravel</w:t>
+            </w:r>
+            <w:proofErr w:type="spellEnd"/>
           </w:p>
         </w:tc>
         <w:tc>
@@ -12546,7 +12593,27 @@
                 <w:szCs w:val="20"/>
                 <w:lang w:val="fr-CH" w:eastAsia="fr-CH"/>
               </w:rPr>
-              <w:t xml:space="preserve">Erreurs dû à des différences de variables d’env, </w:t>
+              <w:t>Erreurs dû à des différences de variables d’</w:t>
+            </w:r>
+            <w:proofErr w:type="spellStart"/>
+            <w:r>
+              <w:rPr>
+                <w:rFonts w:asciiTheme="majorHAnsi" w:eastAsia="Times New Roman" w:hAnsiTheme="majorHAnsi" w:cstheme="majorHAnsi"/>
+                <w:sz w:val="20"/>
+                <w:szCs w:val="20"/>
+                <w:lang w:val="fr-CH" w:eastAsia="fr-CH"/>
+              </w:rPr>
+              <w:t>env</w:t>
+            </w:r>
+            <w:proofErr w:type="spellEnd"/>
+            <w:r>
+              <w:rPr>
+                <w:rFonts w:asciiTheme="majorHAnsi" w:eastAsia="Times New Roman" w:hAnsiTheme="majorHAnsi" w:cstheme="majorHAnsi"/>
+                <w:sz w:val="20"/>
+                <w:szCs w:val="20"/>
+                <w:lang w:val="fr-CH" w:eastAsia="fr-CH"/>
+              </w:rPr>
+              <w:t xml:space="preserve">, </w:t>
             </w:r>
             <w:proofErr w:type="spellStart"/>
             <w:r>
@@ -14929,9 +14996,6 @@
       <w:pPr>
         <w:pStyle w:val="Lgende"/>
         <w:jc w:val="center"/>
-        <w:rPr>
-          <w:lang w:val="fr-CH"/>
-        </w:rPr>
       </w:pPr>
       <w:r>
         <w:t>MPD</w:t>
@@ -14939,231 +15003,22 @@
     </w:p>
     <w:p>
       <w:pPr>
-        <w:pStyle w:val="Titre3"/>
-        <w:rPr>
-          <w:lang w:val="fr-CH"/>
-        </w:rPr>
-      </w:pPr>
-      <w:r>
-        <w:rPr>
-          <w:lang w:val="fr-CH"/>
-        </w:rPr>
-        <w:t>Conception de l’API</w:t>
-      </w:r>
-    </w:p>
-    <w:p>
-      <w:pPr>
-        <w:rPr>
-          <w:color w:val="EE0000"/>
-          <w:lang w:val="fr-CH"/>
-        </w:rPr>
-      </w:pPr>
-      <w:r>
-        <w:rPr>
-          <w:color w:val="EE0000"/>
-          <w:lang w:val="fr-CH"/>
-        </w:rPr>
-        <w:t xml:space="preserve">*à remplir* (avec les listes de routes </w:t>
-      </w:r>
-      <w:proofErr w:type="spellStart"/>
-      <w:r>
-        <w:rPr>
-          <w:color w:val="EE0000"/>
-          <w:lang w:val="fr-CH"/>
-        </w:rPr>
-        <w:t>etc</w:t>
-      </w:r>
-      <w:proofErr w:type="spellEnd"/>
-      <w:r>
-        <w:rPr>
-          <w:color w:val="EE0000"/>
-          <w:lang w:val="fr-CH"/>
-        </w:rPr>
-        <w:t xml:space="preserve"> une fois sûr)</w:t>
-      </w:r>
-    </w:p>
-    <w:p>
-      <w:pPr>
-        <w:pStyle w:val="Titre3"/>
-        <w:rPr>
-          <w:lang w:val="fr-CH"/>
-        </w:rPr>
-      </w:pPr>
-      <w:r>
-        <w:rPr>
-          <w:lang w:val="fr-CH"/>
-        </w:rPr>
-        <w:t>Conception de l’interface utilisateur</w:t>
-      </w:r>
-    </w:p>
-    <w:p>
-      <w:pPr>
-        <w:rPr>
-          <w:lang w:val="fr-CH"/>
-        </w:rPr>
-      </w:pPr>
-      <w:r>
-        <w:rPr>
-          <w:lang w:val="fr-CH"/>
-        </w:rPr>
-        <w:t xml:space="preserve">Maquettes d’interface réalisées avec FIGMA, elles représentent et prévoient le futur affichage de l’application. Elles sont haute-fidélités en termes de structure </w:t>
-      </w:r>
-      <w:proofErr w:type="spellStart"/>
-      <w:r>
-        <w:rPr>
-          <w:lang w:val="fr-CH"/>
-        </w:rPr>
-        <w:t>etc</w:t>
-      </w:r>
-      <w:proofErr w:type="spellEnd"/>
-      <w:r>
-        <w:rPr>
-          <w:lang w:val="fr-CH"/>
-        </w:rPr>
-        <w:t xml:space="preserve">, mais sont moyenne/basses en termes de tailles exactes, contenu et détails comme </w:t>
-      </w:r>
-      <w:proofErr w:type="spellStart"/>
-      <w:r>
-        <w:rPr>
-          <w:lang w:val="fr-CH"/>
-        </w:rPr>
-        <w:t>icons</w:t>
-      </w:r>
-      <w:proofErr w:type="spellEnd"/>
-      <w:r>
-        <w:rPr>
-          <w:lang w:val="fr-CH"/>
-        </w:rPr>
-        <w:t xml:space="preserve"> etc...</w:t>
-      </w:r>
-    </w:p>
-    <w:p>
-      <w:pPr>
-        <w:rPr>
-          <w:lang w:val="fr-CH"/>
-        </w:rPr>
-      </w:pPr>
-      <w:r>
-        <w:rPr>
-          <w:lang w:val="fr-CH"/>
-        </w:rPr>
-        <w:t xml:space="preserve">Le lien FIGMA : </w:t>
-      </w:r>
-      <w:hyperlink r:id="rId14" w:history="1">
-        <w:r>
-          <w:rPr>
-            <w:rStyle w:val="Lienhypertexte"/>
-            <w:lang w:val="fr-CH"/>
-          </w:rPr>
-          <w:t>https://www.figma.com/design/bMsktNS29r9i1xJe26PwEE/GestionCitations?node-id=0-1&amp;t=Q1gtZoWngqbnM5CO-1</w:t>
-        </w:r>
-      </w:hyperlink>
-      <w:r>
-        <w:rPr>
-          <w:lang w:val="fr-CH"/>
-        </w:rPr>
-        <w:t xml:space="preserve"> Les liens prototype sont faits pour que la navigation soit </w:t>
-      </w:r>
-      <w:proofErr w:type="gramStart"/>
-      <w:r>
-        <w:rPr>
-          <w:lang w:val="fr-CH"/>
-        </w:rPr>
-        <w:t>fonctionnel</w:t>
-      </w:r>
-      <w:proofErr w:type="gramEnd"/>
-      <w:r>
-        <w:rPr>
-          <w:lang w:val="fr-CH"/>
-        </w:rPr>
-        <w:t xml:space="preserve"> lors du lancement du FIGMA via le bouton play en haut à droite.</w:t>
-      </w:r>
-    </w:p>
-    <w:p>
-      <w:pPr>
-        <w:rPr>
-          <w:lang w:val="fr-CH"/>
-        </w:rPr>
-      </w:pPr>
-      <w:r>
-        <w:rPr>
-          <w:lang w:val="fr-CH"/>
-        </w:rPr>
-        <w:t>L’interface est organisée avec une sidebar fixe à gauche</w:t>
-      </w:r>
-      <w:r>
-        <w:rPr>
-          <w:lang w:val="fr-CH"/>
-        </w:rPr>
-        <w:t xml:space="preserve"> qui permet de naviguer entre les pages principales de manière simple et directe.</w:t>
-      </w:r>
-    </w:p>
-    <w:p>
-      <w:pPr>
-        <w:rPr>
-          <w:lang w:val="fr-CH"/>
-        </w:rPr>
-      </w:pPr>
-      <w:r>
-        <w:rPr>
+        <w:jc w:val="center"/>
+        <w:rPr>
+          <w:lang w:val="fr-CH"/>
+        </w:rPr>
+      </w:pPr>
+      <w:r>
+        <w:rPr>
+          <w:noProof/>
           <w:lang w:val="fr-CH"/>
         </w:rPr>
         <w:lastRenderedPageBreak/>
-        <w:t xml:space="preserve">Les contenus sont principalement affichés sous forme de cartes. La page d’administration </w:t>
-      </w:r>
-      <w:r>
-        <w:rPr>
-          <w:lang w:val="fr-CH"/>
-        </w:rPr>
-        <w:t xml:space="preserve">elle </w:t>
-      </w:r>
-      <w:r>
-        <w:rPr>
-          <w:lang w:val="fr-CH"/>
-        </w:rPr>
-        <w:t xml:space="preserve">utilise des tableaux, </w:t>
-      </w:r>
-      <w:r>
-        <w:rPr>
-          <w:lang w:val="fr-CH"/>
-        </w:rPr>
-        <w:t>parce que</w:t>
-      </w:r>
-      <w:r>
-        <w:rPr>
-          <w:lang w:val="fr-CH"/>
-        </w:rPr>
-        <w:t xml:space="preserve"> ce format est plus adapté pour gérer </w:t>
-      </w:r>
-      <w:r>
-        <w:rPr>
-          <w:lang w:val="fr-CH"/>
-        </w:rPr>
-        <w:t xml:space="preserve">plus de contenu </w:t>
-      </w:r>
-      <w:r>
-        <w:rPr>
-          <w:lang w:val="fr-CH"/>
-        </w:rPr>
-        <w:t>de manière structurée.</w:t>
-      </w:r>
-    </w:p>
-    <w:p>
-      <w:pPr>
-        <w:rPr>
-          <w:lang w:val="fr-CH"/>
-        </w:rPr>
-      </w:pPr>
-      <w:r>
-        <w:rPr>
-          <w:noProof/>
-          <w:lang w:val="fr-CH"/>
-        </w:rPr>
         <w:drawing>
-          <wp:inline distT="0" distB="0" distL="0" distR="0" wp14:anchorId="0CF90696" wp14:editId="3148D6E6">
-            <wp:extent cx="5975350" cy="3881120"/>
-            <wp:effectExtent l="0" t="0" r="6350" b="5080"/>
-            <wp:docPr id="72532459" name="Image 9"/>
+          <wp:inline distT="0" distB="0" distL="0" distR="0" wp14:anchorId="791B1C47" wp14:editId="644E7902">
+            <wp:extent cx="3739117" cy="4637539"/>
+            <wp:effectExtent l="152400" t="152400" r="356870" b="353695"/>
+            <wp:docPr id="1189068671" name="Image 2"/>
             <wp:cNvGraphicFramePr>
               <a:graphicFrameLocks xmlns:a="http://schemas.openxmlformats.org/drawingml/2006/main" noChangeAspect="1"/>
             </wp:cNvGraphicFramePr>
@@ -15171,13 +15026,13 @@
               <a:graphicData uri="http://schemas.openxmlformats.org/drawingml/2006/picture">
                 <pic:pic xmlns:pic="http://schemas.openxmlformats.org/drawingml/2006/picture">
                   <pic:nvPicPr>
-                    <pic:cNvPr id="0" name="Picture 9"/>
+                    <pic:cNvPr id="0" name="Picture 2"/>
                     <pic:cNvPicPr>
                       <a:picLocks noChangeAspect="1" noChangeArrowheads="1"/>
                     </pic:cNvPicPr>
                   </pic:nvPicPr>
                   <pic:blipFill>
-                    <a:blip r:embed="rId15">
+                    <a:blip r:embed="rId14">
                       <a:extLst>
                         <a:ext uri="{28A0092B-C50C-407E-A947-70E740481C1C}">
                           <a14:useLocalDpi xmlns:a14="http://schemas.microsoft.com/office/drawing/2010/main" val="0"/>
@@ -15192,15 +15047,21 @@
                   <pic:spPr bwMode="auto">
                     <a:xfrm>
                       <a:off x="0" y="0"/>
-                      <a:ext cx="5975350" cy="3881120"/>
+                      <a:ext cx="3753025" cy="4654789"/>
                     </a:xfrm>
                     <a:prstGeom prst="rect">
                       <a:avLst/>
                     </a:prstGeom>
-                    <a:noFill/>
                     <a:ln>
                       <a:noFill/>
                     </a:ln>
+                    <a:effectLst>
+                      <a:outerShdw blurRad="292100" dist="139700" dir="2700000" algn="tl" rotWithShape="0">
+                        <a:srgbClr val="333333">
+                          <a:alpha val="65000"/>
+                        </a:srgbClr>
+                      </a:outerShdw>
+                    </a:effectLst>
                   </pic:spPr>
                 </pic:pic>
               </a:graphicData>
@@ -15215,16 +15076,248 @@
           <w:lang w:val="fr-CH"/>
         </w:rPr>
       </w:pPr>
+    </w:p>
+    <w:p>
+      <w:pPr>
+        <w:pStyle w:val="Titre3"/>
+        <w:rPr>
+          <w:lang w:val="fr-CH"/>
+        </w:rPr>
+      </w:pPr>
+      <w:r>
+        <w:rPr>
+          <w:lang w:val="fr-CH"/>
+        </w:rPr>
+        <w:t>Conception de l’API</w:t>
+      </w:r>
+    </w:p>
+    <w:p>
+      <w:pPr>
+        <w:rPr>
+          <w:color w:val="EE0000"/>
+          <w:lang w:val="fr-CH"/>
+        </w:rPr>
+      </w:pPr>
+      <w:r>
+        <w:rPr>
+          <w:color w:val="EE0000"/>
+          <w:lang w:val="fr-CH"/>
+        </w:rPr>
+        <w:t xml:space="preserve">*à remplir* (avec les listes de routes </w:t>
+      </w:r>
+      <w:proofErr w:type="spellStart"/>
+      <w:r>
+        <w:rPr>
+          <w:color w:val="EE0000"/>
+          <w:lang w:val="fr-CH"/>
+        </w:rPr>
+        <w:t>etc</w:t>
+      </w:r>
+      <w:proofErr w:type="spellEnd"/>
+      <w:r>
+        <w:rPr>
+          <w:color w:val="EE0000"/>
+          <w:lang w:val="fr-CH"/>
+        </w:rPr>
+        <w:t xml:space="preserve"> une fois sûr)</w:t>
+      </w:r>
+    </w:p>
+    <w:p>
+      <w:pPr>
+        <w:pStyle w:val="Titre3"/>
+        <w:rPr>
+          <w:lang w:val="fr-CH"/>
+        </w:rPr>
+      </w:pPr>
+      <w:r>
+        <w:rPr>
+          <w:lang w:val="fr-CH"/>
+        </w:rPr>
+        <w:t>Conception de l’interface utilisateur</w:t>
+      </w:r>
+    </w:p>
+    <w:p>
+      <w:pPr>
+        <w:rPr>
+          <w:lang w:val="fr-CH"/>
+        </w:rPr>
+      </w:pPr>
+      <w:r>
+        <w:rPr>
+          <w:lang w:val="fr-CH"/>
+        </w:rPr>
+        <w:t xml:space="preserve">Maquettes d’interface réalisées avec FIGMA, elles représentent et prévoient le futur affichage de l’application. Elles sont haute-fidélités en termes de structure </w:t>
+      </w:r>
+      <w:proofErr w:type="spellStart"/>
+      <w:r>
+        <w:rPr>
+          <w:lang w:val="fr-CH"/>
+        </w:rPr>
+        <w:t>etc</w:t>
+      </w:r>
+      <w:proofErr w:type="spellEnd"/>
+      <w:r>
+        <w:rPr>
+          <w:lang w:val="fr-CH"/>
+        </w:rPr>
+        <w:t xml:space="preserve">, mais sont moyenne/basses en termes de tailles exactes, contenu et détails comme </w:t>
+      </w:r>
+      <w:proofErr w:type="spellStart"/>
+      <w:r>
+        <w:rPr>
+          <w:lang w:val="fr-CH"/>
+        </w:rPr>
+        <w:t>icons</w:t>
+      </w:r>
+      <w:proofErr w:type="spellEnd"/>
+      <w:r>
+        <w:rPr>
+          <w:lang w:val="fr-CH"/>
+        </w:rPr>
+        <w:t xml:space="preserve"> etc...</w:t>
+      </w:r>
+    </w:p>
+    <w:p>
+      <w:pPr>
+        <w:rPr>
+          <w:lang w:val="fr-CH"/>
+        </w:rPr>
+      </w:pPr>
+      <w:r>
+        <w:rPr>
+          <w:lang w:val="fr-CH"/>
+        </w:rPr>
+        <w:t xml:space="preserve">Le lien FIGMA : </w:t>
+      </w:r>
+      <w:hyperlink r:id="rId15" w:history="1">
+        <w:r>
+          <w:rPr>
+            <w:rStyle w:val="Lienhypertexte"/>
+            <w:lang w:val="fr-CH"/>
+          </w:rPr>
+          <w:t>https://www.figma.com/design/bMsktNS29r9i1xJe26PwEE/GestionCitations?node-id=0-1&amp;t=Q1gtZoWngqbnM5CO-1</w:t>
+        </w:r>
+      </w:hyperlink>
+      <w:r>
+        <w:rPr>
+          <w:lang w:val="fr-CH"/>
+        </w:rPr>
+        <w:t xml:space="preserve"> Les liens prototype sont faits pour que la navigation soit </w:t>
+      </w:r>
+      <w:proofErr w:type="gramStart"/>
+      <w:r>
+        <w:rPr>
+          <w:lang w:val="fr-CH"/>
+        </w:rPr>
+        <w:t>fonctionnel</w:t>
+      </w:r>
+      <w:proofErr w:type="gramEnd"/>
+      <w:r>
+        <w:rPr>
+          <w:lang w:val="fr-CH"/>
+        </w:rPr>
+        <w:t xml:space="preserve"> lors du lancement du FIGMA via le bouton </w:t>
+      </w:r>
+      <w:proofErr w:type="spellStart"/>
+      <w:r>
+        <w:rPr>
+          <w:lang w:val="fr-CH"/>
+        </w:rPr>
+        <w:t>play</w:t>
+      </w:r>
+      <w:proofErr w:type="spellEnd"/>
+      <w:r>
+        <w:rPr>
+          <w:lang w:val="fr-CH"/>
+        </w:rPr>
+        <w:t xml:space="preserve"> en haut à droite.</w:t>
+      </w:r>
+    </w:p>
+    <w:p>
+      <w:pPr>
+        <w:rPr>
+          <w:lang w:val="fr-CH"/>
+        </w:rPr>
+      </w:pPr>
+      <w:r>
+        <w:rPr>
+          <w:lang w:val="fr-CH"/>
+        </w:rPr>
+        <w:t>L’interface est organisée avec une sidebar fixe à gauche</w:t>
+      </w:r>
+      <w:r>
+        <w:rPr>
+          <w:lang w:val="fr-CH"/>
+        </w:rPr>
+        <w:t xml:space="preserve"> qui permet de naviguer entre les pages principales de manière simple et directe.</w:t>
+      </w:r>
+    </w:p>
+    <w:p>
+      <w:pPr>
+        <w:rPr>
+          <w:lang w:val="fr-CH"/>
+        </w:rPr>
+      </w:pPr>
+      <w:r>
+        <w:rPr>
+          <w:lang w:val="fr-CH"/>
+        </w:rPr>
+        <w:lastRenderedPageBreak/>
+        <w:t xml:space="preserve">Les contenus sont principalement affichés sous forme de cartes. La page d’administration </w:t>
+      </w:r>
+      <w:r>
+        <w:rPr>
+          <w:lang w:val="fr-CH"/>
+        </w:rPr>
+        <w:t xml:space="preserve">elle </w:t>
+      </w:r>
+      <w:r>
+        <w:rPr>
+          <w:lang w:val="fr-CH"/>
+        </w:rPr>
+        <w:t xml:space="preserve">utilise des tableaux, </w:t>
+      </w:r>
+      <w:r>
+        <w:rPr>
+          <w:lang w:val="fr-CH"/>
+        </w:rPr>
+        <w:t>parce que</w:t>
+      </w:r>
+      <w:r>
+        <w:rPr>
+          <w:lang w:val="fr-CH"/>
+        </w:rPr>
+        <w:t xml:space="preserve"> ce format est plus adapté pour gérer </w:t>
+      </w:r>
+      <w:r>
+        <w:rPr>
+          <w:lang w:val="fr-CH"/>
+        </w:rPr>
+        <w:t xml:space="preserve">plus de contenu </w:t>
+      </w:r>
+      <w:r>
+        <w:rPr>
+          <w:lang w:val="fr-CH"/>
+        </w:rPr>
+        <w:t>de manière structurée.</w:t>
+      </w:r>
+    </w:p>
+    <w:p>
+      <w:pPr>
+        <w:rPr>
+          <w:lang w:val="fr-CH"/>
+        </w:rPr>
+      </w:pPr>
       <w:r>
         <w:rPr>
           <w:noProof/>
           <w:lang w:val="fr-CH"/>
         </w:rPr>
         <w:drawing>
-          <wp:inline distT="0" distB="0" distL="0" distR="0" wp14:anchorId="4AAE373D" wp14:editId="377712A2">
+          <wp:inline distT="0" distB="0" distL="0" distR="0" wp14:anchorId="0CF90696" wp14:editId="3148D6E6">
             <wp:extent cx="5975350" cy="3881120"/>
             <wp:effectExtent l="0" t="0" r="6350" b="5080"/>
-            <wp:docPr id="1569502151" name="Image 10"/>
+            <wp:docPr id="72532459" name="Image 9"/>
             <wp:cNvGraphicFramePr>
               <a:graphicFrameLocks xmlns:a="http://schemas.openxmlformats.org/drawingml/2006/main" noChangeAspect="1"/>
             </wp:cNvGraphicFramePr>
@@ -15232,7 +15325,7 @@
               <a:graphicData uri="http://schemas.openxmlformats.org/drawingml/2006/picture">
                 <pic:pic xmlns:pic="http://schemas.openxmlformats.org/drawingml/2006/picture">
                   <pic:nvPicPr>
-                    <pic:cNvPr id="0" name="Picture 10"/>
+                    <pic:cNvPr id="0" name="Picture 9"/>
                     <pic:cNvPicPr>
                       <a:picLocks noChangeAspect="1" noChangeArrowheads="1"/>
                     </pic:cNvPicPr>
@@ -15276,23 +15369,16 @@
           <w:lang w:val="fr-CH"/>
         </w:rPr>
       </w:pPr>
-    </w:p>
-    <w:p>
-      <w:pPr>
-        <w:rPr>
-          <w:lang w:val="fr-CH"/>
-        </w:rPr>
-      </w:pPr>
       <w:r>
         <w:rPr>
           <w:noProof/>
           <w:lang w:val="fr-CH"/>
         </w:rPr>
         <w:drawing>
-          <wp:inline distT="0" distB="0" distL="0" distR="0" wp14:anchorId="76A459ED" wp14:editId="44349085">
+          <wp:inline distT="0" distB="0" distL="0" distR="0" wp14:anchorId="4AAE373D" wp14:editId="377712A2">
             <wp:extent cx="5975350" cy="3881120"/>
             <wp:effectExtent l="0" t="0" r="6350" b="5080"/>
-            <wp:docPr id="1781225564" name="Image 11"/>
+            <wp:docPr id="1569502151" name="Image 10"/>
             <wp:cNvGraphicFramePr>
               <a:graphicFrameLocks xmlns:a="http://schemas.openxmlformats.org/drawingml/2006/main" noChangeAspect="1"/>
             </wp:cNvGraphicFramePr>
@@ -15300,7 +15386,7 @@
               <a:graphicData uri="http://schemas.openxmlformats.org/drawingml/2006/picture">
                 <pic:pic xmlns:pic="http://schemas.openxmlformats.org/drawingml/2006/picture">
                   <pic:nvPicPr>
-                    <pic:cNvPr id="0" name="Picture 11"/>
+                    <pic:cNvPr id="0" name="Picture 10"/>
                     <pic:cNvPicPr>
                       <a:picLocks noChangeAspect="1" noChangeArrowheads="1"/>
                     </pic:cNvPicPr>
@@ -15344,16 +15430,23 @@
           <w:lang w:val="fr-CH"/>
         </w:rPr>
       </w:pPr>
+    </w:p>
+    <w:p>
+      <w:pPr>
+        <w:rPr>
+          <w:lang w:val="fr-CH"/>
+        </w:rPr>
+      </w:pPr>
       <w:r>
         <w:rPr>
           <w:noProof/>
           <w:lang w:val="fr-CH"/>
         </w:rPr>
         <w:drawing>
-          <wp:inline distT="0" distB="0" distL="0" distR="0" wp14:anchorId="766028CF" wp14:editId="044241B7">
+          <wp:inline distT="0" distB="0" distL="0" distR="0" wp14:anchorId="76A459ED" wp14:editId="44349085">
             <wp:extent cx="5975350" cy="3881120"/>
             <wp:effectExtent l="0" t="0" r="6350" b="5080"/>
-            <wp:docPr id="1108423956" name="Image 12"/>
+            <wp:docPr id="1781225564" name="Image 11"/>
             <wp:cNvGraphicFramePr>
               <a:graphicFrameLocks xmlns:a="http://schemas.openxmlformats.org/drawingml/2006/main" noChangeAspect="1"/>
             </wp:cNvGraphicFramePr>
@@ -15361,7 +15454,7 @@
               <a:graphicData uri="http://schemas.openxmlformats.org/drawingml/2006/picture">
                 <pic:pic xmlns:pic="http://schemas.openxmlformats.org/drawingml/2006/picture">
                   <pic:nvPicPr>
-                    <pic:cNvPr id="0" name="Picture 12"/>
+                    <pic:cNvPr id="0" name="Picture 11"/>
                     <pic:cNvPicPr>
                       <a:picLocks noChangeAspect="1" noChangeArrowheads="1"/>
                     </pic:cNvPicPr>
@@ -15410,12 +15503,11 @@
           <w:noProof/>
           <w:lang w:val="fr-CH"/>
         </w:rPr>
-        <w:lastRenderedPageBreak/>
         <w:drawing>
-          <wp:inline distT="0" distB="0" distL="0" distR="0" wp14:anchorId="5BE3BB12" wp14:editId="3DB90104">
+          <wp:inline distT="0" distB="0" distL="0" distR="0" wp14:anchorId="766028CF" wp14:editId="044241B7">
             <wp:extent cx="5975350" cy="3881120"/>
             <wp:effectExtent l="0" t="0" r="6350" b="5080"/>
-            <wp:docPr id="1703553625" name="Image 13"/>
+            <wp:docPr id="1108423956" name="Image 12"/>
             <wp:cNvGraphicFramePr>
               <a:graphicFrameLocks xmlns:a="http://schemas.openxmlformats.org/drawingml/2006/main" noChangeAspect="1"/>
             </wp:cNvGraphicFramePr>
@@ -15423,7 +15515,7 @@
               <a:graphicData uri="http://schemas.openxmlformats.org/drawingml/2006/picture">
                 <pic:pic xmlns:pic="http://schemas.openxmlformats.org/drawingml/2006/picture">
                   <pic:nvPicPr>
-                    <pic:cNvPr id="0" name="Picture 13"/>
+                    <pic:cNvPr id="0" name="Picture 12"/>
                     <pic:cNvPicPr>
                       <a:picLocks noChangeAspect="1" noChangeArrowheads="1"/>
                     </pic:cNvPicPr>
@@ -15472,11 +15564,12 @@
           <w:noProof/>
           <w:lang w:val="fr-CH"/>
         </w:rPr>
+        <w:lastRenderedPageBreak/>
         <w:drawing>
-          <wp:inline distT="0" distB="0" distL="0" distR="0" wp14:anchorId="0D14CFA8" wp14:editId="27B8AC4C">
+          <wp:inline distT="0" distB="0" distL="0" distR="0" wp14:anchorId="5BE3BB12" wp14:editId="3DB90104">
             <wp:extent cx="5975350" cy="3881120"/>
             <wp:effectExtent l="0" t="0" r="6350" b="5080"/>
-            <wp:docPr id="295518992" name="Image 14"/>
+            <wp:docPr id="1703553625" name="Image 13"/>
             <wp:cNvGraphicFramePr>
               <a:graphicFrameLocks xmlns:a="http://schemas.openxmlformats.org/drawingml/2006/main" noChangeAspect="1"/>
             </wp:cNvGraphicFramePr>
@@ -15484,7 +15577,7 @@
               <a:graphicData uri="http://schemas.openxmlformats.org/drawingml/2006/picture">
                 <pic:pic xmlns:pic="http://schemas.openxmlformats.org/drawingml/2006/picture">
                   <pic:nvPicPr>
-                    <pic:cNvPr id="0" name="Picture 14"/>
+                    <pic:cNvPr id="0" name="Picture 13"/>
                     <pic:cNvPicPr>
                       <a:picLocks noChangeAspect="1" noChangeArrowheads="1"/>
                     </pic:cNvPicPr>
@@ -15533,12 +15626,11 @@
           <w:noProof/>
           <w:lang w:val="fr-CH"/>
         </w:rPr>
-        <w:lastRenderedPageBreak/>
         <w:drawing>
-          <wp:inline distT="0" distB="0" distL="0" distR="0" wp14:anchorId="09C7389B" wp14:editId="5F18C0D7">
+          <wp:inline distT="0" distB="0" distL="0" distR="0" wp14:anchorId="0D14CFA8" wp14:editId="27B8AC4C">
             <wp:extent cx="5975350" cy="3881120"/>
             <wp:effectExtent l="0" t="0" r="6350" b="5080"/>
-            <wp:docPr id="1370764955" name="Image 15"/>
+            <wp:docPr id="295518992" name="Image 14"/>
             <wp:cNvGraphicFramePr>
               <a:graphicFrameLocks xmlns:a="http://schemas.openxmlformats.org/drawingml/2006/main" noChangeAspect="1"/>
             </wp:cNvGraphicFramePr>
@@ -15546,7 +15638,7 @@
               <a:graphicData uri="http://schemas.openxmlformats.org/drawingml/2006/picture">
                 <pic:pic xmlns:pic="http://schemas.openxmlformats.org/drawingml/2006/picture">
                   <pic:nvPicPr>
-                    <pic:cNvPr id="0" name="Picture 15"/>
+                    <pic:cNvPr id="0" name="Picture 14"/>
                     <pic:cNvPicPr>
                       <a:picLocks noChangeAspect="1" noChangeArrowheads="1"/>
                     </pic:cNvPicPr>
@@ -15595,11 +15687,12 @@
           <w:noProof/>
           <w:lang w:val="fr-CH"/>
         </w:rPr>
+        <w:lastRenderedPageBreak/>
         <w:drawing>
-          <wp:inline distT="0" distB="0" distL="0" distR="0" wp14:anchorId="6EC4BDB6" wp14:editId="385B11C3">
+          <wp:inline distT="0" distB="0" distL="0" distR="0" wp14:anchorId="09C7389B" wp14:editId="5F18C0D7">
             <wp:extent cx="5975350" cy="3881120"/>
             <wp:effectExtent l="0" t="0" r="6350" b="5080"/>
-            <wp:docPr id="625238267" name="Image 17"/>
+            <wp:docPr id="1370764955" name="Image 15"/>
             <wp:cNvGraphicFramePr>
               <a:graphicFrameLocks xmlns:a="http://schemas.openxmlformats.org/drawingml/2006/main" noChangeAspect="1"/>
             </wp:cNvGraphicFramePr>
@@ -15607,7 +15700,7 @@
               <a:graphicData uri="http://schemas.openxmlformats.org/drawingml/2006/picture">
                 <pic:pic xmlns:pic="http://schemas.openxmlformats.org/drawingml/2006/picture">
                   <pic:nvPicPr>
-                    <pic:cNvPr id="0" name="Picture 17"/>
+                    <pic:cNvPr id="0" name="Picture 15"/>
                     <pic:cNvPicPr>
                       <a:picLocks noChangeAspect="1" noChangeArrowheads="1"/>
                     </pic:cNvPicPr>
@@ -15656,12 +15749,11 @@
           <w:noProof/>
           <w:lang w:val="fr-CH"/>
         </w:rPr>
-        <w:lastRenderedPageBreak/>
         <w:drawing>
-          <wp:inline distT="0" distB="0" distL="0" distR="0" wp14:anchorId="79B58BF6" wp14:editId="5DA0A93D">
+          <wp:inline distT="0" distB="0" distL="0" distR="0" wp14:anchorId="6EC4BDB6" wp14:editId="385B11C3">
             <wp:extent cx="5975350" cy="3881120"/>
             <wp:effectExtent l="0" t="0" r="6350" b="5080"/>
-            <wp:docPr id="225181397" name="Image 18"/>
+            <wp:docPr id="625238267" name="Image 17"/>
             <wp:cNvGraphicFramePr>
               <a:graphicFrameLocks xmlns:a="http://schemas.openxmlformats.org/drawingml/2006/main" noChangeAspect="1"/>
             </wp:cNvGraphicFramePr>
@@ -15669,7 +15761,7 @@
               <a:graphicData uri="http://schemas.openxmlformats.org/drawingml/2006/picture">
                 <pic:pic xmlns:pic="http://schemas.openxmlformats.org/drawingml/2006/picture">
                   <pic:nvPicPr>
-                    <pic:cNvPr id="0" name="Picture 18"/>
+                    <pic:cNvPr id="0" name="Picture 17"/>
                     <pic:cNvPicPr>
                       <a:picLocks noChangeAspect="1" noChangeArrowheads="1"/>
                     </pic:cNvPicPr>
@@ -15718,11 +15810,12 @@
           <w:noProof/>
           <w:lang w:val="fr-CH"/>
         </w:rPr>
+        <w:lastRenderedPageBreak/>
         <w:drawing>
-          <wp:inline distT="0" distB="0" distL="0" distR="0" wp14:anchorId="05F648BE" wp14:editId="488EE15B">
+          <wp:inline distT="0" distB="0" distL="0" distR="0" wp14:anchorId="79B58BF6" wp14:editId="5DA0A93D">
             <wp:extent cx="5975350" cy="3881120"/>
             <wp:effectExtent l="0" t="0" r="6350" b="5080"/>
-            <wp:docPr id="1026109734" name="Image 19"/>
+            <wp:docPr id="225181397" name="Image 18"/>
             <wp:cNvGraphicFramePr>
               <a:graphicFrameLocks xmlns:a="http://schemas.openxmlformats.org/drawingml/2006/main" noChangeAspect="1"/>
             </wp:cNvGraphicFramePr>
@@ -15730,7 +15823,7 @@
               <a:graphicData uri="http://schemas.openxmlformats.org/drawingml/2006/picture">
                 <pic:pic xmlns:pic="http://schemas.openxmlformats.org/drawingml/2006/picture">
                   <pic:nvPicPr>
-                    <pic:cNvPr id="0" name="Picture 19"/>
+                    <pic:cNvPr id="0" name="Picture 18"/>
                     <pic:cNvPicPr>
                       <a:picLocks noChangeAspect="1" noChangeArrowheads="1"/>
                     </pic:cNvPicPr>
@@ -15779,12 +15872,11 @@
           <w:noProof/>
           <w:lang w:val="fr-CH"/>
         </w:rPr>
-        <w:lastRenderedPageBreak/>
         <w:drawing>
-          <wp:inline distT="0" distB="0" distL="0" distR="0" wp14:anchorId="30C8D115" wp14:editId="779988FD">
+          <wp:inline distT="0" distB="0" distL="0" distR="0" wp14:anchorId="05F648BE" wp14:editId="488EE15B">
             <wp:extent cx="5975350" cy="3881120"/>
             <wp:effectExtent l="0" t="0" r="6350" b="5080"/>
-            <wp:docPr id="2025492390" name="Image 20"/>
+            <wp:docPr id="1026109734" name="Image 19"/>
             <wp:cNvGraphicFramePr>
               <a:graphicFrameLocks xmlns:a="http://schemas.openxmlformats.org/drawingml/2006/main" noChangeAspect="1"/>
             </wp:cNvGraphicFramePr>
@@ -15792,7 +15884,7 @@
               <a:graphicData uri="http://schemas.openxmlformats.org/drawingml/2006/picture">
                 <pic:pic xmlns:pic="http://schemas.openxmlformats.org/drawingml/2006/picture">
                   <pic:nvPicPr>
-                    <pic:cNvPr id="0" name="Picture 20"/>
+                    <pic:cNvPr id="0" name="Picture 19"/>
                     <pic:cNvPicPr>
                       <a:picLocks noChangeAspect="1" noChangeArrowheads="1"/>
                     </pic:cNvPicPr>
@@ -15832,7 +15924,6 @@
     </w:p>
     <w:p>
       <w:pPr>
-        <w:pStyle w:val="Guidage"/>
         <w:rPr>
           <w:lang w:val="fr-CH"/>
         </w:rPr>
@@ -15842,11 +15933,12 @@
           <w:noProof/>
           <w:lang w:val="fr-CH"/>
         </w:rPr>
+        <w:lastRenderedPageBreak/>
         <w:drawing>
-          <wp:inline distT="0" distB="0" distL="0" distR="0" wp14:anchorId="11FD416D" wp14:editId="71C39CF7">
+          <wp:inline distT="0" distB="0" distL="0" distR="0" wp14:anchorId="30C8D115" wp14:editId="779988FD">
             <wp:extent cx="5975350" cy="3881120"/>
             <wp:effectExtent l="0" t="0" r="6350" b="5080"/>
-            <wp:docPr id="1243421028" name="Image 21"/>
+            <wp:docPr id="2025492390" name="Image 20"/>
             <wp:cNvGraphicFramePr>
               <a:graphicFrameLocks xmlns:a="http://schemas.openxmlformats.org/drawingml/2006/main" noChangeAspect="1"/>
             </wp:cNvGraphicFramePr>
@@ -15854,7 +15946,7 @@
               <a:graphicData uri="http://schemas.openxmlformats.org/drawingml/2006/picture">
                 <pic:pic xmlns:pic="http://schemas.openxmlformats.org/drawingml/2006/picture">
                   <pic:nvPicPr>
-                    <pic:cNvPr id="0" name="Picture 21"/>
+                    <pic:cNvPr id="0" name="Picture 20"/>
                     <pic:cNvPicPr>
                       <a:picLocks noChangeAspect="1" noChangeArrowheads="1"/>
                     </pic:cNvPicPr>
@@ -15904,12 +15996,11 @@
           <w:noProof/>
           <w:lang w:val="fr-CH"/>
         </w:rPr>
-        <w:lastRenderedPageBreak/>
         <w:drawing>
-          <wp:inline distT="0" distB="0" distL="0" distR="0" wp14:anchorId="24021C07" wp14:editId="6DF43A8E">
+          <wp:inline distT="0" distB="0" distL="0" distR="0" wp14:anchorId="11FD416D" wp14:editId="71C39CF7">
             <wp:extent cx="5975350" cy="3881120"/>
             <wp:effectExtent l="0" t="0" r="6350" b="5080"/>
-            <wp:docPr id="1340019628" name="Image 22"/>
+            <wp:docPr id="1243421028" name="Image 21"/>
             <wp:cNvGraphicFramePr>
               <a:graphicFrameLocks xmlns:a="http://schemas.openxmlformats.org/drawingml/2006/main" noChangeAspect="1"/>
             </wp:cNvGraphicFramePr>
@@ -15917,7 +16008,7 @@
               <a:graphicData uri="http://schemas.openxmlformats.org/drawingml/2006/picture">
                 <pic:pic xmlns:pic="http://schemas.openxmlformats.org/drawingml/2006/picture">
                   <pic:nvPicPr>
-                    <pic:cNvPr id="0" name="Picture 22"/>
+                    <pic:cNvPr id="0" name="Picture 21"/>
                     <pic:cNvPicPr>
                       <a:picLocks noChangeAspect="1" noChangeArrowheads="1"/>
                     </pic:cNvPicPr>
@@ -15957,6 +16048,69 @@
     </w:p>
     <w:p>
       <w:pPr>
+        <w:pStyle w:val="Guidage"/>
+        <w:rPr>
+          <w:lang w:val="fr-CH"/>
+        </w:rPr>
+      </w:pPr>
+      <w:r>
+        <w:rPr>
+          <w:noProof/>
+          <w:lang w:val="fr-CH"/>
+        </w:rPr>
+        <w:lastRenderedPageBreak/>
+        <w:drawing>
+          <wp:inline distT="0" distB="0" distL="0" distR="0" wp14:anchorId="24021C07" wp14:editId="6DF43A8E">
+            <wp:extent cx="5975350" cy="3881120"/>
+            <wp:effectExtent l="0" t="0" r="6350" b="5080"/>
+            <wp:docPr id="1340019628" name="Image 22"/>
+            <wp:cNvGraphicFramePr>
+              <a:graphicFrameLocks xmlns:a="http://schemas.openxmlformats.org/drawingml/2006/main" noChangeAspect="1"/>
+            </wp:cNvGraphicFramePr>
+            <a:graphic xmlns:a="http://schemas.openxmlformats.org/drawingml/2006/main">
+              <a:graphicData uri="http://schemas.openxmlformats.org/drawingml/2006/picture">
+                <pic:pic xmlns:pic="http://schemas.openxmlformats.org/drawingml/2006/picture">
+                  <pic:nvPicPr>
+                    <pic:cNvPr id="0" name="Picture 22"/>
+                    <pic:cNvPicPr>
+                      <a:picLocks noChangeAspect="1" noChangeArrowheads="1"/>
+                    </pic:cNvPicPr>
+                  </pic:nvPicPr>
+                  <pic:blipFill>
+                    <a:blip r:embed="rId28">
+                      <a:extLst>
+                        <a:ext uri="{28A0092B-C50C-407E-A947-70E740481C1C}">
+                          <a14:useLocalDpi xmlns:a14="http://schemas.microsoft.com/office/drawing/2010/main" val="0"/>
+                        </a:ext>
+                      </a:extLst>
+                    </a:blip>
+                    <a:srcRect/>
+                    <a:stretch>
+                      <a:fillRect/>
+                    </a:stretch>
+                  </pic:blipFill>
+                  <pic:spPr bwMode="auto">
+                    <a:xfrm>
+                      <a:off x="0" y="0"/>
+                      <a:ext cx="5975350" cy="3881120"/>
+                    </a:xfrm>
+                    <a:prstGeom prst="rect">
+                      <a:avLst/>
+                    </a:prstGeom>
+                    <a:noFill/>
+                    <a:ln>
+                      <a:noFill/>
+                    </a:ln>
+                  </pic:spPr>
+                </pic:pic>
+              </a:graphicData>
+            </a:graphic>
+          </wp:inline>
+        </w:drawing>
+      </w:r>
+    </w:p>
+    <w:p>
+      <w:pPr>
         <w:pStyle w:val="Titre3"/>
         <w:rPr>
           <w:lang w:val="fr-CH"/>
@@ -15999,7 +16153,7 @@
                     </pic:cNvPicPr>
                   </pic:nvPicPr>
                   <pic:blipFill rotWithShape="1">
-                    <a:blip r:embed="rId28">
+                    <a:blip r:embed="rId29">
                       <a:extLst>
                         <a:ext uri="{28A0092B-C50C-407E-A947-70E740481C1C}">
                           <a14:useLocalDpi xmlns:a14="http://schemas.microsoft.com/office/drawing/2010/main" val="0"/>
@@ -16492,7 +16646,21 @@
         <w:rPr>
           <w:lang w:val="fr-CH"/>
         </w:rPr>
-        <w:t xml:space="preserve"> par Laravel avant d’être stockés en base de données. La validation des données sera gérée avec des Form </w:t>
+        <w:t xml:space="preserve"> par </w:t>
+      </w:r>
+      <w:proofErr w:type="spellStart"/>
+      <w:r>
+        <w:rPr>
+          <w:lang w:val="fr-CH"/>
+        </w:rPr>
+        <w:t>Laravel</w:t>
+      </w:r>
+      <w:proofErr w:type="spellEnd"/>
+      <w:r>
+        <w:rPr>
+          <w:lang w:val="fr-CH"/>
+        </w:rPr>
+        <w:t xml:space="preserve"> avant d’être stockés en base de données. La validation des données sera gérée avec des Form </w:t>
       </w:r>
       <w:proofErr w:type="spellStart"/>
       <w:r>
@@ -16654,13 +16822,7 @@
         <w:rPr>
           <w:lang w:val="fr-CH"/>
         </w:rPr>
-        <w:t>env</w:t>
-      </w:r>
-      <w:r>
-        <w:rPr>
-          <w:lang w:val="fr-CH"/>
-        </w:rPr>
-        <w:t xml:space="preserve"> en local et dans les variables d’environnement Azure en production. </w:t>
+        <w:t xml:space="preserve">env en local et dans les variables d’environnement Azure en production. </w:t>
       </w:r>
       <w:r>
         <w:rPr>
@@ -17488,6 +17650,1285 @@
           <w:lang w:val="fr-CH"/>
         </w:rPr>
       </w:pPr>
+      <w:r>
+        <w:rPr>
+          <w:lang w:val="fr-CH"/>
+        </w:rPr>
+        <w:t xml:space="preserve">J’avais fait </w:t>
+      </w:r>
+      <w:r>
+        <w:rPr>
+          <w:lang w:val="fr-CH"/>
+        </w:rPr>
+        <w:t xml:space="preserve">composer </w:t>
+      </w:r>
+      <w:proofErr w:type="spellStart"/>
+      <w:r>
+        <w:rPr>
+          <w:lang w:val="fr-CH"/>
+        </w:rPr>
+        <w:t>create-project</w:t>
+      </w:r>
+      <w:proofErr w:type="spellEnd"/>
+      <w:r>
+        <w:rPr>
+          <w:lang w:val="fr-CH"/>
+        </w:rPr>
+        <w:t xml:space="preserve"> </w:t>
+      </w:r>
+      <w:proofErr w:type="spellStart"/>
+      <w:r>
+        <w:rPr>
+          <w:lang w:val="fr-CH"/>
+        </w:rPr>
+        <w:t>laravel</w:t>
+      </w:r>
+      <w:proofErr w:type="spellEnd"/>
+      <w:r>
+        <w:rPr>
+          <w:lang w:val="fr-CH"/>
+        </w:rPr>
+        <w:t>/</w:t>
+      </w:r>
+      <w:proofErr w:type="spellStart"/>
+      <w:proofErr w:type="gramStart"/>
+      <w:r>
+        <w:rPr>
+          <w:lang w:val="fr-CH"/>
+        </w:rPr>
+        <w:t>laravel</w:t>
+      </w:r>
+      <w:proofErr w:type="spellEnd"/>
+      <w:r>
+        <w:rPr>
+          <w:lang w:val="fr-CH"/>
+        </w:rPr>
+        <w:t xml:space="preserve"> .</w:t>
+      </w:r>
+      <w:proofErr w:type="gramEnd"/>
+      <w:r>
+        <w:rPr>
+          <w:lang w:val="fr-CH"/>
+        </w:rPr>
+        <w:t xml:space="preserve"> </w:t>
+      </w:r>
+      <w:proofErr w:type="gramStart"/>
+      <w:r>
+        <w:rPr>
+          <w:lang w:val="fr-CH"/>
+        </w:rPr>
+        <w:t>mais</w:t>
+      </w:r>
+      <w:proofErr w:type="gramEnd"/>
+      <w:r>
+        <w:rPr>
+          <w:lang w:val="fr-CH"/>
+        </w:rPr>
+        <w:t xml:space="preserve"> en fait fallait </w:t>
+      </w:r>
+      <w:r>
+        <w:rPr>
+          <w:lang w:val="fr-CH"/>
+        </w:rPr>
+        <w:t xml:space="preserve">composer </w:t>
+      </w:r>
+      <w:proofErr w:type="spellStart"/>
+      <w:r>
+        <w:rPr>
+          <w:lang w:val="fr-CH"/>
+        </w:rPr>
+        <w:t>create-project</w:t>
+      </w:r>
+      <w:proofErr w:type="spellEnd"/>
+      <w:r>
+        <w:rPr>
+          <w:lang w:val="fr-CH"/>
+        </w:rPr>
+        <w:t xml:space="preserve"> </w:t>
+      </w:r>
+      <w:proofErr w:type="spellStart"/>
+      <w:r>
+        <w:rPr>
+          <w:lang w:val="fr-CH"/>
+        </w:rPr>
+        <w:t>laravel</w:t>
+      </w:r>
+      <w:proofErr w:type="spellEnd"/>
+      <w:r>
+        <w:rPr>
+          <w:lang w:val="fr-CH"/>
+        </w:rPr>
+        <w:t>/</w:t>
+      </w:r>
+      <w:proofErr w:type="spellStart"/>
+      <w:proofErr w:type="gramStart"/>
+      <w:r>
+        <w:rPr>
+          <w:lang w:val="fr-CH"/>
+        </w:rPr>
+        <w:t>laravel</w:t>
+      </w:r>
+      <w:proofErr w:type="spellEnd"/>
+      <w:r>
+        <w:rPr>
+          <w:lang w:val="fr-CH"/>
+        </w:rPr>
+        <w:t>:^</w:t>
+      </w:r>
+      <w:proofErr w:type="gramEnd"/>
+      <w:r>
+        <w:rPr>
+          <w:lang w:val="fr-CH"/>
+        </w:rPr>
+        <w:t>12.</w:t>
+      </w:r>
+      <w:proofErr w:type="gramStart"/>
+      <w:r>
+        <w:rPr>
+          <w:lang w:val="fr-CH"/>
+        </w:rPr>
+        <w:t>0 .</w:t>
+      </w:r>
+      <w:proofErr w:type="gramEnd"/>
+    </w:p>
+    <w:p>
+      <w:pPr>
+        <w:rPr>
+          <w:lang w:val="fr-CH"/>
+        </w:rPr>
+      </w:pPr>
+      <w:r>
+        <w:rPr>
+          <w:lang w:val="fr-CH"/>
+        </w:rPr>
+        <w:t xml:space="preserve">Puis : </w:t>
+      </w:r>
+      <w:r>
+        <w:rPr>
+          <w:lang w:val="fr-CH"/>
+        </w:rPr>
+        <w:t xml:space="preserve">composer </w:t>
+      </w:r>
+      <w:proofErr w:type="spellStart"/>
+      <w:r>
+        <w:rPr>
+          <w:lang w:val="fr-CH"/>
+        </w:rPr>
+        <w:t>require</w:t>
+      </w:r>
+      <w:proofErr w:type="spellEnd"/>
+      <w:r>
+        <w:rPr>
+          <w:lang w:val="fr-CH"/>
+        </w:rPr>
+        <w:t xml:space="preserve"> </w:t>
+      </w:r>
+      <w:proofErr w:type="spellStart"/>
+      <w:r>
+        <w:rPr>
+          <w:lang w:val="fr-CH"/>
+        </w:rPr>
+        <w:t>laravel</w:t>
+      </w:r>
+      <w:proofErr w:type="spellEnd"/>
+      <w:r>
+        <w:rPr>
+          <w:lang w:val="fr-CH"/>
+        </w:rPr>
+        <w:t>/</w:t>
+      </w:r>
+      <w:proofErr w:type="spellStart"/>
+      <w:r>
+        <w:rPr>
+          <w:lang w:val="fr-CH"/>
+        </w:rPr>
+        <w:t>sail</w:t>
+      </w:r>
+      <w:proofErr w:type="spellEnd"/>
+      <w:r>
+        <w:rPr>
+          <w:lang w:val="fr-CH"/>
+        </w:rPr>
+        <w:t xml:space="preserve"> </w:t>
+      </w:r>
+      <w:r>
+        <w:rPr>
+          <w:lang w:val="fr-CH"/>
+        </w:rPr>
+        <w:t>–</w:t>
+      </w:r>
+      <w:r>
+        <w:rPr>
+          <w:lang w:val="fr-CH"/>
+        </w:rPr>
+        <w:t>dev</w:t>
+      </w:r>
+      <w:r>
+        <w:rPr>
+          <w:lang w:val="fr-CH"/>
+        </w:rPr>
+        <w:t xml:space="preserve"> et </w:t>
+      </w:r>
+      <w:proofErr w:type="spellStart"/>
+      <w:r>
+        <w:rPr>
+          <w:lang w:val="fr-CH"/>
+        </w:rPr>
+        <w:t>php</w:t>
+      </w:r>
+      <w:proofErr w:type="spellEnd"/>
+      <w:r>
+        <w:rPr>
+          <w:lang w:val="fr-CH"/>
+        </w:rPr>
+        <w:t xml:space="preserve"> artisan </w:t>
+      </w:r>
+      <w:proofErr w:type="spellStart"/>
+      <w:proofErr w:type="gramStart"/>
+      <w:r>
+        <w:rPr>
+          <w:lang w:val="fr-CH"/>
+        </w:rPr>
+        <w:t>sail:install</w:t>
+      </w:r>
+      <w:proofErr w:type="spellEnd"/>
+      <w:proofErr w:type="gramEnd"/>
+      <w:r>
+        <w:rPr>
+          <w:lang w:val="fr-CH"/>
+        </w:rPr>
+        <w:t xml:space="preserve"> (ensuite config = installer le service </w:t>
+      </w:r>
+      <w:proofErr w:type="spellStart"/>
+      <w:r>
+        <w:rPr>
+          <w:lang w:val="fr-CH"/>
+        </w:rPr>
+        <w:t>mysql</w:t>
+      </w:r>
+      <w:proofErr w:type="spellEnd"/>
+      <w:r>
+        <w:rPr>
+          <w:lang w:val="fr-CH"/>
+        </w:rPr>
+        <w:t>)</w:t>
+      </w:r>
+    </w:p>
+    <w:p>
+      <w:pPr>
+        <w:rPr>
+          <w:lang w:val="fr-CH"/>
+        </w:rPr>
+      </w:pPr>
+    </w:p>
+    <w:p>
+      <w:pPr>
+        <w:rPr>
+          <w:lang w:val="fr-CH"/>
+        </w:rPr>
+      </w:pPr>
+      <w:r>
+        <w:rPr>
+          <w:lang w:val="fr-CH"/>
+        </w:rPr>
+        <w:t xml:space="preserve">J’ai changé dans le fichier </w:t>
+      </w:r>
+      <w:proofErr w:type="spellStart"/>
+      <w:r>
+        <w:rPr>
+          <w:lang w:val="fr-CH"/>
+        </w:rPr>
+        <w:t>env</w:t>
+      </w:r>
+      <w:proofErr w:type="spellEnd"/>
+      <w:r>
+        <w:rPr>
+          <w:lang w:val="fr-CH"/>
+        </w:rPr>
+        <w:t xml:space="preserve"> SESSION_DRIVER=</w:t>
+      </w:r>
+      <w:proofErr w:type="spellStart"/>
+      <w:r>
+        <w:rPr>
+          <w:lang w:val="fr-CH"/>
+        </w:rPr>
+        <w:t>database</w:t>
+      </w:r>
+      <w:proofErr w:type="spellEnd"/>
+      <w:r>
+        <w:rPr>
+          <w:lang w:val="fr-CH"/>
+        </w:rPr>
+        <w:t xml:space="preserve"> en SESSION_DRIVER=file pour pas avoir de soucis avec la config de base du projet qui se base sur les migrations par défaut.</w:t>
+      </w:r>
+    </w:p>
+    <w:p>
+      <w:pPr>
+        <w:rPr>
+          <w:lang w:val="fr-CH"/>
+        </w:rPr>
+      </w:pPr>
+      <w:r>
+        <w:rPr>
+          <w:lang w:val="fr-CH"/>
+        </w:rPr>
+        <w:t xml:space="preserve">Donc à ce niveau le backend tourne </w:t>
+      </w:r>
+    </w:p>
+    <w:p>
+      <w:pPr>
+        <w:rPr>
+          <w:lang w:val="fr-CH"/>
+        </w:rPr>
+      </w:pPr>
+      <w:r>
+        <w:rPr>
+          <w:noProof/>
+          <w:lang w:val="fr-CH"/>
+        </w:rPr>
+        <w:drawing>
+          <wp:inline distT="0" distB="0" distL="0" distR="0" wp14:anchorId="0B402BBF" wp14:editId="1E01F095">
+            <wp:extent cx="5972810" cy="2548890"/>
+            <wp:effectExtent l="0" t="0" r="8890" b="3810"/>
+            <wp:docPr id="1730459782" name="Image 1"/>
+            <wp:cNvGraphicFramePr>
+              <a:graphicFrameLocks xmlns:a="http://schemas.openxmlformats.org/drawingml/2006/main" noChangeAspect="1"/>
+            </wp:cNvGraphicFramePr>
+            <a:graphic xmlns:a="http://schemas.openxmlformats.org/drawingml/2006/main">
+              <a:graphicData uri="http://schemas.openxmlformats.org/drawingml/2006/picture">
+                <pic:pic xmlns:pic="http://schemas.openxmlformats.org/drawingml/2006/picture">
+                  <pic:nvPicPr>
+                    <pic:cNvPr id="1730459782" name=""/>
+                    <pic:cNvPicPr/>
+                  </pic:nvPicPr>
+                  <pic:blipFill>
+                    <a:blip r:embed="rId30"/>
+                    <a:stretch>
+                      <a:fillRect/>
+                    </a:stretch>
+                  </pic:blipFill>
+                  <pic:spPr>
+                    <a:xfrm>
+                      <a:off x="0" y="0"/>
+                      <a:ext cx="5972810" cy="2548890"/>
+                    </a:xfrm>
+                    <a:prstGeom prst="rect">
+                      <a:avLst/>
+                    </a:prstGeom>
+                  </pic:spPr>
+                </pic:pic>
+              </a:graphicData>
+            </a:graphic>
+          </wp:inline>
+        </w:drawing>
+      </w:r>
+    </w:p>
+    <w:p>
+      <w:pPr>
+        <w:rPr>
+          <w:lang w:val="fr-CH"/>
+        </w:rPr>
+      </w:pPr>
+    </w:p>
+    <w:p>
+      <w:pPr>
+        <w:rPr>
+          <w:lang w:val="fr-CH"/>
+        </w:rPr>
+      </w:pPr>
+      <w:r>
+        <w:rPr>
+          <w:lang w:val="fr-CH"/>
+        </w:rPr>
+        <w:t xml:space="preserve">J’ai </w:t>
+      </w:r>
+      <w:proofErr w:type="gramStart"/>
+      <w:r>
+        <w:rPr>
+          <w:lang w:val="fr-CH"/>
+        </w:rPr>
+        <w:t>nettoyer</w:t>
+      </w:r>
+      <w:proofErr w:type="gramEnd"/>
+      <w:r>
+        <w:rPr>
+          <w:lang w:val="fr-CH"/>
+        </w:rPr>
+        <w:t xml:space="preserve"> les migrations par défaut pour faire les miennes </w:t>
+      </w:r>
+    </w:p>
+    <w:p>
+      <w:proofErr w:type="gramStart"/>
+      <w:r>
+        <w:t>./</w:t>
+      </w:r>
+      <w:proofErr w:type="gramEnd"/>
+      <w:r>
+        <w:t xml:space="preserve">vendor/bin/sail artisan </w:t>
+      </w:r>
+      <w:proofErr w:type="spellStart"/>
+      <w:proofErr w:type="gramStart"/>
+      <w:r>
+        <w:t>make:migration</w:t>
+      </w:r>
+      <w:proofErr w:type="spellEnd"/>
+      <w:proofErr w:type="gramEnd"/>
+      <w:r>
+        <w:t xml:space="preserve"> </w:t>
+      </w:r>
+      <w:proofErr w:type="spellStart"/>
+      <w:r>
+        <w:t>create_users_table</w:t>
+      </w:r>
+      <w:proofErr w:type="spellEnd"/>
+    </w:p>
+    <w:p>
+      <w:proofErr w:type="gramStart"/>
+      <w:r>
+        <w:t>./</w:t>
+      </w:r>
+      <w:proofErr w:type="gramEnd"/>
+      <w:r>
+        <w:t xml:space="preserve">vendor/bin/sail artisan </w:t>
+      </w:r>
+      <w:proofErr w:type="spellStart"/>
+      <w:proofErr w:type="gramStart"/>
+      <w:r>
+        <w:t>make:migration</w:t>
+      </w:r>
+      <w:proofErr w:type="spellEnd"/>
+      <w:proofErr w:type="gramEnd"/>
+      <w:r>
+        <w:t xml:space="preserve"> </w:t>
+      </w:r>
+      <w:proofErr w:type="spellStart"/>
+      <w:r>
+        <w:t>create_movies_table</w:t>
+      </w:r>
+      <w:proofErr w:type="spellEnd"/>
+    </w:p>
+    <w:p>
+      <w:pPr>
+        <w:rPr>
+          <w:lang w:val="fr-CH"/>
+        </w:rPr>
+      </w:pPr>
+      <w:proofErr w:type="gramStart"/>
+      <w:r>
+        <w:rPr>
+          <w:lang w:val="fr-CH"/>
+        </w:rPr>
+        <w:t>./</w:t>
+      </w:r>
+      <w:proofErr w:type="spellStart"/>
+      <w:proofErr w:type="gramEnd"/>
+      <w:r>
+        <w:rPr>
+          <w:lang w:val="fr-CH"/>
+        </w:rPr>
+        <w:t>vendor</w:t>
+      </w:r>
+      <w:proofErr w:type="spellEnd"/>
+      <w:r>
+        <w:rPr>
+          <w:lang w:val="fr-CH"/>
+        </w:rPr>
+        <w:t>/bin/</w:t>
+      </w:r>
+      <w:proofErr w:type="spellStart"/>
+      <w:r>
+        <w:rPr>
+          <w:lang w:val="fr-CH"/>
+        </w:rPr>
+        <w:t>sail</w:t>
+      </w:r>
+      <w:proofErr w:type="spellEnd"/>
+      <w:r>
+        <w:rPr>
+          <w:lang w:val="fr-CH"/>
+        </w:rPr>
+        <w:t xml:space="preserve"> artisan </w:t>
+      </w:r>
+      <w:proofErr w:type="spellStart"/>
+      <w:proofErr w:type="gramStart"/>
+      <w:r>
+        <w:rPr>
+          <w:lang w:val="fr-CH"/>
+        </w:rPr>
+        <w:t>make:migration</w:t>
+      </w:r>
+      <w:proofErr w:type="spellEnd"/>
+      <w:proofErr w:type="gramEnd"/>
+      <w:r>
+        <w:rPr>
+          <w:lang w:val="fr-CH"/>
+        </w:rPr>
+        <w:t xml:space="preserve"> </w:t>
+      </w:r>
+      <w:proofErr w:type="spellStart"/>
+      <w:r>
+        <w:rPr>
+          <w:lang w:val="fr-CH"/>
+        </w:rPr>
+        <w:t>create_quotes_table</w:t>
+      </w:r>
+      <w:proofErr w:type="spellEnd"/>
+    </w:p>
+    <w:p>
+      <w:pPr>
+        <w:rPr>
+          <w:lang w:val="fr-CH"/>
+        </w:rPr>
+      </w:pPr>
+      <w:r>
+        <w:rPr>
+          <w:lang w:val="fr-CH"/>
+        </w:rPr>
+        <w:t xml:space="preserve">Explication vite fait de la spécificité </w:t>
+      </w:r>
+      <w:proofErr w:type="spellStart"/>
+      <w:proofErr w:type="gramStart"/>
+      <w:r>
+        <w:rPr>
+          <w:lang w:val="fr-CH"/>
+        </w:rPr>
+        <w:t>text</w:t>
+      </w:r>
+      <w:proofErr w:type="spellEnd"/>
+      <w:r>
+        <w:rPr>
+          <w:lang w:val="fr-CH"/>
+        </w:rPr>
+        <w:t>(</w:t>
+      </w:r>
+      <w:proofErr w:type="gramEnd"/>
+      <w:r>
+        <w:rPr>
+          <w:lang w:val="fr-CH"/>
+        </w:rPr>
+        <w:t xml:space="preserve">) et de ce que font </w:t>
+      </w:r>
+      <w:proofErr w:type="gramStart"/>
+      <w:r>
+        <w:rPr>
+          <w:lang w:val="fr-CH"/>
+        </w:rPr>
+        <w:t>timestamps(</w:t>
+      </w:r>
+      <w:proofErr w:type="gramEnd"/>
+      <w:r>
+        <w:rPr>
+          <w:lang w:val="fr-CH"/>
+        </w:rPr>
+        <w:t xml:space="preserve">) ainsi que </w:t>
+      </w:r>
+      <w:proofErr w:type="spellStart"/>
+      <w:proofErr w:type="gramStart"/>
+      <w:r>
+        <w:rPr>
+          <w:lang w:val="fr-CH"/>
+        </w:rPr>
+        <w:t>constrained</w:t>
+      </w:r>
+      <w:proofErr w:type="spellEnd"/>
+      <w:r>
+        <w:rPr>
+          <w:lang w:val="fr-CH"/>
+        </w:rPr>
+        <w:t>(</w:t>
+      </w:r>
+      <w:proofErr w:type="gramEnd"/>
+      <w:r>
+        <w:rPr>
+          <w:lang w:val="fr-CH"/>
+        </w:rPr>
+        <w:t xml:space="preserve">) et </w:t>
+      </w:r>
+      <w:proofErr w:type="spellStart"/>
+      <w:proofErr w:type="gramStart"/>
+      <w:r>
+        <w:rPr>
+          <w:lang w:val="fr-CH"/>
+        </w:rPr>
+        <w:t>cascadondelete</w:t>
+      </w:r>
+      <w:proofErr w:type="spellEnd"/>
+      <w:r>
+        <w:rPr>
+          <w:lang w:val="fr-CH"/>
+        </w:rPr>
+        <w:t>(</w:t>
+      </w:r>
+      <w:proofErr w:type="gramEnd"/>
+      <w:r>
+        <w:rPr>
+          <w:lang w:val="fr-CH"/>
+        </w:rPr>
+        <w:t>)</w:t>
+      </w:r>
+    </w:p>
+    <w:p>
+      <w:pPr>
+        <w:rPr>
+          <w:lang w:val="fr-CH"/>
+        </w:rPr>
+      </w:pPr>
+      <w:proofErr w:type="gramStart"/>
+      <w:r>
+        <w:rPr>
+          <w:lang w:val="fr-CH"/>
+        </w:rPr>
+        <w:t xml:space="preserve">Puis </w:t>
+      </w:r>
+      <w:r>
+        <w:rPr>
+          <w:lang w:val="fr-CH"/>
+        </w:rPr>
+        <w:t>.</w:t>
+      </w:r>
+      <w:proofErr w:type="gramEnd"/>
+      <w:r>
+        <w:rPr>
+          <w:lang w:val="fr-CH"/>
+        </w:rPr>
+        <w:t>/</w:t>
+      </w:r>
+      <w:proofErr w:type="spellStart"/>
+      <w:r>
+        <w:rPr>
+          <w:lang w:val="fr-CH"/>
+        </w:rPr>
+        <w:t>vendor</w:t>
+      </w:r>
+      <w:proofErr w:type="spellEnd"/>
+      <w:r>
+        <w:rPr>
+          <w:lang w:val="fr-CH"/>
+        </w:rPr>
+        <w:t>/bin/</w:t>
+      </w:r>
+      <w:proofErr w:type="spellStart"/>
+      <w:r>
+        <w:rPr>
+          <w:lang w:val="fr-CH"/>
+        </w:rPr>
+        <w:t>sail</w:t>
+      </w:r>
+      <w:proofErr w:type="spellEnd"/>
+      <w:r>
+        <w:rPr>
+          <w:lang w:val="fr-CH"/>
+        </w:rPr>
+        <w:t xml:space="preserve"> artisan </w:t>
+      </w:r>
+      <w:proofErr w:type="spellStart"/>
+      <w:r>
+        <w:rPr>
+          <w:lang w:val="fr-CH"/>
+        </w:rPr>
+        <w:t>migrate</w:t>
+      </w:r>
+      <w:proofErr w:type="spellEnd"/>
+    </w:p>
+    <w:p>
+      <w:pPr>
+        <w:rPr>
+          <w:lang w:val="fr-CH"/>
+        </w:rPr>
+      </w:pPr>
+    </w:p>
+    <w:p>
+      <w:pPr>
+        <w:rPr>
+          <w:lang w:val="fr-CH"/>
+        </w:rPr>
+      </w:pPr>
+      <w:r>
+        <w:rPr>
+          <w:lang w:val="fr-CH"/>
+        </w:rPr>
+        <w:t xml:space="preserve">J’ai </w:t>
+      </w:r>
+      <w:proofErr w:type="gramStart"/>
+      <w:r>
+        <w:rPr>
+          <w:lang w:val="fr-CH"/>
+        </w:rPr>
+        <w:t>fais</w:t>
+      </w:r>
+      <w:proofErr w:type="gramEnd"/>
+      <w:r>
+        <w:rPr>
+          <w:lang w:val="fr-CH"/>
+        </w:rPr>
+        <w:t xml:space="preserve"> les seeders avec artisan</w:t>
+      </w:r>
+      <w:proofErr w:type="gramStart"/>
+      <w:r>
+        <w:rPr>
+          <w:lang w:val="fr-CH"/>
+        </w:rPr>
+        <w:t> :</w:t>
+      </w:r>
+      <w:proofErr w:type="spellStart"/>
+      <w:r>
+        <w:rPr>
+          <w:lang w:val="fr-CH"/>
+        </w:rPr>
+        <w:t>make</w:t>
+      </w:r>
+      <w:proofErr w:type="spellEnd"/>
+      <w:proofErr w:type="gramEnd"/>
+      <w:r>
+        <w:rPr>
+          <w:lang w:val="fr-CH"/>
+        </w:rPr>
+        <w:t xml:space="preserve"> seeder </w:t>
+      </w:r>
+      <w:proofErr w:type="spellStart"/>
+      <w:r>
+        <w:rPr>
+          <w:lang w:val="fr-CH"/>
+        </w:rPr>
+        <w:t>UserSeeder</w:t>
+      </w:r>
+      <w:proofErr w:type="spellEnd"/>
+      <w:r>
+        <w:rPr>
+          <w:lang w:val="fr-CH"/>
+        </w:rPr>
+        <w:t xml:space="preserve"> par exemple</w:t>
+      </w:r>
+    </w:p>
+    <w:p>
+      <w:pPr>
+        <w:rPr>
+          <w:lang w:val="fr-CH"/>
+        </w:rPr>
+      </w:pPr>
+      <w:r>
+        <w:rPr>
+          <w:lang w:val="fr-CH"/>
+        </w:rPr>
+        <w:t xml:space="preserve">Puis les exécuter </w:t>
+      </w:r>
+      <w:proofErr w:type="gramStart"/>
+      <w:r>
+        <w:rPr>
+          <w:lang w:val="fr-CH"/>
+        </w:rPr>
+        <w:t xml:space="preserve">avec </w:t>
+      </w:r>
+      <w:r>
+        <w:rPr>
+          <w:lang w:val="fr-CH"/>
+        </w:rPr>
+        <w:t>.</w:t>
+      </w:r>
+      <w:proofErr w:type="gramEnd"/>
+      <w:r>
+        <w:rPr>
+          <w:lang w:val="fr-CH"/>
+        </w:rPr>
+        <w:t>/</w:t>
+      </w:r>
+      <w:proofErr w:type="spellStart"/>
+      <w:r>
+        <w:rPr>
+          <w:lang w:val="fr-CH"/>
+        </w:rPr>
+        <w:t>vendor</w:t>
+      </w:r>
+      <w:proofErr w:type="spellEnd"/>
+      <w:r>
+        <w:rPr>
+          <w:lang w:val="fr-CH"/>
+        </w:rPr>
+        <w:t>/bin/</w:t>
+      </w:r>
+      <w:proofErr w:type="spellStart"/>
+      <w:r>
+        <w:rPr>
+          <w:lang w:val="fr-CH"/>
+        </w:rPr>
+        <w:t>sail</w:t>
+      </w:r>
+      <w:proofErr w:type="spellEnd"/>
+      <w:r>
+        <w:rPr>
+          <w:lang w:val="fr-CH"/>
+        </w:rPr>
+        <w:t xml:space="preserve"> artisan </w:t>
+      </w:r>
+      <w:proofErr w:type="spellStart"/>
+      <w:proofErr w:type="gramStart"/>
+      <w:r>
+        <w:rPr>
+          <w:lang w:val="fr-CH"/>
+        </w:rPr>
+        <w:t>db:seed</w:t>
+      </w:r>
+      <w:proofErr w:type="spellEnd"/>
+      <w:proofErr w:type="gramEnd"/>
+    </w:p>
+    <w:p>
+      <w:pPr>
+        <w:rPr>
+          <w:lang w:val="fr-CH"/>
+        </w:rPr>
+      </w:pPr>
+      <w:r>
+        <w:rPr>
+          <w:lang w:val="fr-CH"/>
+        </w:rPr>
+        <w:t xml:space="preserve">Pour les </w:t>
+      </w:r>
+      <w:proofErr w:type="spellStart"/>
+      <w:r>
+        <w:rPr>
+          <w:lang w:val="fr-CH"/>
+        </w:rPr>
+        <w:t>modeles</w:t>
+      </w:r>
+      <w:proofErr w:type="spellEnd"/>
+      <w:r>
+        <w:rPr>
+          <w:lang w:val="fr-CH"/>
+        </w:rPr>
+        <w:t xml:space="preserve"> je les créer simplement avec leur </w:t>
+      </w:r>
+      <w:proofErr w:type="spellStart"/>
+      <w:r>
+        <w:rPr>
+          <w:lang w:val="fr-CH"/>
+        </w:rPr>
+        <w:t>fillable</w:t>
+      </w:r>
+      <w:proofErr w:type="spellEnd"/>
+      <w:r>
+        <w:rPr>
+          <w:lang w:val="fr-CH"/>
+        </w:rPr>
+        <w:t xml:space="preserve"> et les relations. Pour le model user j’ai simplement pris celui par </w:t>
+      </w:r>
+      <w:proofErr w:type="spellStart"/>
+      <w:r>
+        <w:rPr>
+          <w:lang w:val="fr-CH"/>
+        </w:rPr>
+        <w:t>defaut</w:t>
+      </w:r>
+      <w:proofErr w:type="spellEnd"/>
+      <w:r>
+        <w:rPr>
+          <w:lang w:val="fr-CH"/>
+        </w:rPr>
+        <w:t xml:space="preserve"> de </w:t>
+      </w:r>
+      <w:proofErr w:type="spellStart"/>
+      <w:r>
+        <w:rPr>
+          <w:lang w:val="fr-CH"/>
+        </w:rPr>
+        <w:t>laravel</w:t>
+      </w:r>
+      <w:proofErr w:type="spellEnd"/>
+      <w:r>
+        <w:rPr>
+          <w:lang w:val="fr-CH"/>
+        </w:rPr>
+        <w:t xml:space="preserve"> </w:t>
+      </w:r>
+      <w:proofErr w:type="gramStart"/>
+      <w:r>
+        <w:rPr>
+          <w:lang w:val="fr-CH"/>
+        </w:rPr>
+        <w:t>au quel</w:t>
+      </w:r>
+      <w:proofErr w:type="gramEnd"/>
+      <w:r>
+        <w:rPr>
+          <w:lang w:val="fr-CH"/>
+        </w:rPr>
+        <w:t xml:space="preserve"> j’ai changé les </w:t>
+      </w:r>
+      <w:proofErr w:type="spellStart"/>
+      <w:r>
+        <w:rPr>
+          <w:lang w:val="fr-CH"/>
+        </w:rPr>
+        <w:t>fillable</w:t>
+      </w:r>
+      <w:proofErr w:type="spellEnd"/>
+      <w:r>
+        <w:rPr>
+          <w:lang w:val="fr-CH"/>
+        </w:rPr>
+        <w:t xml:space="preserve"> + ajouté les relations</w:t>
+      </w:r>
+    </w:p>
+    <w:p>
+      <w:pPr>
+        <w:rPr>
+          <w:lang w:val="fr-CH"/>
+        </w:rPr>
+      </w:pPr>
+      <w:r>
+        <w:rPr>
+          <w:lang w:val="fr-CH"/>
+        </w:rPr>
+        <w:t xml:space="preserve">Ä </w:t>
+      </w:r>
+      <w:proofErr w:type="spellStart"/>
+      <w:r>
+        <w:rPr>
+          <w:lang w:val="fr-CH"/>
+        </w:rPr>
+        <w:t>infomaniak</w:t>
+      </w:r>
+      <w:proofErr w:type="spellEnd"/>
+      <w:r>
+        <w:rPr>
+          <w:lang w:val="fr-CH"/>
+        </w:rPr>
+        <w:t xml:space="preserve"> on ajoutait </w:t>
+      </w:r>
+      <w:proofErr w:type="spellStart"/>
+      <w:r>
+        <w:rPr>
+          <w:lang w:val="fr-CH"/>
+        </w:rPr>
+        <w:t>timestampes</w:t>
+      </w:r>
+      <w:proofErr w:type="spellEnd"/>
+      <w:r>
+        <w:rPr>
+          <w:lang w:val="fr-CH"/>
+        </w:rPr>
+        <w:t xml:space="preserve"> = </w:t>
+      </w:r>
+      <w:proofErr w:type="spellStart"/>
+      <w:r>
+        <w:rPr>
+          <w:lang w:val="fr-CH"/>
+        </w:rPr>
+        <w:t>true</w:t>
+      </w:r>
+      <w:proofErr w:type="spellEnd"/>
+      <w:r>
+        <w:rPr>
+          <w:lang w:val="fr-CH"/>
+        </w:rPr>
+        <w:t xml:space="preserve"> dans les </w:t>
+      </w:r>
+      <w:proofErr w:type="spellStart"/>
+      <w:r>
+        <w:rPr>
+          <w:lang w:val="fr-CH"/>
+        </w:rPr>
+        <w:t>models</w:t>
+      </w:r>
+      <w:proofErr w:type="spellEnd"/>
+      <w:r>
+        <w:rPr>
+          <w:lang w:val="fr-CH"/>
+        </w:rPr>
+        <w:t xml:space="preserve">, </w:t>
+      </w:r>
+      <w:proofErr w:type="gramStart"/>
+      <w:r>
+        <w:rPr>
+          <w:lang w:val="fr-CH"/>
+        </w:rPr>
+        <w:t>sauf que</w:t>
+      </w:r>
+      <w:proofErr w:type="gramEnd"/>
+      <w:r>
+        <w:rPr>
+          <w:lang w:val="fr-CH"/>
+        </w:rPr>
+        <w:t xml:space="preserve"> vu que c’est par défaut </w:t>
+      </w:r>
+      <w:proofErr w:type="spellStart"/>
+      <w:r>
+        <w:rPr>
+          <w:lang w:val="fr-CH"/>
+        </w:rPr>
+        <w:t>true</w:t>
+      </w:r>
+      <w:proofErr w:type="spellEnd"/>
+      <w:r>
+        <w:rPr>
+          <w:lang w:val="fr-CH"/>
+        </w:rPr>
+        <w:t xml:space="preserve"> </w:t>
+      </w:r>
+      <w:proofErr w:type="gramStart"/>
+      <w:r>
+        <w:rPr>
+          <w:lang w:val="fr-CH"/>
+        </w:rPr>
+        <w:t xml:space="preserve">je </w:t>
+      </w:r>
+      <w:proofErr w:type="spellStart"/>
+      <w:r>
+        <w:rPr>
+          <w:lang w:val="fr-CH"/>
+        </w:rPr>
+        <w:t>met</w:t>
+      </w:r>
+      <w:proofErr w:type="spellEnd"/>
+      <w:r>
+        <w:rPr>
+          <w:lang w:val="fr-CH"/>
+        </w:rPr>
+        <w:t xml:space="preserve"> pas</w:t>
+      </w:r>
+      <w:proofErr w:type="gramEnd"/>
+      <w:r>
+        <w:rPr>
+          <w:lang w:val="fr-CH"/>
+        </w:rPr>
+        <w:t>.</w:t>
+      </w:r>
+    </w:p>
+    <w:p>
+      <w:pPr>
+        <w:rPr>
+          <w:lang w:val="fr-CH"/>
+        </w:rPr>
+      </w:pPr>
+    </w:p>
+    <w:p>
+      <w:r>
+        <w:rPr>
+          <w:lang w:val="fr-CH"/>
+        </w:rPr>
+        <w:t xml:space="preserve">Dans les </w:t>
+      </w:r>
+      <w:proofErr w:type="spellStart"/>
+      <w:r>
+        <w:rPr>
+          <w:lang w:val="fr-CH"/>
+        </w:rPr>
+        <w:t>models</w:t>
+      </w:r>
+      <w:proofErr w:type="spellEnd"/>
+      <w:r>
+        <w:rPr>
+          <w:lang w:val="fr-CH"/>
+        </w:rPr>
+        <w:t xml:space="preserve"> de </w:t>
+      </w:r>
+      <w:proofErr w:type="spellStart"/>
+      <w:r>
+        <w:rPr>
+          <w:lang w:val="fr-CH"/>
+        </w:rPr>
+        <w:t>movie</w:t>
+      </w:r>
+      <w:proofErr w:type="spellEnd"/>
+      <w:r>
+        <w:rPr>
+          <w:lang w:val="fr-CH"/>
+        </w:rPr>
+        <w:t xml:space="preserve"> et </w:t>
+      </w:r>
+      <w:proofErr w:type="spellStart"/>
+      <w:r>
+        <w:rPr>
+          <w:lang w:val="fr-CH"/>
+        </w:rPr>
+        <w:t>quote</w:t>
+      </w:r>
+      <w:proofErr w:type="spellEnd"/>
+      <w:r>
+        <w:rPr>
+          <w:lang w:val="fr-CH"/>
+        </w:rPr>
+        <w:t xml:space="preserve"> j’ai mis les </w:t>
+      </w:r>
+      <w:proofErr w:type="spellStart"/>
+      <w:r>
+        <w:rPr>
+          <w:lang w:val="fr-CH"/>
+        </w:rPr>
+        <w:t>foreign</w:t>
+      </w:r>
+      <w:proofErr w:type="spellEnd"/>
+      <w:r>
+        <w:rPr>
+          <w:lang w:val="fr-CH"/>
+        </w:rPr>
+        <w:t xml:space="preserve"> dans </w:t>
+      </w:r>
+      <w:proofErr w:type="spellStart"/>
+      <w:r>
+        <w:rPr>
+          <w:lang w:val="fr-CH"/>
+        </w:rPr>
+        <w:t>fillable</w:t>
+      </w:r>
+      <w:proofErr w:type="spellEnd"/>
+      <w:r>
+        <w:rPr>
+          <w:lang w:val="fr-CH"/>
+        </w:rPr>
+        <w:t xml:space="preserve"> car faut que les seeders puissent les entrer, mais faudra pas que ça soit envoyé en param dans le backend car ça pourrait être </w:t>
+      </w:r>
+      <w:proofErr w:type="spellStart"/>
+      <w:r>
+        <w:rPr>
+          <w:lang w:val="fr-CH"/>
+        </w:rPr>
+        <w:t>modifé</w:t>
+      </w:r>
+      <w:proofErr w:type="spellEnd"/>
+      <w:r>
+        <w:rPr>
+          <w:lang w:val="fr-CH"/>
+        </w:rPr>
+        <w:t xml:space="preserve"> et donc </w:t>
+      </w:r>
+      <w:proofErr w:type="spellStart"/>
+      <w:r>
+        <w:rPr>
+          <w:lang w:val="fr-CH"/>
+        </w:rPr>
+        <w:t>qlqn</w:t>
+      </w:r>
+      <w:proofErr w:type="spellEnd"/>
+      <w:r>
+        <w:rPr>
+          <w:lang w:val="fr-CH"/>
+        </w:rPr>
+        <w:t xml:space="preserve"> pourrait faire une entrée au nom de </w:t>
+      </w:r>
+      <w:proofErr w:type="spellStart"/>
+      <w:r>
+        <w:rPr>
+          <w:lang w:val="fr-CH"/>
+        </w:rPr>
+        <w:t>qlqn</w:t>
+      </w:r>
+      <w:proofErr w:type="spellEnd"/>
+      <w:r>
+        <w:rPr>
+          <w:lang w:val="fr-CH"/>
+        </w:rPr>
+        <w:t>. J’utiliserai l’</w:t>
+      </w:r>
+      <w:proofErr w:type="spellStart"/>
+      <w:r>
+        <w:rPr>
+          <w:lang w:val="fr-CH"/>
+        </w:rPr>
+        <w:t>auth</w:t>
+      </w:r>
+      <w:proofErr w:type="spellEnd"/>
+      <w:r>
+        <w:rPr>
+          <w:lang w:val="fr-CH"/>
+        </w:rPr>
+        <w:t xml:space="preserve"> coté backend via </w:t>
+      </w:r>
+      <w:r>
+        <w:t>auth</w:t>
+      </w:r>
+      <w:proofErr w:type="gramStart"/>
+      <w:r>
+        <w:t>()-</w:t>
+      </w:r>
+      <w:proofErr w:type="gramEnd"/>
+      <w:r>
+        <w:t>&gt;</w:t>
+      </w:r>
+      <w:proofErr w:type="gramStart"/>
+      <w:r>
+        <w:t>id(</w:t>
+      </w:r>
+      <w:proofErr w:type="gramEnd"/>
+      <w:r>
+        <w:t>)</w:t>
+      </w:r>
+    </w:p>
+    <w:p/>
+    <w:p>
+      <w:pPr>
+        <w:rPr>
+          <w:lang w:val="fr-CH"/>
+        </w:rPr>
+      </w:pPr>
+      <w:r>
+        <w:rPr>
+          <w:lang w:val="fr-CH"/>
+        </w:rPr>
+        <w:t xml:space="preserve">Je supprime le </w:t>
+      </w:r>
+      <w:proofErr w:type="spellStart"/>
+      <w:r>
+        <w:rPr>
+          <w:lang w:val="fr-CH"/>
+        </w:rPr>
+        <w:t>factory</w:t>
+      </w:r>
+      <w:proofErr w:type="spellEnd"/>
+      <w:r>
+        <w:rPr>
+          <w:lang w:val="fr-CH"/>
+        </w:rPr>
+        <w:t xml:space="preserve"> p</w:t>
+      </w:r>
+      <w:r>
+        <w:rPr>
+          <w:lang w:val="fr-CH"/>
+        </w:rPr>
+        <w:t xml:space="preserve">ar défaut et n’en </w:t>
+      </w:r>
+      <w:proofErr w:type="spellStart"/>
+      <w:r>
+        <w:rPr>
+          <w:lang w:val="fr-CH"/>
+        </w:rPr>
+        <w:t>recreer</w:t>
+      </w:r>
+      <w:proofErr w:type="spellEnd"/>
+      <w:r>
+        <w:rPr>
+          <w:lang w:val="fr-CH"/>
+        </w:rPr>
+        <w:t xml:space="preserve"> pas un car pas nécessaire je ne vois pas encore d’utilité à en faire, j’en ferai </w:t>
+      </w:r>
+      <w:proofErr w:type="gramStart"/>
+      <w:r>
+        <w:rPr>
+          <w:lang w:val="fr-CH"/>
+        </w:rPr>
+        <w:t>peut être</w:t>
+      </w:r>
+      <w:proofErr w:type="gramEnd"/>
+      <w:r>
+        <w:rPr>
+          <w:lang w:val="fr-CH"/>
+        </w:rPr>
+        <w:t xml:space="preserve"> pour la phase de test </w:t>
+      </w:r>
+      <w:proofErr w:type="spellStart"/>
+      <w:r>
+        <w:rPr>
+          <w:lang w:val="fr-CH"/>
+        </w:rPr>
+        <w:t>jsp</w:t>
+      </w:r>
+      <w:proofErr w:type="spellEnd"/>
+    </w:p>
+    <w:p>
+      <w:pPr>
+        <w:rPr>
+          <w:lang w:val="fr-CH"/>
+        </w:rPr>
+      </w:pPr>
     </w:p>
     <w:p>
       <w:pPr>
@@ -17758,6 +19199,7 @@
         <w:pStyle w:val="GuidageList"/>
       </w:pPr>
       <w:r>
+        <w:lastRenderedPageBreak/>
         <w:t>Difficultés rencontrées et solutions</w:t>
       </w:r>
     </w:p>
@@ -20216,9 +21658,9 @@
       </w:pPr>
     </w:p>
     <w:sectPr>
-      <w:headerReference w:type="default" r:id="rId29"/>
-      <w:footerReference w:type="even" r:id="rId30"/>
-      <w:footerReference w:type="default" r:id="rId31"/>
+      <w:headerReference w:type="default" r:id="rId31"/>
+      <w:footerReference w:type="even" r:id="rId32"/>
+      <w:footerReference w:type="default" r:id="rId33"/>
       <w:pgSz w:w="12240" w:h="15840"/>
       <w:pgMar w:top="1386" w:right="1417" w:bottom="618" w:left="1417" w:header="720" w:footer="188" w:gutter="0"/>
       <w:cols w:space="720"/>
@@ -20616,7 +22058,7 @@
               <w:noProof/>
               <w:lang w:val="fr-CH"/>
             </w:rPr>
-            <w:t>11/05/2026</w:t>
+            <w:t>13/05/2026</w:t>
           </w:r>
           <w:r>
             <w:rPr>
@@ -35863,6 +37305,36 @@
       <w:szCs w:val="20"/>
     </w:rPr>
   </w:style>
+  <w:style w:type="paragraph" w:styleId="PrformatHTML">
+    <w:name w:val="HTML Preformatted"/>
+    <w:basedOn w:val="Normal"/>
+    <w:link w:val="PrformatHTMLCar"/>
+    <w:uiPriority w:val="99"/>
+    <w:semiHidden/>
+    <w:unhideWhenUsed/>
+    <w:rsid w:val="002C3EEA"/>
+    <w:pPr>
+      <w:spacing w:after="0" w:line="240" w:lineRule="auto"/>
+    </w:pPr>
+    <w:rPr>
+      <w:rFonts w:ascii="Consolas" w:hAnsi="Consolas"/>
+      <w:sz w:val="20"/>
+      <w:szCs w:val="20"/>
+    </w:rPr>
+  </w:style>
+  <w:style w:type="character" w:customStyle="1" w:styleId="PrformatHTMLCar">
+    <w:name w:val="Préformaté HTML Car"/>
+    <w:basedOn w:val="Policepardfaut"/>
+    <w:link w:val="PrformatHTML"/>
+    <w:uiPriority w:val="99"/>
+    <w:semiHidden/>
+    <w:rsid w:val="002C3EEA"/>
+    <w:rPr>
+      <w:rFonts w:ascii="Consolas" w:hAnsi="Consolas"/>
+      <w:sz w:val="20"/>
+      <w:szCs w:val="20"/>
+    </w:rPr>
+  </w:style>
 </w:styles>
 </file>
 

</xml_diff>

<commit_message>
chore: remove temporarly exception handler in app.php & jdt
</commit_message>
<xml_diff>
--- a/doc/TPI_Rapport_NapoleoneCyril.docx
+++ b/doc/TPI_Rapport_NapoleoneCyril.docx
@@ -3400,21 +3400,7 @@
         <w:rPr>
           <w:lang w:val="fr-CH"/>
         </w:rPr>
-        <w:t xml:space="preserve">Le projet est séparé en deux parties principales. Le frontend est développé avec Angular. Le backend est développé en PHP avec le </w:t>
-      </w:r>
-      <w:proofErr w:type="spellStart"/>
-      <w:r>
-        <w:rPr>
-          <w:lang w:val="fr-CH"/>
-        </w:rPr>
-        <w:t>framework</w:t>
-      </w:r>
-      <w:proofErr w:type="spellEnd"/>
-      <w:r>
-        <w:rPr>
-          <w:lang w:val="fr-CH"/>
-        </w:rPr>
-        <w:t xml:space="preserve"> Laravel 12</w:t>
+        <w:t>Le projet est séparé en deux parties principales. Le frontend est développé avec Angular. Le backend est développé en PHP avec le framework Laravel 12</w:t>
       </w:r>
       <w:r>
         <w:rPr>
@@ -4451,14 +4437,12 @@
         </w:rPr>
         <w:t xml:space="preserve">le titre initial du </w:t>
       </w:r>
-      <w:proofErr w:type="spellStart"/>
       <w:r>
         <w:rPr>
           <w:lang w:val="fr-CH"/>
         </w:rPr>
         <w:t>cdc</w:t>
       </w:r>
-      <w:proofErr w:type="spellEnd"/>
       <w:r>
         <w:rPr>
           <w:lang w:val="fr-CH"/>
@@ -4561,21 +4545,7 @@
         <w:rPr>
           <w:lang w:val="fr-CH"/>
         </w:rPr>
-        <w:t>des films/</w:t>
-      </w:r>
-      <w:proofErr w:type="spellStart"/>
-      <w:r>
-        <w:rPr>
-          <w:lang w:val="fr-CH"/>
-        </w:rPr>
-        <w:t>covers</w:t>
-      </w:r>
-      <w:proofErr w:type="spellEnd"/>
-      <w:r>
-        <w:rPr>
-          <w:lang w:val="fr-CH"/>
-        </w:rPr>
-        <w:t>/citations via une API externe.</w:t>
+        <w:t>des films/covers/citations via une API externe.</w:t>
       </w:r>
     </w:p>
     <w:p>
@@ -4641,21 +4611,7 @@
         <w:rPr>
           <w:lang w:val="fr-CH"/>
         </w:rPr>
-        <w:t xml:space="preserve">Réinitialisation avancée du mot de passe par </w:t>
-      </w:r>
-      <w:proofErr w:type="gramStart"/>
-      <w:r>
-        <w:rPr>
-          <w:lang w:val="fr-CH"/>
-        </w:rPr>
-        <w:t>email</w:t>
-      </w:r>
-      <w:proofErr w:type="gramEnd"/>
-      <w:r>
-        <w:rPr>
-          <w:lang w:val="fr-CH"/>
-        </w:rPr>
-        <w:t>.</w:t>
+        <w:t>Réinitialisation avancée du mot de passe par email.</w:t>
       </w:r>
     </w:p>
     <w:p>
@@ -5656,21 +5612,7 @@
         <w:rPr>
           <w:lang w:val="fr-CH"/>
         </w:rPr>
-        <w:t xml:space="preserve">La méthode de gestion de projet utilisée pour ce TPI est une méthode de type « Waterfall ». </w:t>
-      </w:r>
-      <w:proofErr w:type="gramStart"/>
-      <w:r>
-        <w:rPr>
-          <w:lang w:val="fr-CH"/>
-        </w:rPr>
-        <w:t>ça</w:t>
-      </w:r>
-      <w:proofErr w:type="gramEnd"/>
-      <w:r>
-        <w:rPr>
-          <w:lang w:val="fr-CH"/>
-        </w:rPr>
-        <w:t xml:space="preserve"> consiste en un avancement par grandes étapes une après l’autre donc par exemple : Analyse -&gt; Conception -&gt; Implémentation -&gt; Tests -&gt; Doc -&gt; Livraison. Ce choix est adapté à ce TPI car le cahier des charges est clairement défini dès le départ ainsi que sa durée. C’est donc pourquoi il est important de d’abord pouvoir analyser/comprendre le mandat, le prévoir, puis développer le projet dans un ordre logique.</w:t>
+        <w:t>La méthode de gestion de projet utilisée pour ce TPI est une méthode de type « Waterfall ». ça consiste en un avancement par grandes étapes une après l’autre donc par exemple : Analyse -&gt; Conception -&gt; Implémentation -&gt; Tests -&gt; Doc -&gt; Livraison. Ce choix est adapté à ce TPI car le cahier des charges est clairement défini dès le départ ainsi que sa durée. C’est donc pourquoi il est important de d’abord pouvoir analyser/comprendre le mandat, le prévoir, puis développer le projet dans un ordre logique.</w:t>
       </w:r>
       <w:r>
         <w:rPr>
@@ -5815,7 +5757,19 @@
         <w:rPr>
           <w:lang w:val="fr-CH"/>
         </w:rPr>
-        <w:t>L’organisation de travail est basée sur la planification initiale réalisée et livrée lors du premier jour du TPI. Elle sert de référence pour les tâches à réaliser ainsi que leurs ordres de réalisation dans un temps réparti à l’avance entre les différentes phases du projet.</w:t>
+        <w:t xml:space="preserve">L’organisation de travail est basée sur la planification initiale réalisée et livrée lors du premier jour du TPI. Elle sert de référence pour les tâches à réaliser ainsi que leurs ordres de réalisation dans un temps </w:t>
+      </w:r>
+      <w:r>
+        <w:rPr>
+          <w:lang w:val="fr-CH"/>
+        </w:rPr>
+        <w:t>§</w:t>
+      </w:r>
+      <w:r>
+        <w:rPr>
+          <w:lang w:val="fr-CH"/>
+        </w:rPr>
+        <w:t>réparti à l’avance entre les différentes phases du projet.</w:t>
       </w:r>
     </w:p>
     <w:p>
@@ -6077,56 +6031,40 @@
           <w:color w:val="EE0000"/>
           <w:lang w:val="fr-CH"/>
         </w:rPr>
-        <w:t>(Partie à embellir/</w:t>
-      </w:r>
-      <w:proofErr w:type="spellStart"/>
-      <w:r>
+        <w:t>(Partie à embellir/ameliorer)</w:t>
+      </w:r>
+    </w:p>
+    <w:p>
+      <w:pPr>
+        <w:rPr>
+          <w:lang w:val="fr-CH"/>
+        </w:rPr>
+      </w:pPr>
+      <w:r>
+        <w:rPr>
+          <w:lang w:val="fr-CH"/>
+        </w:rPr>
+        <w:t xml:space="preserve">Le projet utilise plusieurs outils et technologies </w:t>
+      </w:r>
+      <w:r>
+        <w:rPr>
+          <w:lang w:val="fr-CH"/>
+        </w:rPr>
+        <w:t>du</w:t>
+      </w:r>
+      <w:r>
+        <w:rPr>
+          <w:lang w:val="fr-CH"/>
+        </w:rPr>
+        <w:t xml:space="preserve"> développement, à la gestion du code, à la modélisation, aux tests, à la documentation et au déploiement.</w:t>
+      </w:r>
+    </w:p>
+    <w:p>
+      <w:pPr>
         <w:rPr>
           <w:color w:val="EE0000"/>
           <w:lang w:val="fr-CH"/>
         </w:rPr>
-        <w:t>ameliorer</w:t>
-      </w:r>
-      <w:proofErr w:type="spellEnd"/>
-      <w:r>
-        <w:rPr>
-          <w:color w:val="EE0000"/>
-          <w:lang w:val="fr-CH"/>
-        </w:rPr>
-        <w:t>)</w:t>
-      </w:r>
-    </w:p>
-    <w:p>
-      <w:pPr>
-        <w:rPr>
-          <w:lang w:val="fr-CH"/>
-        </w:rPr>
-      </w:pPr>
-      <w:r>
-        <w:rPr>
-          <w:lang w:val="fr-CH"/>
-        </w:rPr>
-        <w:t xml:space="preserve">Le projet utilise plusieurs outils et technologies </w:t>
-      </w:r>
-      <w:r>
-        <w:rPr>
-          <w:lang w:val="fr-CH"/>
-        </w:rPr>
-        <w:t>du</w:t>
-      </w:r>
-      <w:r>
-        <w:rPr>
-          <w:lang w:val="fr-CH"/>
-        </w:rPr>
-        <w:t xml:space="preserve"> développement, à la gestion du code, à la modélisation, aux tests, à la documentation et au déploiement.</w:t>
-      </w:r>
-    </w:p>
-    <w:p>
-      <w:pPr>
-        <w:rPr>
-          <w:color w:val="EE0000"/>
-          <w:lang w:val="fr-CH"/>
-        </w:rPr>
       </w:pPr>
       <w:r>
         <w:rPr>
@@ -6138,16 +6076,8 @@
         <w:rPr>
           <w:lang w:val="fr-CH"/>
         </w:rPr>
-        <w:t xml:space="preserve">e frontend est développé avec </w:t>
-      </w:r>
-      <w:proofErr w:type="spellStart"/>
-      <w:r>
-        <w:rPr>
-          <w:lang w:val="fr-CH"/>
-        </w:rPr>
-        <w:t>Angular</w:t>
-      </w:r>
-      <w:proofErr w:type="spellEnd"/>
+        <w:t>e frontend est développé avec Angular</w:t>
+      </w:r>
       <w:r>
         <w:rPr>
           <w:lang w:val="fr-CH"/>
@@ -6161,348 +6091,228 @@
           <w:color w:val="EE0000"/>
           <w:lang w:val="fr-CH"/>
         </w:rPr>
-        <w:t xml:space="preserve">(version </w:t>
-      </w:r>
-      <w:proofErr w:type="spellStart"/>
-      <w:proofErr w:type="gramStart"/>
-      <w:r>
-        <w:rPr>
-          <w:b/>
-          <w:bCs/>
+        <w:t>(version a préciser</w:t>
+      </w:r>
+      <w:r>
+        <w:rPr>
+          <w:lang w:val="fr-CH"/>
+        </w:rPr>
+        <w:t>)</w:t>
+      </w:r>
+      <w:r>
+        <w:rPr>
+          <w:lang w:val="fr-CH"/>
+        </w:rPr>
+        <w:t xml:space="preserve">, tandis que le backend est développé avec Laravel 12. </w:t>
+      </w:r>
+      <w:r>
+        <w:rPr>
           <w:color w:val="EE0000"/>
           <w:lang w:val="fr-CH"/>
         </w:rPr>
-        <w:t>a</w:t>
-      </w:r>
-      <w:proofErr w:type="spellEnd"/>
-      <w:proofErr w:type="gramEnd"/>
-      <w:r>
-        <w:rPr>
-          <w:b/>
-          <w:bCs/>
+        <w:t>Parler de laravel sail</w:t>
+      </w:r>
+    </w:p>
+    <w:p>
+      <w:pPr>
+        <w:rPr>
+          <w:lang w:val="fr-CH"/>
+        </w:rPr>
+      </w:pPr>
+      <w:r>
+        <w:rPr>
+          <w:lang w:val="fr-CH"/>
+        </w:rPr>
+        <w:t xml:space="preserve">Le </w:t>
+      </w:r>
+      <w:r>
+        <w:rPr>
+          <w:lang w:val="fr-CH"/>
+        </w:rPr>
+        <w:t>projet est développer</w:t>
+      </w:r>
+      <w:r>
+        <w:rPr>
+          <w:lang w:val="fr-CH"/>
+        </w:rPr>
+        <w:t xml:space="preserve"> sur un poste Windows 10 de l’ETML avec Visual Studio Code. </w:t>
+      </w:r>
+      <w:r>
+        <w:rPr>
+          <w:lang w:val="fr-CH"/>
+        </w:rPr>
+        <w:t>Versioning fait</w:t>
+      </w:r>
+      <w:r>
+        <w:rPr>
+          <w:lang w:val="fr-CH"/>
+        </w:rPr>
+        <w:t xml:space="preserve"> avec Git et hébergé sur GitHub dans un </w:t>
+      </w:r>
+      <w:r>
+        <w:rPr>
+          <w:lang w:val="fr-CH"/>
+        </w:rPr>
+        <w:t>monorepo</w:t>
+      </w:r>
+      <w:r>
+        <w:rPr>
+          <w:lang w:val="fr-CH"/>
+        </w:rPr>
+        <w:t xml:space="preserve"> contenant le frontend et le backend. Le déploiement est sur Azure, avec un backend hébergé </w:t>
+      </w:r>
+      <w:r>
+        <w:rPr>
+          <w:lang w:val="fr-CH"/>
+        </w:rPr>
+        <w:t>via</w:t>
+      </w:r>
+      <w:r>
+        <w:rPr>
+          <w:lang w:val="fr-CH"/>
+        </w:rPr>
+        <w:t xml:space="preserve"> </w:t>
+      </w:r>
+      <w:r>
+        <w:rPr>
+          <w:lang w:val="fr-CH"/>
+        </w:rPr>
+        <w:t>« </w:t>
+      </w:r>
+      <w:r>
+        <w:rPr>
+          <w:lang w:val="fr-CH"/>
+        </w:rPr>
+        <w:t>Azure Web App</w:t>
+      </w:r>
+      <w:r>
+        <w:rPr>
+          <w:lang w:val="fr-CH"/>
+        </w:rPr>
+        <w:t> »</w:t>
+      </w:r>
+      <w:r>
+        <w:rPr>
+          <w:lang w:val="fr-CH"/>
+        </w:rPr>
+        <w:t xml:space="preserve">, un frontend </w:t>
+      </w:r>
+      <w:r>
+        <w:rPr>
+          <w:lang w:val="fr-CH"/>
+        </w:rPr>
+        <w:t>avec</w:t>
+      </w:r>
+      <w:r>
+        <w:rPr>
+          <w:lang w:val="fr-CH"/>
+        </w:rPr>
+        <w:t xml:space="preserve"> </w:t>
+      </w:r>
+      <w:r>
+        <w:rPr>
+          <w:lang w:val="fr-CH"/>
+        </w:rPr>
+        <w:t>« </w:t>
+      </w:r>
+      <w:r>
+        <w:rPr>
+          <w:lang w:val="fr-CH"/>
+        </w:rPr>
+        <w:t>Azure Static Web App</w:t>
+      </w:r>
+      <w:r>
+        <w:rPr>
+          <w:lang w:val="fr-CH"/>
+        </w:rPr>
+        <w:t> »</w:t>
+      </w:r>
+      <w:r>
+        <w:rPr>
+          <w:lang w:val="fr-CH"/>
+        </w:rPr>
+        <w:t xml:space="preserve"> et une base de données </w:t>
+      </w:r>
+      <w:r>
+        <w:rPr>
+          <w:lang w:val="fr-CH"/>
+        </w:rPr>
+        <w:t>grâce à</w:t>
+      </w:r>
+      <w:r>
+        <w:rPr>
+          <w:lang w:val="fr-CH"/>
+        </w:rPr>
+        <w:t xml:space="preserve"> </w:t>
+      </w:r>
+      <w:r>
+        <w:rPr>
+          <w:lang w:val="fr-CH"/>
+        </w:rPr>
+        <w:t>« </w:t>
+      </w:r>
+      <w:r>
+        <w:rPr>
+          <w:lang w:val="fr-CH"/>
+        </w:rPr>
+        <w:t>Azure Database for MySQL Flexible Server</w:t>
+      </w:r>
+      <w:r>
+        <w:rPr>
+          <w:lang w:val="fr-CH"/>
+        </w:rPr>
+        <w:t> »</w:t>
+      </w:r>
+      <w:r>
+        <w:rPr>
+          <w:lang w:val="fr-CH"/>
+        </w:rPr>
+        <w:t>.</w:t>
+      </w:r>
+    </w:p>
+    <w:p>
+      <w:pPr>
+        <w:rPr>
+          <w:lang w:val="fr-CH"/>
+        </w:rPr>
+      </w:pPr>
+      <w:r>
+        <w:rPr>
+          <w:lang w:val="fr-CH"/>
+        </w:rPr>
+        <w:t xml:space="preserve">Pour la conception, plusieurs outils sont utilisés </w:t>
+      </w:r>
+      <w:r>
+        <w:rPr>
+          <w:lang w:val="fr-CH"/>
+        </w:rPr>
+        <w:t>comme</w:t>
+      </w:r>
+      <w:r>
+        <w:rPr>
+          <w:lang w:val="fr-CH"/>
+        </w:rPr>
+        <w:t xml:space="preserve"> Looping </w:t>
+      </w:r>
+      <w:r>
+        <w:rPr>
+          <w:lang w:val="fr-CH"/>
+        </w:rPr>
+        <w:t>pour</w:t>
+      </w:r>
+      <w:r>
+        <w:rPr>
+          <w:lang w:val="fr-CH"/>
+        </w:rPr>
+        <w:t xml:space="preserve"> réaliser le MCD et le MLD, tandis que le concepteur de phpMyAdmin est utilisé pour le MPD. Figma est utilisé pour les maquettes de l’interface, et </w:t>
+      </w:r>
+      <w:r>
+        <w:rPr>
           <w:color w:val="EE0000"/>
           <w:lang w:val="fr-CH"/>
         </w:rPr>
-        <w:t xml:space="preserve"> préciser</w:t>
-      </w:r>
-      <w:r>
-        <w:rPr>
-          <w:lang w:val="fr-CH"/>
-        </w:rPr>
-        <w:t>)</w:t>
-      </w:r>
-      <w:r>
-        <w:rPr>
-          <w:lang w:val="fr-CH"/>
-        </w:rPr>
-        <w:t xml:space="preserve">, tandis que le backend est développé avec Laravel 12. </w:t>
-      </w:r>
-      <w:r>
-        <w:rPr>
-          <w:color w:val="EE0000"/>
-          <w:lang w:val="fr-CH"/>
-        </w:rPr>
-        <w:t xml:space="preserve">Parler de </w:t>
-      </w:r>
-      <w:proofErr w:type="spellStart"/>
-      <w:r>
-        <w:rPr>
-          <w:color w:val="EE0000"/>
-          <w:lang w:val="fr-CH"/>
-        </w:rPr>
-        <w:t>laravel</w:t>
-      </w:r>
-      <w:proofErr w:type="spellEnd"/>
-      <w:r>
-        <w:rPr>
-          <w:color w:val="EE0000"/>
-          <w:lang w:val="fr-CH"/>
-        </w:rPr>
-        <w:t xml:space="preserve"> </w:t>
-      </w:r>
-      <w:proofErr w:type="spellStart"/>
-      <w:r>
-        <w:rPr>
-          <w:color w:val="EE0000"/>
-          <w:lang w:val="fr-CH"/>
-        </w:rPr>
-        <w:t>sail</w:t>
-      </w:r>
-      <w:proofErr w:type="spellEnd"/>
-    </w:p>
-    <w:p>
-      <w:pPr>
-        <w:rPr>
-          <w:lang w:val="fr-CH"/>
-        </w:rPr>
-      </w:pPr>
-      <w:r>
-        <w:rPr>
-          <w:lang w:val="fr-CH"/>
-        </w:rPr>
-        <w:t xml:space="preserve">Le </w:t>
-      </w:r>
-      <w:r>
-        <w:rPr>
-          <w:lang w:val="fr-CH"/>
-        </w:rPr>
-        <w:t xml:space="preserve">projet est </w:t>
-      </w:r>
-      <w:proofErr w:type="gramStart"/>
-      <w:r>
-        <w:rPr>
-          <w:lang w:val="fr-CH"/>
-        </w:rPr>
-        <w:t>développer</w:t>
-      </w:r>
-      <w:proofErr w:type="gramEnd"/>
-      <w:r>
-        <w:rPr>
-          <w:lang w:val="fr-CH"/>
-        </w:rPr>
-        <w:t xml:space="preserve"> sur un poste Windows 10 de l’ETML avec Visual Studio Code. </w:t>
-      </w:r>
-      <w:r>
-        <w:rPr>
-          <w:lang w:val="fr-CH"/>
-        </w:rPr>
-        <w:t>Versioning fait</w:t>
-      </w:r>
-      <w:r>
-        <w:rPr>
-          <w:lang w:val="fr-CH"/>
-        </w:rPr>
-        <w:t xml:space="preserve"> avec Git et hébergé sur GitHub dans un </w:t>
-      </w:r>
-      <w:r>
-        <w:rPr>
-          <w:lang w:val="fr-CH"/>
-        </w:rPr>
-        <w:t>monorepo</w:t>
-      </w:r>
-      <w:r>
-        <w:rPr>
-          <w:lang w:val="fr-CH"/>
-        </w:rPr>
-        <w:t xml:space="preserve"> contenant le frontend et le backend. Le déploiement est </w:t>
-      </w:r>
-      <w:proofErr w:type="gramStart"/>
-      <w:r>
-        <w:rPr>
-          <w:lang w:val="fr-CH"/>
-        </w:rPr>
-        <w:t>sur</w:t>
-      </w:r>
-      <w:proofErr w:type="gramEnd"/>
-      <w:r>
-        <w:rPr>
-          <w:lang w:val="fr-CH"/>
-        </w:rPr>
-        <w:t xml:space="preserve"> Azure, avec un backend hébergé </w:t>
-      </w:r>
-      <w:r>
-        <w:rPr>
-          <w:lang w:val="fr-CH"/>
-        </w:rPr>
-        <w:t>via</w:t>
-      </w:r>
-      <w:r>
-        <w:rPr>
-          <w:lang w:val="fr-CH"/>
-        </w:rPr>
-        <w:t xml:space="preserve"> </w:t>
-      </w:r>
-      <w:r>
-        <w:rPr>
-          <w:lang w:val="fr-CH"/>
-        </w:rPr>
-        <w:t>« </w:t>
-      </w:r>
-      <w:r>
-        <w:rPr>
-          <w:lang w:val="fr-CH"/>
-        </w:rPr>
-        <w:t>Azure Web App</w:t>
-      </w:r>
-      <w:r>
-        <w:rPr>
-          <w:lang w:val="fr-CH"/>
-        </w:rPr>
-        <w:t> »</w:t>
-      </w:r>
-      <w:r>
-        <w:rPr>
-          <w:lang w:val="fr-CH"/>
-        </w:rPr>
-        <w:t xml:space="preserve">, un frontend </w:t>
-      </w:r>
-      <w:r>
-        <w:rPr>
-          <w:lang w:val="fr-CH"/>
-        </w:rPr>
-        <w:t>avec</w:t>
-      </w:r>
-      <w:r>
-        <w:rPr>
-          <w:lang w:val="fr-CH"/>
-        </w:rPr>
-        <w:t xml:space="preserve"> </w:t>
-      </w:r>
-      <w:r>
-        <w:rPr>
-          <w:lang w:val="fr-CH"/>
-        </w:rPr>
-        <w:t>« </w:t>
-      </w:r>
-      <w:r>
-        <w:rPr>
-          <w:lang w:val="fr-CH"/>
-        </w:rPr>
-        <w:t xml:space="preserve">Azure </w:t>
-      </w:r>
-      <w:proofErr w:type="spellStart"/>
-      <w:r>
-        <w:rPr>
-          <w:lang w:val="fr-CH"/>
-        </w:rPr>
-        <w:t>Static</w:t>
-      </w:r>
-      <w:proofErr w:type="spellEnd"/>
-      <w:r>
-        <w:rPr>
-          <w:lang w:val="fr-CH"/>
-        </w:rPr>
-        <w:t xml:space="preserve"> Web App</w:t>
-      </w:r>
-      <w:r>
-        <w:rPr>
-          <w:lang w:val="fr-CH"/>
-        </w:rPr>
-        <w:t> »</w:t>
-      </w:r>
-      <w:r>
-        <w:rPr>
-          <w:lang w:val="fr-CH"/>
-        </w:rPr>
-        <w:t xml:space="preserve"> et une base de données </w:t>
-      </w:r>
-      <w:r>
-        <w:rPr>
-          <w:lang w:val="fr-CH"/>
-        </w:rPr>
-        <w:t>grâce à</w:t>
-      </w:r>
-      <w:r>
-        <w:rPr>
-          <w:lang w:val="fr-CH"/>
-        </w:rPr>
-        <w:t xml:space="preserve"> </w:t>
-      </w:r>
-      <w:r>
-        <w:rPr>
-          <w:lang w:val="fr-CH"/>
-        </w:rPr>
-        <w:t>« </w:t>
-      </w:r>
-      <w:r>
-        <w:rPr>
-          <w:lang w:val="fr-CH"/>
-        </w:rPr>
-        <w:t xml:space="preserve">Azure </w:t>
-      </w:r>
-      <w:proofErr w:type="spellStart"/>
-      <w:r>
-        <w:rPr>
-          <w:lang w:val="fr-CH"/>
-        </w:rPr>
-        <w:t>Database</w:t>
-      </w:r>
-      <w:proofErr w:type="spellEnd"/>
-      <w:r>
-        <w:rPr>
-          <w:lang w:val="fr-CH"/>
-        </w:rPr>
-        <w:t xml:space="preserve"> for MySQL Flexible Server</w:t>
-      </w:r>
-      <w:r>
-        <w:rPr>
-          <w:lang w:val="fr-CH"/>
-        </w:rPr>
-        <w:t> »</w:t>
-      </w:r>
-      <w:r>
-        <w:rPr>
-          <w:lang w:val="fr-CH"/>
-        </w:rPr>
-        <w:t>.</w:t>
-      </w:r>
-    </w:p>
-    <w:p>
-      <w:pPr>
-        <w:rPr>
-          <w:lang w:val="fr-CH"/>
-        </w:rPr>
-      </w:pPr>
-      <w:r>
-        <w:rPr>
-          <w:lang w:val="fr-CH"/>
-        </w:rPr>
-        <w:t xml:space="preserve">Pour la conception, plusieurs outils sont utilisés </w:t>
-      </w:r>
-      <w:r>
-        <w:rPr>
-          <w:lang w:val="fr-CH"/>
-        </w:rPr>
-        <w:t>comme</w:t>
-      </w:r>
-      <w:r>
-        <w:rPr>
-          <w:lang w:val="fr-CH"/>
-        </w:rPr>
-        <w:t xml:space="preserve"> Looping </w:t>
-      </w:r>
-      <w:r>
-        <w:rPr>
-          <w:lang w:val="fr-CH"/>
-        </w:rPr>
-        <w:t>pour</w:t>
-      </w:r>
-      <w:r>
-        <w:rPr>
-          <w:lang w:val="fr-CH"/>
-        </w:rPr>
-        <w:t xml:space="preserve"> réaliser le MCD et le MLD, tandis que le concepteur de phpMyAdmin est utilisé pour le MPD. </w:t>
-      </w:r>
-      <w:proofErr w:type="spellStart"/>
-      <w:r>
-        <w:rPr>
-          <w:lang w:val="fr-CH"/>
-        </w:rPr>
-        <w:t>Figma</w:t>
-      </w:r>
-      <w:proofErr w:type="spellEnd"/>
-      <w:r>
-        <w:rPr>
-          <w:lang w:val="fr-CH"/>
-        </w:rPr>
-        <w:t xml:space="preserve"> est utilisé pour les maquettes de l’interface, et </w:t>
-      </w:r>
-      <w:r>
-        <w:rPr>
-          <w:color w:val="EE0000"/>
-          <w:lang w:val="fr-CH"/>
-        </w:rPr>
-        <w:t xml:space="preserve">draw.io ou </w:t>
-      </w:r>
-      <w:proofErr w:type="spellStart"/>
-      <w:r>
-        <w:rPr>
-          <w:color w:val="EE0000"/>
-          <w:lang w:val="fr-CH"/>
-        </w:rPr>
-        <w:t>Mermaid</w:t>
-      </w:r>
-      <w:proofErr w:type="spellEnd"/>
+        <w:t>draw.io ou Mermaid</w:t>
+      </w:r>
       <w:r>
         <w:rPr>
           <w:lang w:val="fr-CH"/>
@@ -6821,29 +6631,7 @@
                 <w:szCs w:val="18"/>
                 <w:lang w:val="fr-CH"/>
               </w:rPr>
-              <w:t xml:space="preserve">Git bash ? </w:t>
-            </w:r>
-            <w:proofErr w:type="spellStart"/>
-            <w:r>
-              <w:rPr>
-                <w:rFonts w:asciiTheme="majorHAnsi" w:hAnsiTheme="majorHAnsi" w:cstheme="majorHAnsi"/>
-                <w:color w:val="EE0000"/>
-                <w:sz w:val="18"/>
-                <w:szCs w:val="18"/>
-                <w:lang w:val="fr-CH"/>
-              </w:rPr>
-              <w:t>wsl</w:t>
-            </w:r>
-            <w:proofErr w:type="spellEnd"/>
-            <w:r>
-              <w:rPr>
-                <w:rFonts w:asciiTheme="majorHAnsi" w:hAnsiTheme="majorHAnsi" w:cstheme="majorHAnsi"/>
-                <w:color w:val="EE0000"/>
-                <w:sz w:val="18"/>
-                <w:szCs w:val="18"/>
-                <w:lang w:val="fr-CH"/>
-              </w:rPr>
-              <w:t xml:space="preserve"> ? </w:t>
+              <w:t xml:space="preserve">Git bash ? wsl ? </w:t>
             </w:r>
           </w:p>
         </w:tc>
@@ -6921,19 +6709,8 @@
                 <w:szCs w:val="18"/>
                 <w:lang w:val="fr-CH"/>
               </w:rPr>
-              <w:t xml:space="preserve">Docker / Laravel </w:t>
+              <w:t>Docker / Laravel Sail</w:t>
             </w:r>
-            <w:proofErr w:type="spellStart"/>
-            <w:r>
-              <w:rPr>
-                <w:rFonts w:asciiTheme="majorHAnsi" w:hAnsiTheme="majorHAnsi" w:cstheme="majorHAnsi"/>
-                <w:sz w:val="18"/>
-                <w:szCs w:val="18"/>
-                <w:lang w:val="fr-CH"/>
-              </w:rPr>
-              <w:t>Sail</w:t>
-            </w:r>
-            <w:proofErr w:type="spellEnd"/>
           </w:p>
         </w:tc>
         <w:tc>
@@ -7002,7 +6779,6 @@
                 <w:lang w:val="fr-CH"/>
               </w:rPr>
             </w:pPr>
-            <w:proofErr w:type="spellStart"/>
             <w:r>
               <w:rPr>
                 <w:rFonts w:asciiTheme="majorHAnsi" w:hAnsiTheme="majorHAnsi" w:cstheme="majorHAnsi"/>
@@ -7012,7 +6788,6 @@
               </w:rPr>
               <w:t>Angular</w:t>
             </w:r>
-            <w:proofErr w:type="spellEnd"/>
           </w:p>
         </w:tc>
         <w:tc>
@@ -7082,7 +6857,6 @@
                 <w:lang w:val="fr-CH"/>
               </w:rPr>
             </w:pPr>
-            <w:proofErr w:type="spellStart"/>
             <w:r>
               <w:rPr>
                 <w:rFonts w:asciiTheme="majorHAnsi" w:hAnsiTheme="majorHAnsi" w:cstheme="majorHAnsi"/>
@@ -7092,7 +6866,6 @@
               </w:rPr>
               <w:t>Typescript</w:t>
             </w:r>
-            <w:proofErr w:type="spellEnd"/>
           </w:p>
         </w:tc>
         <w:tc>
@@ -7239,7 +7012,6 @@
                 <w:lang w:val="fr-CH"/>
               </w:rPr>
             </w:pPr>
-            <w:proofErr w:type="spellStart"/>
             <w:r>
               <w:rPr>
                 <w:rFonts w:asciiTheme="majorHAnsi" w:hAnsiTheme="majorHAnsi" w:cstheme="majorHAnsi"/>
@@ -7247,29 +7019,8 @@
                 <w:szCs w:val="18"/>
                 <w:lang w:val="fr-CH"/>
               </w:rPr>
-              <w:t>Angular</w:t>
+              <w:t>Angular Material</w:t>
             </w:r>
-            <w:proofErr w:type="spellEnd"/>
-            <w:r>
-              <w:rPr>
-                <w:rFonts w:asciiTheme="majorHAnsi" w:hAnsiTheme="majorHAnsi" w:cstheme="majorHAnsi"/>
-                <w:sz w:val="18"/>
-                <w:szCs w:val="18"/>
-                <w:lang w:val="fr-CH"/>
-              </w:rPr>
-              <w:t xml:space="preserve"> </w:t>
-            </w:r>
-            <w:proofErr w:type="spellStart"/>
-            <w:r>
-              <w:rPr>
-                <w:rFonts w:asciiTheme="majorHAnsi" w:hAnsiTheme="majorHAnsi" w:cstheme="majorHAnsi"/>
-                <w:sz w:val="18"/>
-                <w:szCs w:val="18"/>
-                <w:lang w:val="fr-CH"/>
-              </w:rPr>
-              <w:t>Material</w:t>
-            </w:r>
-            <w:proofErr w:type="spellEnd"/>
           </w:p>
         </w:tc>
         <w:tc>
@@ -7347,20 +7098,8 @@
                 <w:szCs w:val="18"/>
                 <w:lang w:val="fr-CH"/>
               </w:rPr>
-              <w:t xml:space="preserve">À voir les modules </w:t>
+              <w:t>À voir les modules angular</w:t>
             </w:r>
-            <w:proofErr w:type="spellStart"/>
-            <w:r>
-              <w:rPr>
-                <w:rFonts w:asciiTheme="majorHAnsi" w:hAnsiTheme="majorHAnsi" w:cstheme="majorHAnsi"/>
-                <w:color w:val="EE0000"/>
-                <w:sz w:val="18"/>
-                <w:szCs w:val="18"/>
-                <w:lang w:val="fr-CH"/>
-              </w:rPr>
-              <w:t>angular</w:t>
-            </w:r>
-            <w:proofErr w:type="spellEnd"/>
           </w:p>
         </w:tc>
         <w:tc>
@@ -7982,19 +7721,8 @@
                 <w:szCs w:val="18"/>
                 <w:lang w:val="fr-CH"/>
               </w:rPr>
-              <w:t xml:space="preserve">Form </w:t>
+              <w:t>Form Requests</w:t>
             </w:r>
-            <w:proofErr w:type="spellStart"/>
-            <w:r>
-              <w:rPr>
-                <w:rFonts w:asciiTheme="majorHAnsi" w:hAnsiTheme="majorHAnsi" w:cstheme="majorHAnsi"/>
-                <w:sz w:val="18"/>
-                <w:szCs w:val="18"/>
-                <w:lang w:val="fr-CH"/>
-              </w:rPr>
-              <w:t>Requests</w:t>
-            </w:r>
-            <w:proofErr w:type="spellEnd"/>
           </w:p>
         </w:tc>
         <w:tc>
@@ -8071,19 +7799,8 @@
                 <w:szCs w:val="18"/>
                 <w:lang w:val="fr-CH"/>
               </w:rPr>
-              <w:t xml:space="preserve">Middlewares </w:t>
+              <w:t>Middlewares laravel</w:t>
             </w:r>
-            <w:proofErr w:type="spellStart"/>
-            <w:r>
-              <w:rPr>
-                <w:rFonts w:asciiTheme="majorHAnsi" w:hAnsiTheme="majorHAnsi" w:cstheme="majorHAnsi"/>
-                <w:sz w:val="18"/>
-                <w:szCs w:val="18"/>
-                <w:lang w:val="fr-CH"/>
-              </w:rPr>
-              <w:t>laravel</w:t>
-            </w:r>
-            <w:proofErr w:type="spellEnd"/>
           </w:p>
         </w:tc>
         <w:tc>
@@ -8152,7 +7869,6 @@
                 <w:lang w:val="fr-CH"/>
               </w:rPr>
             </w:pPr>
-            <w:proofErr w:type="spellStart"/>
             <w:r>
               <w:rPr>
                 <w:rFonts w:asciiTheme="majorHAnsi" w:hAnsiTheme="majorHAnsi" w:cstheme="majorHAnsi"/>
@@ -8162,7 +7878,6 @@
               </w:rPr>
               <w:t>PHPUnit</w:t>
             </w:r>
-            <w:proofErr w:type="spellEnd"/>
           </w:p>
         </w:tc>
         <w:tc>
@@ -8232,7 +7947,6 @@
                 <w:lang w:val="fr-CH"/>
               </w:rPr>
             </w:pPr>
-            <w:proofErr w:type="spellStart"/>
             <w:r>
               <w:rPr>
                 <w:rFonts w:asciiTheme="majorHAnsi" w:hAnsiTheme="majorHAnsi" w:cstheme="majorHAnsi"/>
@@ -8240,17 +7954,7 @@
                 <w:szCs w:val="18"/>
                 <w:lang w:val="fr-CH"/>
               </w:rPr>
-              <w:t>Php</w:t>
-            </w:r>
-            <w:proofErr w:type="spellEnd"/>
-            <w:r>
-              <w:rPr>
-                <w:rFonts w:asciiTheme="majorHAnsi" w:hAnsiTheme="majorHAnsi" w:cstheme="majorHAnsi"/>
-                <w:sz w:val="18"/>
-                <w:szCs w:val="18"/>
-                <w:lang w:val="fr-CH"/>
-              </w:rPr>
-              <w:t xml:space="preserve"> artisan</w:t>
+              <w:t>Php artisan</w:t>
             </w:r>
           </w:p>
         </w:tc>
@@ -8325,43 +8029,7 @@
                 <w:sz w:val="18"/>
                 <w:szCs w:val="18"/>
               </w:rPr>
-              <w:t xml:space="preserve">Looping (MCD/MLD), </w:t>
-            </w:r>
-            <w:proofErr w:type="spellStart"/>
-            <w:r>
-              <w:rPr>
-                <w:rFonts w:asciiTheme="majorHAnsi" w:hAnsiTheme="majorHAnsi" w:cstheme="majorHAnsi"/>
-                <w:sz w:val="18"/>
-                <w:szCs w:val="18"/>
-              </w:rPr>
-              <w:t>phpmyadmin</w:t>
-            </w:r>
-            <w:proofErr w:type="spellEnd"/>
-            <w:r>
-              <w:rPr>
-                <w:rFonts w:asciiTheme="majorHAnsi" w:hAnsiTheme="majorHAnsi" w:cstheme="majorHAnsi"/>
-                <w:sz w:val="18"/>
-                <w:szCs w:val="18"/>
-              </w:rPr>
-              <w:t xml:space="preserve"> “</w:t>
-            </w:r>
-            <w:proofErr w:type="spellStart"/>
-            <w:r>
-              <w:rPr>
-                <w:rFonts w:asciiTheme="majorHAnsi" w:hAnsiTheme="majorHAnsi" w:cstheme="majorHAnsi"/>
-                <w:sz w:val="18"/>
-                <w:szCs w:val="18"/>
-              </w:rPr>
-              <w:t>concepteur</w:t>
-            </w:r>
-            <w:proofErr w:type="spellEnd"/>
-            <w:r>
-              <w:rPr>
-                <w:rFonts w:asciiTheme="majorHAnsi" w:hAnsiTheme="majorHAnsi" w:cstheme="majorHAnsi"/>
-                <w:sz w:val="18"/>
-                <w:szCs w:val="18"/>
-              </w:rPr>
-              <w:t>” (MPD)</w:t>
+              <w:t>Looping (MCD/MLD), phpmyadmin “concepteur” (MPD)</w:t>
             </w:r>
           </w:p>
         </w:tc>
@@ -8589,25 +8257,7 @@
                 <w:sz w:val="18"/>
                 <w:szCs w:val="18"/>
               </w:rPr>
-              <w:t xml:space="preserve"> (</w:t>
-            </w:r>
-            <w:proofErr w:type="spellStart"/>
-            <w:r>
-              <w:rPr>
-                <w:rFonts w:asciiTheme="majorHAnsi" w:hAnsiTheme="majorHAnsi" w:cstheme="majorHAnsi"/>
-                <w:sz w:val="18"/>
-                <w:szCs w:val="18"/>
-              </w:rPr>
-              <w:t>monorepo</w:t>
-            </w:r>
-            <w:proofErr w:type="spellEnd"/>
-            <w:r>
-              <w:rPr>
-                <w:rFonts w:asciiTheme="majorHAnsi" w:hAnsiTheme="majorHAnsi" w:cstheme="majorHAnsi"/>
-                <w:sz w:val="18"/>
-                <w:szCs w:val="18"/>
-              </w:rPr>
-              <w:t>, conventional commits)</w:t>
+              <w:t xml:space="preserve"> (monorepo, conventional commits)</w:t>
             </w:r>
           </w:p>
         </w:tc>
@@ -8963,23 +8613,13 @@
                 <w:szCs w:val="18"/>
               </w:rPr>
             </w:pPr>
-            <w:proofErr w:type="spellStart"/>
             <w:r>
               <w:rPr>
                 <w:rFonts w:asciiTheme="majorHAnsi" w:hAnsiTheme="majorHAnsi" w:cstheme="majorHAnsi"/>
                 <w:sz w:val="18"/>
                 <w:szCs w:val="18"/>
               </w:rPr>
-              <w:t>Github</w:t>
-            </w:r>
-            <w:proofErr w:type="spellEnd"/>
-            <w:r>
-              <w:rPr>
-                <w:rFonts w:asciiTheme="majorHAnsi" w:hAnsiTheme="majorHAnsi" w:cstheme="majorHAnsi"/>
-                <w:sz w:val="18"/>
-                <w:szCs w:val="18"/>
-              </w:rPr>
-              <w:t xml:space="preserve"> Actions</w:t>
+              <w:t>Github Actions</w:t>
             </w:r>
           </w:p>
         </w:tc>
@@ -9092,7 +8732,6 @@
                 <w:szCs w:val="18"/>
               </w:rPr>
             </w:pPr>
-            <w:proofErr w:type="spellStart"/>
             <w:r>
               <w:rPr>
                 <w:rFonts w:asciiTheme="majorHAnsi" w:hAnsiTheme="majorHAnsi" w:cstheme="majorHAnsi"/>
@@ -9101,31 +8740,8 @@
                 <w:sz w:val="18"/>
                 <w:szCs w:val="18"/>
               </w:rPr>
-              <w:t>Suivi</w:t>
+              <w:t>Suivi de projet</w:t>
             </w:r>
-            <w:proofErr w:type="spellEnd"/>
-            <w:r>
-              <w:rPr>
-                <w:rFonts w:asciiTheme="majorHAnsi" w:hAnsiTheme="majorHAnsi" w:cstheme="majorHAnsi"/>
-                <w:b w:val="0"/>
-                <w:bCs w:val="0"/>
-                <w:sz w:val="18"/>
-                <w:szCs w:val="18"/>
-              </w:rPr>
-              <w:t xml:space="preserve"> de </w:t>
-            </w:r>
-            <w:proofErr w:type="spellStart"/>
-            <w:r>
-              <w:rPr>
-                <w:rFonts w:asciiTheme="majorHAnsi" w:hAnsiTheme="majorHAnsi" w:cstheme="majorHAnsi"/>
-                <w:b w:val="0"/>
-                <w:bCs w:val="0"/>
-                <w:sz w:val="18"/>
-                <w:szCs w:val="18"/>
-              </w:rPr>
-              <w:t>projet</w:t>
-            </w:r>
-            <w:proofErr w:type="spellEnd"/>
           </w:p>
         </w:tc>
         <w:tc>
@@ -9148,25 +8764,7 @@
                 <w:sz w:val="18"/>
                 <w:szCs w:val="18"/>
               </w:rPr>
-              <w:t>Microsoft Excel (.</w:t>
-            </w:r>
-            <w:proofErr w:type="spellStart"/>
-            <w:r>
-              <w:rPr>
-                <w:rFonts w:asciiTheme="majorHAnsi" w:hAnsiTheme="majorHAnsi" w:cstheme="majorHAnsi"/>
-                <w:sz w:val="18"/>
-                <w:szCs w:val="18"/>
-              </w:rPr>
-              <w:t>xslm</w:t>
-            </w:r>
-            <w:proofErr w:type="spellEnd"/>
-            <w:r>
-              <w:rPr>
-                <w:rFonts w:asciiTheme="majorHAnsi" w:hAnsiTheme="majorHAnsi" w:cstheme="majorHAnsi"/>
-                <w:sz w:val="18"/>
-                <w:szCs w:val="18"/>
-              </w:rPr>
-              <w:t>)</w:t>
+              <w:t>Microsoft Excel (.xslm)</w:t>
             </w:r>
           </w:p>
         </w:tc>
@@ -11612,21 +11210,7 @@
         <w:rPr>
           <w:lang w:val="fr-CH"/>
         </w:rPr>
-        <w:t xml:space="preserve">Pour limiter ces risques, les fonctionnalités critiques doivent être traitées assez tôt dans le projet. Le suivi régulier avec la planification, le journal de travail, les </w:t>
-      </w:r>
-      <w:proofErr w:type="spellStart"/>
-      <w:r>
-        <w:rPr>
-          <w:lang w:val="fr-CH"/>
-        </w:rPr>
-        <w:t>commits</w:t>
-      </w:r>
-      <w:proofErr w:type="spellEnd"/>
-      <w:r>
-        <w:rPr>
-          <w:lang w:val="fr-CH"/>
-        </w:rPr>
-        <w:t xml:space="preserve"> GitHub et les livraisons intermédiaires permet de garder une vision claire de l’avancement et d’éviter de découvrir les problèmes trop tard.</w:t>
+        <w:t>Pour limiter ces risques, les fonctionnalités critiques doivent être traitées assez tôt dans le projet. Le suivi régulier avec la planification, le journal de travail, les commits GitHub et les livraisons intermédiaires permet de garder une vision claire de l’avancement et d’éviter de découvrir les problèmes trop tard.</w:t>
       </w:r>
     </w:p>
     <w:p>
@@ -11770,31 +11354,7 @@
                 <w:szCs w:val="20"/>
                 <w:lang w:val="fr-CH" w:eastAsia="fr-CH"/>
               </w:rPr>
-              <w:t xml:space="preserve">Problème entre </w:t>
-            </w:r>
-            <w:proofErr w:type="spellStart"/>
-            <w:r>
-              <w:rPr>
-                <w:rFonts w:asciiTheme="majorHAnsi" w:eastAsia="Times New Roman" w:hAnsiTheme="majorHAnsi" w:cstheme="majorHAnsi"/>
-                <w:b w:val="0"/>
-                <w:bCs w:val="0"/>
-                <w:sz w:val="20"/>
-                <w:szCs w:val="20"/>
-                <w:lang w:val="fr-CH" w:eastAsia="fr-CH"/>
-              </w:rPr>
-              <w:t>Angular</w:t>
-            </w:r>
-            <w:proofErr w:type="spellEnd"/>
-            <w:r>
-              <w:rPr>
-                <w:rFonts w:asciiTheme="majorHAnsi" w:eastAsia="Times New Roman" w:hAnsiTheme="majorHAnsi" w:cstheme="majorHAnsi"/>
-                <w:b w:val="0"/>
-                <w:bCs w:val="0"/>
-                <w:sz w:val="20"/>
-                <w:szCs w:val="20"/>
-                <w:lang w:val="fr-CH" w:eastAsia="fr-CH"/>
-              </w:rPr>
-              <w:t xml:space="preserve"> et Laravel</w:t>
+              <w:t>Problème entre Angular et Laravel</w:t>
             </w:r>
           </w:p>
         </w:tc>
@@ -12409,47 +11969,7 @@
                 <w:szCs w:val="20"/>
                 <w:lang w:val="fr-CH" w:eastAsia="fr-CH"/>
               </w:rPr>
-              <w:t xml:space="preserve">Prévoir du temps pour des corrections du workflow ou de la config Azure, car celle-ci peut vite poser </w:t>
-            </w:r>
-            <w:proofErr w:type="gramStart"/>
-            <w:r>
-              <w:rPr>
-                <w:rFonts w:asciiTheme="majorHAnsi" w:eastAsia="Times New Roman" w:hAnsiTheme="majorHAnsi" w:cstheme="majorHAnsi"/>
-                <w:sz w:val="20"/>
-                <w:szCs w:val="20"/>
-                <w:lang w:val="fr-CH" w:eastAsia="fr-CH"/>
-              </w:rPr>
-              <w:t>problème</w:t>
-            </w:r>
-            <w:proofErr w:type="gramEnd"/>
-            <w:r>
-              <w:rPr>
-                <w:rFonts w:asciiTheme="majorHAnsi" w:eastAsia="Times New Roman" w:hAnsiTheme="majorHAnsi" w:cstheme="majorHAnsi"/>
-                <w:sz w:val="20"/>
-                <w:szCs w:val="20"/>
-                <w:lang w:val="fr-CH" w:eastAsia="fr-CH"/>
-              </w:rPr>
-              <w:t xml:space="preserve"> sur des détails (vécu en </w:t>
-            </w:r>
-            <w:proofErr w:type="spellStart"/>
-            <w:r>
-              <w:rPr>
-                <w:rFonts w:asciiTheme="majorHAnsi" w:eastAsia="Times New Roman" w:hAnsiTheme="majorHAnsi" w:cstheme="majorHAnsi"/>
-                <w:sz w:val="20"/>
-                <w:szCs w:val="20"/>
-                <w:lang w:val="fr-CH" w:eastAsia="fr-CH"/>
-              </w:rPr>
-              <w:t>pre-tpi</w:t>
-            </w:r>
-            <w:proofErr w:type="spellEnd"/>
-            <w:r>
-              <w:rPr>
-                <w:rFonts w:asciiTheme="majorHAnsi" w:eastAsia="Times New Roman" w:hAnsiTheme="majorHAnsi" w:cstheme="majorHAnsi"/>
-                <w:sz w:val="20"/>
-                <w:szCs w:val="20"/>
-                <w:lang w:val="fr-CH" w:eastAsia="fr-CH"/>
-              </w:rPr>
-              <w:t xml:space="preserve">) </w:t>
+              <w:t xml:space="preserve">Prévoir du temps pour des corrections du workflow ou de la config Azure, car celle-ci peut vite poser problème sur des détails (vécu en pre-tpi) </w:t>
             </w:r>
           </w:p>
         </w:tc>
@@ -12546,27 +12066,7 @@
                 <w:szCs w:val="20"/>
                 <w:lang w:val="fr-CH" w:eastAsia="fr-CH"/>
               </w:rPr>
-              <w:t xml:space="preserve">Erreurs dû à des différences de variables d’env, </w:t>
-            </w:r>
-            <w:proofErr w:type="spellStart"/>
-            <w:r>
-              <w:rPr>
-                <w:rFonts w:asciiTheme="majorHAnsi" w:eastAsia="Times New Roman" w:hAnsiTheme="majorHAnsi" w:cstheme="majorHAnsi"/>
-                <w:sz w:val="20"/>
-                <w:szCs w:val="20"/>
-                <w:lang w:val="fr-CH" w:eastAsia="fr-CH"/>
-              </w:rPr>
-              <w:t>configs</w:t>
-            </w:r>
-            <w:proofErr w:type="spellEnd"/>
-            <w:r>
-              <w:rPr>
-                <w:rFonts w:asciiTheme="majorHAnsi" w:eastAsia="Times New Roman" w:hAnsiTheme="majorHAnsi" w:cstheme="majorHAnsi"/>
-                <w:sz w:val="20"/>
-                <w:szCs w:val="20"/>
-                <w:lang w:val="fr-CH" w:eastAsia="fr-CH"/>
-              </w:rPr>
-              <w:t>, versions, etc..</w:t>
+              <w:t>Erreurs dû à des différences de variables d’env, configs, versions, etc..</w:t>
             </w:r>
           </w:p>
         </w:tc>
@@ -12781,7 +12281,6 @@
                 <w:lang w:val="fr-CH" w:eastAsia="fr-CH"/>
               </w:rPr>
             </w:pPr>
-            <w:proofErr w:type="gramStart"/>
             <w:r>
               <w:rPr>
                 <w:rFonts w:asciiTheme="majorHAnsi" w:eastAsia="Times New Roman" w:hAnsiTheme="majorHAnsi" w:cstheme="majorHAnsi"/>
@@ -12789,17 +12288,7 @@
                 <w:szCs w:val="20"/>
                 <w:lang w:val="fr-CH" w:eastAsia="fr-CH"/>
               </w:rPr>
-              <w:t>Erreur local</w:t>
-            </w:r>
-            <w:proofErr w:type="gramEnd"/>
-            <w:r>
-              <w:rPr>
-                <w:rFonts w:asciiTheme="majorHAnsi" w:eastAsia="Times New Roman" w:hAnsiTheme="majorHAnsi" w:cstheme="majorHAnsi"/>
-                <w:sz w:val="20"/>
-                <w:szCs w:val="20"/>
-                <w:lang w:val="fr-CH" w:eastAsia="fr-CH"/>
-              </w:rPr>
-              <w:t xml:space="preserve"> qui fait perdre une partie du travail</w:t>
+              <w:t>Erreur local qui fait perdre une partie du travail</w:t>
             </w:r>
           </w:p>
         </w:tc>
@@ -14023,21 +13512,7 @@
         <w:rPr>
           <w:lang w:val="fr-CH"/>
         </w:rPr>
-        <w:t xml:space="preserve">Le frontend </w:t>
-      </w:r>
-      <w:proofErr w:type="spellStart"/>
-      <w:r>
-        <w:rPr>
-          <w:lang w:val="fr-CH"/>
-        </w:rPr>
-        <w:t>Angular</w:t>
-      </w:r>
-      <w:proofErr w:type="spellEnd"/>
-      <w:r>
-        <w:rPr>
-          <w:lang w:val="fr-CH"/>
-        </w:rPr>
-        <w:t xml:space="preserve"> gère l’affichage, la navigation et les interactions utilisateur. Le backend Laravel </w:t>
+        <w:t xml:space="preserve">Le frontend Angular gère l’affichage, la navigation et les interactions utilisateur. Le backend Laravel </w:t>
       </w:r>
       <w:r>
         <w:rPr>
@@ -14089,48 +13564,20 @@
         <w:rPr>
           <w:lang w:val="fr-CH"/>
         </w:rPr>
-        <w:t xml:space="preserve">L’utilisateur accède à l’application depuis un navigateur. Le navigateur charge l’application </w:t>
-      </w:r>
-      <w:proofErr w:type="spellStart"/>
-      <w:r>
-        <w:rPr>
-          <w:lang w:val="fr-CH"/>
-        </w:rPr>
-        <w:t>Angular</w:t>
-      </w:r>
-      <w:proofErr w:type="spellEnd"/>
-      <w:r>
-        <w:rPr>
-          <w:lang w:val="fr-CH"/>
-        </w:rPr>
-        <w:t>, qui communique ensuite avec l’API Laravel. Le backend traite les requêtes et interagit avec la base de données.</w:t>
-      </w:r>
-    </w:p>
-    <w:p>
-      <w:pPr>
-        <w:rPr>
-          <w:lang w:val="fr-CH"/>
-        </w:rPr>
-      </w:pPr>
-      <w:r>
-        <w:rPr>
-          <w:lang w:val="fr-CH"/>
-        </w:rPr>
-        <w:t xml:space="preserve">En développement local, le frontend est lancé avec </w:t>
-      </w:r>
-      <w:proofErr w:type="spellStart"/>
-      <w:r>
-        <w:rPr>
-          <w:lang w:val="fr-CH"/>
-        </w:rPr>
-        <w:t>Angular</w:t>
-      </w:r>
-      <w:proofErr w:type="spellEnd"/>
-      <w:r>
-        <w:rPr>
-          <w:lang w:val="fr-CH"/>
-        </w:rPr>
-        <w:t xml:space="preserve">, le backend est lancé avec Laravel Sail et la base locale </w:t>
+        <w:t>L’utilisateur accède à l’application depuis un navigateur. Le navigateur charge l’application Angular, qui communique ensuite avec l’API Laravel. Le backend traite les requêtes et interagit avec la base de données.</w:t>
+      </w:r>
+    </w:p>
+    <w:p>
+      <w:pPr>
+        <w:rPr>
+          <w:lang w:val="fr-CH"/>
+        </w:rPr>
+      </w:pPr>
+      <w:r>
+        <w:rPr>
+          <w:lang w:val="fr-CH"/>
+        </w:rPr>
+        <w:t xml:space="preserve">En développement local, le frontend est lancé avec Angular, le backend est lancé avec Laravel Sail et la base locale </w:t>
       </w:r>
       <w:r>
         <w:rPr>
@@ -14154,35 +13601,7 @@
         <w:rPr>
           <w:lang w:val="fr-CH"/>
         </w:rPr>
-        <w:t xml:space="preserve">, le frontend est prévu sur Azure </w:t>
-      </w:r>
-      <w:proofErr w:type="spellStart"/>
-      <w:r>
-        <w:rPr>
-          <w:lang w:val="fr-CH"/>
-        </w:rPr>
-        <w:t>Static</w:t>
-      </w:r>
-      <w:proofErr w:type="spellEnd"/>
-      <w:r>
-        <w:rPr>
-          <w:lang w:val="fr-CH"/>
-        </w:rPr>
-        <w:t xml:space="preserve"> Web Apps, le backend sur Azure Web App et la base de données sur Azure </w:t>
-      </w:r>
-      <w:proofErr w:type="spellStart"/>
-      <w:r>
-        <w:rPr>
-          <w:lang w:val="fr-CH"/>
-        </w:rPr>
-        <w:t>Database</w:t>
-      </w:r>
-      <w:proofErr w:type="spellEnd"/>
-      <w:r>
-        <w:rPr>
-          <w:lang w:val="fr-CH"/>
-        </w:rPr>
-        <w:t xml:space="preserve"> for MySQL Flexible Server</w:t>
+        <w:t>, le frontend est prévu sur Azure Static Web Apps, le backend sur Azure Web App et la base de données sur Azure Database for MySQL Flexible Server</w:t>
       </w:r>
       <w:r>
         <w:rPr>
@@ -14464,21 +13883,7 @@
         <w:rPr>
           <w:lang w:val="fr-CH"/>
         </w:rPr>
-        <w:t xml:space="preserve">Le script SQL est également fait, bien </w:t>
-      </w:r>
-      <w:proofErr w:type="gramStart"/>
-      <w:r>
-        <w:rPr>
-          <w:lang w:val="fr-CH"/>
-        </w:rPr>
-        <w:t>que il</w:t>
-      </w:r>
-      <w:proofErr w:type="gramEnd"/>
-      <w:r>
-        <w:rPr>
-          <w:lang w:val="fr-CH"/>
-        </w:rPr>
-        <w:t xml:space="preserve"> ne sera pas utilisé car ce seront des migrations Laravel qui seront exécutées.</w:t>
+        <w:t>Le script SQL est également fait, bien que il ne sera pas utilisé car ce seront des migrations Laravel qui seront exécutées.</w:t>
       </w:r>
     </w:p>
     <w:p>
@@ -14963,23 +14368,7 @@
           <w:color w:val="EE0000"/>
           <w:lang w:val="fr-CH"/>
         </w:rPr>
-        <w:t xml:space="preserve">*à remplir* (avec les listes de routes </w:t>
-      </w:r>
-      <w:proofErr w:type="spellStart"/>
-      <w:r>
-        <w:rPr>
-          <w:color w:val="EE0000"/>
-          <w:lang w:val="fr-CH"/>
-        </w:rPr>
-        <w:t>etc</w:t>
-      </w:r>
-      <w:proofErr w:type="spellEnd"/>
-      <w:r>
-        <w:rPr>
-          <w:color w:val="EE0000"/>
-          <w:lang w:val="fr-CH"/>
-        </w:rPr>
-        <w:t xml:space="preserve"> une fois sûr)</w:t>
+        <w:t>*à remplir* (avec les listes de routes etc une fois sûr)</w:t>
       </w:r>
     </w:p>
     <w:p>
@@ -15006,35 +14395,7 @@
         <w:rPr>
           <w:lang w:val="fr-CH"/>
         </w:rPr>
-        <w:t xml:space="preserve">Maquettes d’interface réalisées avec FIGMA, elles représentent et prévoient le futur affichage de l’application. Elles sont haute-fidélités en termes de structure </w:t>
-      </w:r>
-      <w:proofErr w:type="spellStart"/>
-      <w:r>
-        <w:rPr>
-          <w:lang w:val="fr-CH"/>
-        </w:rPr>
-        <w:t>etc</w:t>
-      </w:r>
-      <w:proofErr w:type="spellEnd"/>
-      <w:r>
-        <w:rPr>
-          <w:lang w:val="fr-CH"/>
-        </w:rPr>
-        <w:t xml:space="preserve">, mais sont moyenne/basses en termes de tailles exactes, contenu et détails comme </w:t>
-      </w:r>
-      <w:proofErr w:type="spellStart"/>
-      <w:r>
-        <w:rPr>
-          <w:lang w:val="fr-CH"/>
-        </w:rPr>
-        <w:t>icons</w:t>
-      </w:r>
-      <w:proofErr w:type="spellEnd"/>
-      <w:r>
-        <w:rPr>
-          <w:lang w:val="fr-CH"/>
-        </w:rPr>
-        <w:t xml:space="preserve"> etc...</w:t>
+        <w:t>Maquettes d’interface réalisées avec FIGMA, elles représentent et prévoient le futur affichage de l’application. Elles sont haute-fidélités en termes de structure etc, mais sont moyenne/basses en termes de tailles exactes, contenu et détails comme icons etc...</w:t>
       </w:r>
     </w:p>
     <w:p>
@@ -15062,21 +14423,7 @@
         <w:rPr>
           <w:lang w:val="fr-CH"/>
         </w:rPr>
-        <w:t xml:space="preserve"> Les liens prototype sont faits pour que la navigation soit </w:t>
-      </w:r>
-      <w:proofErr w:type="gramStart"/>
-      <w:r>
-        <w:rPr>
-          <w:lang w:val="fr-CH"/>
-        </w:rPr>
-        <w:t>fonctionnel</w:t>
-      </w:r>
-      <w:proofErr w:type="gramEnd"/>
-      <w:r>
-        <w:rPr>
-          <w:lang w:val="fr-CH"/>
-        </w:rPr>
-        <w:t xml:space="preserve"> lors du lancement du FIGMA via le bouton play en haut à droite.</w:t>
+        <w:t xml:space="preserve"> Les liens prototype sont faits pour que la navigation soit fonctionnel lors du lancement du FIGMA via le bouton play en haut à droite.</w:t>
       </w:r>
     </w:p>
     <w:p>
@@ -16265,21 +15612,7 @@
         <w:rPr>
           <w:lang w:val="fr-CH"/>
         </w:rPr>
-        <w:t>« </w:t>
-      </w:r>
-      <w:proofErr w:type="spellStart"/>
-      <w:r>
-        <w:rPr>
-          <w:lang w:val="fr-CH"/>
-        </w:rPr>
-        <w:t>role</w:t>
-      </w:r>
-      <w:proofErr w:type="spellEnd"/>
-      <w:r>
-        <w:rPr>
-          <w:lang w:val="fr-CH"/>
-        </w:rPr>
-        <w:t> »</w:t>
+        <w:t>« role »</w:t>
       </w:r>
       <w:r>
         <w:rPr>
@@ -16478,35 +15811,7 @@
         <w:rPr>
           <w:lang w:val="fr-CH"/>
         </w:rPr>
-        <w:t xml:space="preserve">Les mots de passe seront </w:t>
-      </w:r>
-      <w:proofErr w:type="spellStart"/>
-      <w:r>
-        <w:rPr>
-          <w:lang w:val="fr-CH"/>
-        </w:rPr>
-        <w:t>hashés</w:t>
-      </w:r>
-      <w:proofErr w:type="spellEnd"/>
-      <w:r>
-        <w:rPr>
-          <w:lang w:val="fr-CH"/>
-        </w:rPr>
-        <w:t xml:space="preserve"> par Laravel avant d’être stockés en base de données. La validation des données sera gérée avec des Form </w:t>
-      </w:r>
-      <w:proofErr w:type="spellStart"/>
-      <w:r>
-        <w:rPr>
-          <w:lang w:val="fr-CH"/>
-        </w:rPr>
-        <w:t>Requests</w:t>
-      </w:r>
-      <w:proofErr w:type="spellEnd"/>
-      <w:r>
-        <w:rPr>
-          <w:lang w:val="fr-CH"/>
-        </w:rPr>
-        <w:t xml:space="preserve">, </w:t>
+        <w:t xml:space="preserve">Les mots de passe seront hashés par Laravel avant d’être stockés en base de données. La validation des données sera gérée avec des Form Requests, </w:t>
       </w:r>
       <w:r>
         <w:rPr>
@@ -16654,13 +15959,7 @@
         <w:rPr>
           <w:lang w:val="fr-CH"/>
         </w:rPr>
-        <w:t>env</w:t>
-      </w:r>
-      <w:r>
-        <w:rPr>
-          <w:lang w:val="fr-CH"/>
-        </w:rPr>
-        <w:t xml:space="preserve"> en local et dans les variables d’environnement Azure en production. </w:t>
+        <w:t xml:space="preserve">env en local et dans les variables d’environnement Azure en production. </w:t>
       </w:r>
       <w:r>
         <w:rPr>
@@ -16729,21 +16028,7 @@
         <w:rPr>
           <w:lang w:val="fr-CH"/>
         </w:rPr>
-        <w:t xml:space="preserve"> à l’expérience acquise pendant le stage chez </w:t>
-      </w:r>
-      <w:proofErr w:type="spellStart"/>
-      <w:r>
-        <w:rPr>
-          <w:lang w:val="fr-CH"/>
-        </w:rPr>
-        <w:t>Infomaniak</w:t>
-      </w:r>
-      <w:proofErr w:type="spellEnd"/>
-      <w:r>
-        <w:rPr>
-          <w:lang w:val="fr-CH"/>
-        </w:rPr>
-        <w:t xml:space="preserve">. </w:t>
+        <w:t xml:space="preserve"> à l’expérience acquise pendant le stage chez Infomaniak. </w:t>
       </w:r>
       <w:r>
         <w:rPr>
@@ -16803,14 +16088,7 @@
         <w:rPr>
           <w:lang w:val="fr-CH"/>
         </w:rPr>
-        <w:t xml:space="preserve"> </w:t>
-      </w:r>
-      <w:proofErr w:type="spellStart"/>
-      <w:r>
-        <w:rPr>
-          <w:lang w:val="fr-CH"/>
-        </w:rPr>
-        <w:t>framework</w:t>
+        <w:t xml:space="preserve"> framework</w:t>
       </w:r>
       <w:r>
         <w:rPr>
@@ -16818,7 +16096,6 @@
         </w:rPr>
         <w:t>s</w:t>
       </w:r>
-      <w:proofErr w:type="spellEnd"/>
       <w:r>
         <w:rPr>
           <w:lang w:val="fr-CH"/>
@@ -16899,23 +16176,7 @@
           <w:color w:val="EE0000"/>
           <w:lang w:val="fr-CH"/>
         </w:rPr>
-        <w:t xml:space="preserve">*à embellir si d’autres alternatives </w:t>
-      </w:r>
-      <w:proofErr w:type="spellStart"/>
-      <w:r>
-        <w:rPr>
-          <w:color w:val="EE0000"/>
-          <w:lang w:val="fr-CH"/>
-        </w:rPr>
-        <w:t>etudies</w:t>
-      </w:r>
-      <w:proofErr w:type="spellEnd"/>
-      <w:r>
-        <w:rPr>
-          <w:color w:val="EE0000"/>
-          <w:lang w:val="fr-CH"/>
-        </w:rPr>
-        <w:t xml:space="preserve"> par la suite et même pour + détailler les choix techniques*</w:t>
+        <w:t>*à embellir si d’autres alternatives etudies par la suite et même pour + détailler les choix techniques*</w:t>
       </w:r>
     </w:p>
     <w:p>
@@ -17959,20 +17220,7 @@
         <w:pStyle w:val="GuidageList"/>
       </w:pPr>
       <w:r>
-        <w:t>Configuration (</w:t>
-      </w:r>
-      <w:proofErr w:type="gramStart"/>
-      <w:r>
-        <w:t>fichiers .</w:t>
-      </w:r>
-      <w:proofErr w:type="spellStart"/>
-      <w:r>
-        <w:t>env</w:t>
-      </w:r>
-      <w:proofErr w:type="spellEnd"/>
-      <w:proofErr w:type="gramEnd"/>
-      <w:r>
-        <w:t>, variables, secrets - sans divulguer de secrets)</w:t>
+        <w:t>Configuration (fichiers .env, variables, secrets - sans divulguer de secrets)</w:t>
       </w:r>
     </w:p>
     <w:p>
@@ -17996,15 +17244,7 @@
         <w:pStyle w:val="GuidageList"/>
       </w:pPr>
       <w:r>
-        <w:t xml:space="preserve">Ou référence vers un manuel lié au </w:t>
-      </w:r>
-      <w:proofErr w:type="spellStart"/>
-      <w:r>
-        <w:t>repo</w:t>
-      </w:r>
-      <w:proofErr w:type="spellEnd"/>
-      <w:r>
-        <w:t>, ex. README.md</w:t>
+        <w:t>Ou référence vers un manuel lié au repo, ex. README.md</w:t>
       </w:r>
     </w:p>
     <w:p>
@@ -18079,11 +17319,7 @@
         <w:pStyle w:val="GuidageList"/>
       </w:pPr>
       <w:r>
-        <w:t xml:space="preserve">Ou référence vers un manuel lié au </w:t>
-      </w:r>
-      <w:proofErr w:type="spellStart"/>
-      <w:r>
-        <w:t>r</w:t>
+        <w:t>Ou référence vers un manuel lié au r</w:t>
       </w:r>
       <w:r>
         <w:t>é</w:t>
@@ -18094,7 +17330,6 @@
       <w:r>
         <w:t>s</w:t>
       </w:r>
-      <w:proofErr w:type="spellEnd"/>
       <w:r>
         <w:t>, ex. USER-GUIDE.md</w:t>
       </w:r>
@@ -20616,7 +19851,7 @@
               <w:noProof/>
               <w:lang w:val="fr-CH"/>
             </w:rPr>
-            <w:t>11/05/2026</w:t>
+            <w:t>18/05/2026</w:t>
           </w:r>
           <w:r>
             <w:rPr>
@@ -20723,7 +19958,6 @@
               <w:lang w:val="fr-CH"/>
             </w:rPr>
           </w:pPr>
-          <w:proofErr w:type="spellStart"/>
           <w:r>
             <w:rPr>
               <w:b/>
@@ -20732,7 +19966,6 @@
             </w:rPr>
             <w:t>GestionCitations</w:t>
           </w:r>
-          <w:proofErr w:type="spellEnd"/>
         </w:p>
       </w:tc>
       <w:tc>
@@ -23962,6 +23195,7 @@
   <w:style w:type="character" w:default="1" w:styleId="Policepardfaut">
     <w:name w:val="Default Paragraph Font"/>
     <w:uiPriority w:val="1"/>
+    <w:semiHidden/>
     <w:unhideWhenUsed/>
   </w:style>
   <w:style w:type="table" w:default="1" w:styleId="TableauNormal">

</xml_diff>